<commit_message>
update .gitignore to include additional files and directories; add 2D-list.py
</commit_message>
<xml_diff>
--- a/Assessments/Assessment 1/Assessment 1.docx
+++ b/Assessments/Assessment 1/Assessment 1.docx
@@ -1,6 +1,6 @@
 
 <file path=word/document.xml><?xml version="1.0" encoding="utf-8"?>
-<w:document xmlns:wpc="http://schemas.microsoft.com/office/word/2010/wordprocessingCanvas" xmlns:cx="http://schemas.microsoft.com/office/drawing/2014/chartex" xmlns:cx1="http://schemas.microsoft.com/office/drawing/2015/9/8/chartex" xmlns:cx2="http://schemas.microsoft.com/office/drawing/2015/10/21/chartex" xmlns:cx3="http://schemas.microsoft.com/office/drawing/2016/5/9/chartex" xmlns:cx4="http://schemas.microsoft.com/office/drawing/2016/5/10/chartex" xmlns:cx5="http://schemas.microsoft.com/office/drawing/2016/5/11/chartex" xmlns:cx6="http://schemas.microsoft.com/office/drawing/2016/5/12/chartex" xmlns:cx7="http://schemas.microsoft.com/office/drawing/2016/5/13/chartex" xmlns:cx8="http://schemas.microsoft.com/office/drawing/2016/5/14/chartex" xmlns:mc="http://schemas.openxmlformats.org/markup-compatibility/2006" xmlns:aink="http://schemas.microsoft.com/office/drawing/2016/ink" xmlns:am3d="http://schemas.microsoft.com/office/drawing/2017/model3d" xmlns:o="urn:schemas-microsoft-com:office:office" xmlns:oel="http://schemas.microsoft.com/office/2019/extlst" xmlns:r="http://schemas.openxmlformats.org/officeDocument/2006/relationships" xmlns:m="http://schemas.openxmlformats.org/officeDocument/2006/math" xmlns:v="urn:schemas-microsoft-com:vml" xmlns:wp14="http://schemas.microsoft.com/office/word/2010/wordprocessingDrawing" xmlns:wp="http://schemas.openxmlformats.org/drawingml/2006/wordprocessingDrawing" xmlns:w10="urn:schemas-microsoft-com:office:word" xmlns:w="http://schemas.openxmlformats.org/wordprocessingml/2006/main" xmlns:w14="http://schemas.microsoft.com/office/word/2010/wordml" xmlns:w15="http://schemas.microsoft.com/office/word/2012/wordml" xmlns:w16cex="http://schemas.microsoft.com/office/word/2018/wordml/cex" xmlns:w16cid="http://schemas.microsoft.com/office/word/2016/wordml/cid" xmlns:w16="http://schemas.microsoft.com/office/word/2018/wordml" xmlns:w16du="http://schemas.microsoft.com/office/word/2023/wordml/word16du" xmlns:w16sdtdh="http://schemas.microsoft.com/office/word/2020/wordml/sdtdatahash" xmlns:w16sdtfl="http://schemas.microsoft.com/office/word/2024/wordml/sdtformatlock" xmlns:w16se="http://schemas.microsoft.com/office/word/2015/wordml/symex" xmlns:wpg="http://schemas.microsoft.com/office/word/2010/wordprocessingGroup" xmlns:wpi="http://schemas.microsoft.com/office/word/2010/wordprocessingInk" xmlns:wne="http://schemas.microsoft.com/office/word/2006/wordml" xmlns:wps="http://schemas.microsoft.com/office/word/2010/wordprocessingShape" mc:Ignorable="w14 w15 w16se w16cid w16 w16cex w16sdtdh w16sdtfl w16du wp14">
+<w:document xmlns:wpc="http://schemas.microsoft.com/office/word/2010/wordprocessingCanvas" xmlns:cx="http://schemas.microsoft.com/office/drawing/2014/chartex" xmlns:cx1="http://schemas.microsoft.com/office/drawing/2015/9/8/chartex" xmlns:cx2="http://schemas.microsoft.com/office/drawing/2015/10/21/chartex" xmlns:cx3="http://schemas.microsoft.com/office/drawing/2016/5/9/chartex" xmlns:cx4="http://schemas.microsoft.com/office/drawing/2016/5/10/chartex" xmlns:cx5="http://schemas.microsoft.com/office/drawing/2016/5/11/chartex" xmlns:cx6="http://schemas.microsoft.com/office/drawing/2016/5/12/chartex" xmlns:cx7="http://schemas.microsoft.com/office/drawing/2016/5/13/chartex" xmlns:cx8="http://schemas.microsoft.com/office/drawing/2016/5/14/chartex" xmlns:mc="http://schemas.openxmlformats.org/markup-compatibility/2006" xmlns:aink="http://schemas.microsoft.com/office/drawing/2016/ink" xmlns:am3d="http://schemas.microsoft.com/office/drawing/2017/model3d" xmlns:o="urn:schemas-microsoft-com:office:office" xmlns:oel="http://schemas.microsoft.com/office/2019/extlst" xmlns:r="http://schemas.openxmlformats.org/officeDocument/2006/relationships" xmlns:m="http://schemas.openxmlformats.org/officeDocument/2006/math" xmlns:v="urn:schemas-microsoft-com:vml" xmlns:wp14="http://schemas.microsoft.com/office/word/2010/wordprocessingDrawing" xmlns:wp="http://schemas.openxmlformats.org/drawingml/2006/wordprocessingDrawing" xmlns:w10="urn:schemas-microsoft-com:office:word" xmlns:w="http://schemas.openxmlformats.org/wordprocessingml/2006/main" xmlns:w14="http://schemas.microsoft.com/office/word/2010/wordml" xmlns:w15="http://schemas.microsoft.com/office/word/2012/wordml" xmlns:w16cex="http://schemas.microsoft.com/office/word/2018/wordml/cex" xmlns:w16cid="http://schemas.microsoft.com/office/word/2016/wordml/cid" xmlns:w16="http://schemas.microsoft.com/office/word/2018/wordml" xmlns:w16du="http://schemas.microsoft.com/office/word/2023/wordml/word16du" xmlns:w16sdtdh="http://schemas.microsoft.com/office/word/2020/wordml/sdtdatahash" xmlns:w16sdtfl="http://schemas.microsoft.com/office/word/2024/wordml/sdtformatlock" xmlns:w16se="http://schemas.microsoft.com/office/word/2015/wordml/symex" xmlns:wpg="http://schemas.microsoft.com/office/word/2010/wordprocessingGroup" xmlns:wpi="http://schemas.microsoft.com/office/word/2010/wordprocessingInk" xmlns:wne="http://schemas.microsoft.com/office/word/2006/wordml" xmlns:wps="http://schemas.microsoft.com/office/word/2010/wordprocessingShape" xmlns:a="http://schemas.openxmlformats.org/drawingml/2006/main" xmlns:pic="http://schemas.openxmlformats.org/drawingml/2006/picture" mc:Ignorable="w14 w15 w16se w16cid w16 w16cex w16sdtdh w16sdtfl w16du wp14">
   <w:body>
     <w:p>
       <w:pPr>
@@ -24,12 +24,12 @@
         <w:tblW w:w="10206" w:type="dxa"/>
         <w:tblInd w:w="-5" w:type="dxa"/>
         <w:tblBorders>
-          <w:top w:val="single" w:sz="4" w:space="0" w:color="auto"/>
-          <w:left w:val="single" w:sz="4" w:space="0" w:color="auto"/>
-          <w:bottom w:val="single" w:sz="4" w:space="0" w:color="auto"/>
-          <w:right w:val="single" w:sz="4" w:space="0" w:color="auto"/>
-          <w:insideH w:val="single" w:sz="4" w:space="0" w:color="auto"/>
-          <w:insideV w:val="single" w:sz="4" w:space="0" w:color="auto"/>
+          <w:top w:val="single" w:color="auto" w:sz="4" w:space="0"/>
+          <w:left w:val="single" w:color="auto" w:sz="4" w:space="0"/>
+          <w:bottom w:val="single" w:color="auto" w:sz="4" w:space="0"/>
+          <w:right w:val="single" w:color="auto" w:sz="4" w:space="0"/>
+          <w:insideH w:val="single" w:color="auto" w:sz="4" w:space="0"/>
+          <w:insideV w:val="single" w:color="auto" w:sz="4" w:space="0"/>
         </w:tblBorders>
         <w:tblLayout w:type="fixed"/>
         <w:tblLook w:val="01E0" w:firstRow="1" w:lastRow="1" w:firstColumn="1" w:lastColumn="1" w:noHBand="0" w:noVBand="0"/>
@@ -52,7 +52,7 @@
             <w:pPr>
               <w:pStyle w:val="Heading2"/>
             </w:pPr>
-            <w:bookmarkStart w:id="0" w:name="_Hlk193180440"/>
+            <w:bookmarkStart w:name="_Hlk193180440" w:id="0"/>
             <w:r>
               <w:t xml:space="preserve">National </w:t>
             </w:r>
@@ -161,7 +161,7 @@
       </w:r>
       <w:r>
         <w:rPr>
-          <w:rFonts w:ascii="Wingdings" w:eastAsia="Wingdings" w:hAnsi="Wingdings" w:cs="Wingdings"/>
+          <w:rFonts w:ascii="Wingdings" w:hAnsi="Wingdings" w:eastAsia="Wingdings" w:cs="Wingdings"/>
         </w:rPr>
         <w:t>þ</w:t>
       </w:r>
@@ -173,45 +173,50 @@
       <w:pPr>
         <w:spacing w:before="60" w:after="60" w:line="276" w:lineRule="auto"/>
         <w:rPr>
-          <w:rFonts w:asciiTheme="majorHAnsi" w:hAnsiTheme="majorHAnsi"/>
+          <w:rFonts w:ascii="Aptos Display" w:hAnsi="Aptos Display" w:asciiTheme="majorAscii" w:hAnsiTheme="majorAscii"/>
         </w:rPr>
       </w:pPr>
       <w:sdt>
         <w:sdtPr>
-          <w:rPr>
-            <w:rFonts w:asciiTheme="majorHAnsi" w:hAnsiTheme="majorHAnsi"/>
-          </w:rPr>
           <w:id w:val="-74593552"/>
           <w14:checkbox>
-            <w14:checked w14:val="0"/>
+            <w14:checked w14:val="1"/>
             <w14:checkedState w14:val="2612" w14:font="MS Gothic"/>
             <w14:uncheckedState w14:val="2610" w14:font="MS Gothic"/>
           </w14:checkbox>
+          <w:rPr>
+            <w:rFonts w:ascii="Aptos Display" w:hAnsi="Aptos Display" w:asciiTheme="majorAscii" w:hAnsiTheme="majorAscii"/>
+          </w:rPr>
         </w:sdtPr>
         <w:sdtContent>
           <w:r>
             <w:rPr>
-              <w:rFonts w:ascii="MS Gothic" w:eastAsia="MS Gothic" w:hAnsi="MS Gothic" w:hint="eastAsia"/>
+              <w:rFonts w:ascii="MS Gothic" w:hAnsi="MS Gothic" w:eastAsia="MS Gothic" w:cs="MS Gothic"/>
             </w:rPr>
-            <w:t>☐</w:t>
+            <w:t>☒</w:t>
           </w:r>
         </w:sdtContent>
+        <w:sdtEndPr>
+          <w:rPr>
+            <w:rFonts w:ascii="Aptos Display" w:hAnsi="Aptos Display" w:asciiTheme="majorAscii" w:hAnsiTheme="majorAscii"/>
+          </w:rPr>
+        </w:sdtEndPr>
       </w:sdt>
       <w:r>
         <w:rPr>
-          <w:rFonts w:asciiTheme="majorHAnsi" w:hAnsiTheme="majorHAnsi"/>
+          <w:rFonts w:ascii="Aptos Display" w:hAnsi="Aptos Display" w:asciiTheme="majorAscii" w:hAnsiTheme="majorAscii"/>
         </w:rPr>
         <w:t xml:space="preserve"> Questioning (</w:t>
       </w:r>
       <w:r>
         <w:rPr>
-          <w:rFonts w:asciiTheme="majorHAnsi" w:hAnsiTheme="majorHAnsi"/>
+          <w:rFonts w:ascii="Aptos Display" w:hAnsi="Aptos Display" w:asciiTheme="majorAscii" w:hAnsiTheme="majorAscii"/>
         </w:rPr>
         <w:t>oral/written</w:t>
       </w:r>
       <w:r>
         <w:rPr>
-          <w:rFonts w:asciiTheme="majorHAnsi" w:hAnsiTheme="majorHAnsi"/>
+          <w:rFonts w:ascii="Aptos Display" w:hAnsi="Aptos Display" w:asciiTheme="majorAscii" w:hAnsiTheme="majorAscii"/>
         </w:rPr>
         <w:t>)</w:t>
       </w:r>
@@ -238,7 +243,7 @@
         <w:sdtContent>
           <w:r>
             <w:rPr>
-              <w:rFonts w:ascii="MS Gothic" w:eastAsia="MS Gothic" w:hAnsi="MS Gothic" w:hint="eastAsia"/>
+              <w:rFonts w:hint="eastAsia" w:ascii="MS Gothic" w:hAnsi="MS Gothic" w:eastAsia="MS Gothic"/>
             </w:rPr>
             <w:t>☒</w:t>
           </w:r>
@@ -279,7 +284,7 @@
         <w:sdtContent>
           <w:r>
             <w:rPr>
-              <w:rFonts w:ascii="MS Gothic" w:eastAsia="MS Gothic" w:hAnsi="MS Gothic" w:hint="eastAsia"/>
+              <w:rFonts w:hint="eastAsia" w:ascii="MS Gothic" w:hAnsi="MS Gothic" w:eastAsia="MS Gothic"/>
             </w:rPr>
             <w:t>☐</w:t>
           </w:r>
@@ -320,7 +325,7 @@
         <w:sdtContent>
           <w:r>
             <w:rPr>
-              <w:rFonts w:ascii="MS Gothic" w:eastAsia="MS Gothic" w:hAnsi="MS Gothic" w:hint="eastAsia"/>
+              <w:rFonts w:hint="eastAsia" w:ascii="MS Gothic" w:hAnsi="MS Gothic" w:eastAsia="MS Gothic"/>
             </w:rPr>
             <w:t>☐</w:t>
           </w:r>
@@ -387,81 +392,151 @@
           </w:r>
         </w:p>
       </w:sdtContent>
+      <w:sdtEndPr>
+        <w:rPr>
+          <w:rStyle w:val="Style1"/>
+        </w:rPr>
+      </w:sdtEndPr>
     </w:sdt>
     <w:p>
       <w:pPr>
         <w:pStyle w:val="Heading1"/>
       </w:pPr>
       <w:r>
+        <w:rPr/>
         <w:t xml:space="preserve">Authenticity </w:t>
       </w:r>
       <w:r>
+        <w:rPr/>
         <w:t>verification</w:t>
       </w:r>
       <w:r>
+        <w:rPr/>
         <w:t xml:space="preserve"> process </w:t>
       </w:r>
     </w:p>
     <w:p>
+      <w:pPr>
+        <w:pStyle w:val="Normal"/>
+        <w:numPr>
+          <w:ilvl w:val="0"/>
+          <w:numId w:val="40"/>
+        </w:numPr>
+        <w:suppressLineNumbers w:val="0"/>
+        <w:bidi w:val="0"/>
+        <w:spacing w:beforeAutospacing="on" w:afterAutospacing="on" w:line="240" w:lineRule="auto"/>
+        <w:ind w:left="360" w:right="0" w:hanging="360"/>
+        <w:jc w:val="left"/>
+        <w:rPr>
+          <w:rFonts w:ascii="Aptos" w:hAnsi="Aptos" w:eastAsia="Arial" w:cs="Arial"/>
+          <w:noProof w:val="0"/>
+          <w:lang w:val="en-AU"/>
+        </w:rPr>
+      </w:pPr>
       <w:r>
-        <w:t>W</w:t>
+        <w:rPr>
+          <w:rFonts w:ascii="Aptos" w:hAnsi="Aptos" w:eastAsia="Arial" w:cs="Arial"/>
+          <w:noProof w:val="0"/>
+          <w:lang w:val="en-AU"/>
+        </w:rPr>
+        <w:t>This assessment must be completed in class under supervised conditions.</w:t>
+      </w:r>
+    </w:p>
+    <w:p>
+      <w:pPr>
+        <w:pStyle w:val="Normal"/>
+        <w:numPr>
+          <w:ilvl w:val="0"/>
+          <w:numId w:val="40"/>
+        </w:numPr>
+        <w:suppressLineNumbers w:val="0"/>
+        <w:bidi w:val="0"/>
+        <w:spacing w:beforeAutospacing="on" w:afterAutospacing="on" w:line="240" w:lineRule="auto"/>
+        <w:ind w:left="360" w:right="0" w:hanging="360"/>
+        <w:jc w:val="left"/>
+        <w:rPr>
+          <w:rFonts w:ascii="Aptos" w:hAnsi="Aptos" w:eastAsia="Arial" w:cs="Arial"/>
+          <w:noProof w:val="0"/>
+          <w:lang w:val="en-AU"/>
+        </w:rPr>
+      </w:pPr>
+      <w:r>
+        <w:rPr>
+          <w:rFonts w:ascii="Aptos" w:hAnsi="Aptos" w:eastAsia="Arial" w:cs="Arial"/>
+          <w:noProof w:val="0"/>
+          <w:lang w:val="en-AU"/>
+        </w:rPr>
+        <w:t>Students are required to complete an individual interview with the lecturer before submitting their final assessment.</w:t>
+      </w:r>
+    </w:p>
+    <w:p>
+      <w:pPr>
+        <w:pStyle w:val="Normal"/>
+        <w:numPr>
+          <w:ilvl w:val="0"/>
+          <w:numId w:val="40"/>
+        </w:numPr>
+        <w:suppressLineNumbers w:val="0"/>
+        <w:bidi w:val="0"/>
+        <w:spacing w:beforeAutospacing="on" w:afterAutospacing="on" w:line="240" w:lineRule="auto"/>
+        <w:ind w:left="360" w:right="0" w:hanging="360"/>
+        <w:jc w:val="left"/>
+        <w:rPr>
+          <w:rFonts w:ascii="Aptos" w:hAnsi="Aptos" w:eastAsia="Arial" w:cs="Arial"/>
+          <w:noProof w:val="0"/>
+          <w:lang w:val="en-AU"/>
+        </w:rPr>
+      </w:pPr>
+      <w:r>
+        <w:rPr>
+          <w:rFonts w:ascii="Aptos" w:hAnsi="Aptos" w:eastAsia="Arial" w:cs="Arial"/>
+          <w:noProof w:val="0"/>
+          <w:lang w:val="en-AU"/>
+        </w:rPr>
+        <w:t>The interview will assess students’ understanding of their solution and programming logic.</w:t>
+      </w:r>
+    </w:p>
+    <w:p>
+      <w:pPr>
+        <w:pStyle w:val="Normal"/>
+        <w:numPr>
+          <w:ilvl w:val="0"/>
+          <w:numId w:val="40"/>
+        </w:numPr>
+        <w:suppressLineNumbers w:val="0"/>
+        <w:bidi w:val="0"/>
+        <w:spacing w:beforeAutospacing="on" w:afterAutospacing="on" w:line="240" w:lineRule="auto"/>
+        <w:ind w:left="360" w:right="0" w:hanging="360"/>
+        <w:jc w:val="left"/>
+        <w:rPr>
+          <w:rFonts w:ascii="Aptos" w:hAnsi="Aptos" w:eastAsia="Arial" w:cs="Arial"/>
+          <w:noProof w:val="0"/>
+          <w:lang w:val="en-AU"/>
+        </w:rPr>
+      </w:pPr>
+      <w:r>
+        <w:rPr>
+          <w:rFonts w:ascii="Aptos" w:hAnsi="Aptos" w:eastAsia="Arial" w:cs="Arial"/>
+          <w:noProof w:val="0"/>
+          <w:lang w:val="en-AU"/>
+        </w:rPr>
+        <w:t xml:space="preserve">Students must be able to explain their code and </w:t>
       </w:r>
       <w:r>
-        <w:t>here required to</w:t>
+        <w:rPr>
+          <w:rFonts w:ascii="Aptos" w:hAnsi="Aptos" w:eastAsia="Arial" w:cs="Arial"/>
+          <w:noProof w:val="0"/>
+          <w:lang w:val="en-AU"/>
+        </w:rPr>
+        <w:t>demonstrate</w:t>
       </w:r>
       <w:r>
-        <w:t xml:space="preserve"> confirm the authenticity of unsupervised assessments, the assessor may conduct an authenticity check. </w:t>
-      </w:r>
-      <w:r>
-        <w:t xml:space="preserve">This may </w:t>
-      </w:r>
-      <w:r>
-        <w:t>i</w:t>
-      </w:r>
-      <w:r>
-        <w:t xml:space="preserve">nvolve asking </w:t>
-      </w:r>
-      <w:r>
-        <w:t xml:space="preserve">you </w:t>
-      </w:r>
-      <w:r>
-        <w:t xml:space="preserve">two (2) </w:t>
-      </w:r>
-      <w:r>
-        <w:t xml:space="preserve">more </w:t>
-      </w:r>
-      <w:r>
-        <w:t xml:space="preserve">questions from </w:t>
-      </w:r>
-      <w:r>
-        <w:t xml:space="preserve">or </w:t>
-      </w:r>
-      <w:r>
-        <w:t xml:space="preserve">the </w:t>
-      </w:r>
-      <w:r>
-        <w:t>assessment</w:t>
-      </w:r>
-      <w:r>
-        <w:t xml:space="preserve"> to verify </w:t>
-      </w:r>
-      <w:r>
-        <w:t>you</w:t>
-      </w:r>
-      <w:r>
-        <w:t>r</w:t>
-      </w:r>
-      <w:r>
-        <w:t xml:space="preserve"> </w:t>
-      </w:r>
-      <w:r>
-        <w:t>understanding</w:t>
-      </w:r>
-      <w:r>
-        <w:t>.</w:t>
-      </w:r>
-      <w:r>
-        <w:t xml:space="preserve"> </w:t>
+        <w:rPr>
+          <w:rFonts w:ascii="Aptos" w:hAnsi="Aptos" w:eastAsia="Arial" w:cs="Arial"/>
+          <w:noProof w:val="0"/>
+          <w:lang w:val="en-AU"/>
+        </w:rPr>
+        <w:t xml:space="preserve"> their understanding of the concepts covered in this assessment.</w:t>
       </w:r>
     </w:p>
     <w:p>
@@ -480,10 +555,10 @@
         <w:tblStyle w:val="TableGrid"/>
         <w:tblW w:w="10201" w:type="dxa"/>
         <w:tblBorders>
-          <w:top w:val="single" w:sz="4" w:space="0" w:color="auto"/>
-          <w:left w:val="single" w:sz="4" w:space="0" w:color="auto"/>
-          <w:bottom w:val="single" w:sz="4" w:space="0" w:color="auto"/>
-          <w:right w:val="single" w:sz="4" w:space="0" w:color="auto"/>
+          <w:top w:val="single" w:color="auto" w:sz="4" w:space="0"/>
+          <w:left w:val="single" w:color="auto" w:sz="4" w:space="0"/>
+          <w:bottom w:val="single" w:color="auto" w:sz="4" w:space="0"/>
+          <w:right w:val="single" w:color="auto" w:sz="4" w:space="0"/>
         </w:tblBorders>
         <w:tblLook w:val="04A0" w:firstRow="1" w:lastRow="0" w:firstColumn="1" w:lastColumn="0" w:noHBand="0" w:noVBand="1"/>
       </w:tblPr>
@@ -541,15 +616,7 @@
               </w:rPr>
             </w:pPr>
             <w:r>
-              <w:t xml:space="preserve">Python </w:t>
-            </w:r>
-            <w:proofErr w:type="gramStart"/>
-            <w:r>
-              <w:t>IDLE ,</w:t>
-            </w:r>
-            <w:proofErr w:type="gramEnd"/>
-            <w:r>
-              <w:t xml:space="preserve"> Computer with internet, Microsoft office, etc.</w:t>
+              <w:t>Python IDLE , Computer with internet, Microsoft office, etc.</w:t>
             </w:r>
           </w:p>
           <w:p>
@@ -584,10 +651,10 @@
         <w:tblStyle w:val="TableGrid"/>
         <w:tblW w:w="10201" w:type="dxa"/>
         <w:tblBorders>
-          <w:top w:val="single" w:sz="4" w:space="0" w:color="auto"/>
-          <w:left w:val="single" w:sz="4" w:space="0" w:color="auto"/>
-          <w:bottom w:val="single" w:sz="4" w:space="0" w:color="auto"/>
-          <w:right w:val="single" w:sz="4" w:space="0" w:color="auto"/>
+          <w:top w:val="single" w:color="auto" w:sz="4" w:space="0"/>
+          <w:left w:val="single" w:color="auto" w:sz="4" w:space="0"/>
+          <w:bottom w:val="single" w:color="auto" w:sz="4" w:space="0"/>
+          <w:right w:val="single" w:color="auto" w:sz="4" w:space="0"/>
         </w:tblBorders>
         <w:tblLook w:val="04A0" w:firstRow="1" w:lastRow="0" w:firstColumn="1" w:lastColumn="0" w:noHBand="0" w:noVBand="1"/>
       </w:tblPr>
@@ -599,6 +666,7 @@
           <w:tcPr>
             <w:tcW w:w="10201" w:type="dxa"/>
             <w:shd w:val="clear" w:color="auto" w:fill="FFFFFF" w:themeFill="background1"/>
+            <w:tcMar/>
           </w:tcPr>
           <w:p>
             <w:pPr>
@@ -679,7 +747,6 @@
                 <w:rFonts w:ascii="Courier New" w:hAnsi="Courier New" w:cs="Courier New"/>
               </w:rPr>
             </w:pPr>
-            <w:proofErr w:type="gramStart"/>
             <w:r>
               <w:rPr>
                 <w:rFonts w:ascii="Courier New" w:hAnsi="Courier New" w:cs="Courier New"/>
@@ -694,7 +761,6 @@
               <w:t>random.gauss</w:t>
             </w:r>
             <w:proofErr w:type="spellEnd"/>
-            <w:proofErr w:type="gramEnd"/>
             <w:r>
               <w:rPr>
                 <w:rFonts w:ascii="Courier New" w:hAnsi="Courier New" w:cs="Courier New"/>
@@ -749,15 +815,7 @@
               <w:t>sigma</w:t>
             </w:r>
             <w:r>
-              <w:t xml:space="preserve"> is the standard deviation. You can define these values </w:t>
-            </w:r>
-            <w:proofErr w:type="gramStart"/>
-            <w:r>
-              <w:t>more or less as</w:t>
-            </w:r>
-            <w:proofErr w:type="gramEnd"/>
-            <w:r>
-              <w:t xml:space="preserve"> you wish since the results generated are not relative to a real weather pattern.</w:t>
+              <w:t xml:space="preserve"> is the standard deviation. You can define these values more or less as you wish since the results generated are not relative to a real weather pattern.</w:t>
             </w:r>
           </w:p>
           <w:p/>
@@ -785,13 +843,29 @@
           <w:p/>
           <w:p>
             <w:r>
-              <w:t>Once the array has been populated, continue with the following questions:</w:t>
+              <w:t>Once the array has been populated, continue with the following questions</w:t>
+            </w:r>
+            <w:r>
+              <w:t xml:space="preserve">. </w:t>
+            </w:r>
+            <w:r>
+              <w:rPr>
+                <w:b/>
+                <w:bCs/>
+              </w:rPr>
+              <w:t>Provide screenshots of the code and the corresponding output for each part</w:t>
+            </w:r>
+            <w:r>
+              <w:t>:</w:t>
             </w:r>
           </w:p>
           <w:p/>
           <w:p>
             <w:r>
-              <w:t xml:space="preserve">a) Write code to display the average temperature at noon </w:t>
+              <w:t>a) Write code to display the average temperature at noon</w:t>
+            </w:r>
+            <w:r>
+              <w:t xml:space="preserve">. </w:t>
             </w:r>
           </w:p>
           <w:p/>
@@ -827,30 +901,24 @@
               </w:rPr>
               <w:t xml:space="preserve">hint: use Python’s built in </w:t>
             </w:r>
-            <w:proofErr w:type="gramStart"/>
             <w:r>
               <w:rPr>
                 <w:rFonts w:ascii="Courier New" w:hAnsi="Courier New" w:cs="Courier New"/>
                 <w:i/>
               </w:rPr>
-              <w:t>sort(</w:t>
-            </w:r>
-            <w:proofErr w:type="gramEnd"/>
-            <w:r>
-              <w:rPr>
-                <w:rFonts w:ascii="Courier New" w:hAnsi="Courier New" w:cs="Courier New"/>
+              <w:t>sort()</w:t>
+            </w:r>
+            <w:r>
+              <w:rPr>
                 <w:i/>
               </w:rPr>
+              <w:t xml:space="preserve"> method</w:t>
+            </w:r>
+            <w:r>
               <w:t>)</w:t>
             </w:r>
             <w:r>
-              <w:rPr>
-                <w:i/>
-              </w:rPr>
-              <w:t xml:space="preserve"> method</w:t>
-            </w:r>
-            <w:r>
-              <w:t>)</w:t>
+              <w:t xml:space="preserve">. </w:t>
             </w:r>
           </w:p>
           <w:p/>
@@ -900,7 +968,6 @@
               </w:rPr>
             </w:pPr>
             <w:proofErr w:type="spellStart"/>
-            <w:proofErr w:type="gramStart"/>
             <w:r>
               <w:rPr>
                 <w:rFonts w:ascii="Courier New" w:hAnsi="Courier New" w:cs="Courier New"/>
@@ -914,7 +981,6 @@
               </w:rPr>
               <w:t>(</w:t>
             </w:r>
-            <w:proofErr w:type="gramEnd"/>
             <w:r>
               <w:rPr>
                 <w:rFonts w:ascii="Courier New" w:hAnsi="Courier New" w:cs="Courier New"/>
@@ -940,6 +1006,18 @@
                 <w:rFonts w:ascii="Courier New" w:hAnsi="Courier New" w:cs="Courier New"/>
               </w:rPr>
               <w:t xml:space="preserve">) </w:t>
+            </w:r>
+          </w:p>
+          <w:p>
+            <w:pPr>
+              <w:rPr>
+                <w:rFonts w:ascii="Courier New" w:hAnsi="Courier New" w:cs="Courier New"/>
+              </w:rPr>
+            </w:pPr>
+          </w:p>
+          <w:p>
+            <w:r>
+              <w:t>The function should search for the specified item in a list that has already been sorted in ascending order. It should repeatedly compare the target value with the middle element of the list, eliminating half of the remaining search space after each comparison until the item is found or no elements remain.</w:t>
             </w:r>
           </w:p>
           <w:p>
@@ -1041,6 +1119,173 @@
                 <w:sz w:val="18"/>
               </w:rPr>
               <w:t xml:space="preserve"> [32.6, 32.3, 32.0, 30.4, 30.8, 29.9, 30.3, 31.7, 31.9, 28.3, 30.3, 32.8, 30.9, 32.1, 29.0, 31.7, 34.1, 31.3, 33.8, 32.2, 28.5, 29.1, 33.7, 33.3, 33.4, 31.6, 33.7, 33.4, 32.8, 30.0, 29.9]</w:t>
+            </w:r>
+          </w:p>
+          <w:p>
+            <w:pPr>
+              <w:rPr>
+                <w:color w:val="0A1D30" w:themeColor="text2" w:themeShade="BF"/>
+                <w:sz w:val="18"/>
+              </w:rPr>
+            </w:pPr>
+          </w:p>
+          <w:p>
+            <w:r>
+              <w:t xml:space="preserve">f) </w:t>
+            </w:r>
+            <w:r>
+              <w:t xml:space="preserve">Provide brief answers to </w:t>
+            </w:r>
+            <w:r>
+              <w:t xml:space="preserve">below </w:t>
+            </w:r>
+            <w:r>
+              <w:t>knowledge</w:t>
+            </w:r>
+            <w:r>
+              <w:t xml:space="preserve"> </w:t>
+            </w:r>
+            <w:r>
+              <w:t>question</w:t>
+            </w:r>
+            <w:r>
+              <w:t>s</w:t>
+            </w:r>
+            <w:r>
+              <w:t>:</w:t>
+            </w:r>
+          </w:p>
+          <w:p>
+            <w:r>
+              <w:rPr>
+                <w:lang w:val="en-US"/>
+              </w:rPr>
+              <w:t xml:space="preserve">1. </w:t>
+            </w:r>
+            <w:r>
+              <w:rPr>
+                <w:lang w:val="en-US"/>
+              </w:rPr>
+              <w:t>Briefly explain what modular programming is. How can you import only a specific function or class from a module in Python? What is the syntax for this?</w:t>
+            </w:r>
+            <w:r>
+              <w:t> </w:t>
+            </w:r>
+          </w:p>
+          <w:p/>
+          <w:p/>
+          <w:p/>
+          <w:p/>
+          <w:p>
+            <w:r>
+              <w:t xml:space="preserve">2. </w:t>
+            </w:r>
+            <w:r>
+              <w:rPr>
+                <w:lang w:val="en-US"/>
+              </w:rPr>
+              <w:t>Describe your approach to debugging the tests you created tests in this task. Describe the challenges and include IDE screenshots of you debugging your tests.</w:t>
+            </w:r>
+            <w:r>
+              <w:t> </w:t>
+            </w:r>
+          </w:p>
+          <w:p/>
+          <w:p/>
+          <w:p/>
+          <w:p>
+            <w:r>
+              <w:t xml:space="preserve">3. </w:t>
+            </w:r>
+            <w:r>
+              <w:rPr>
+                <w:lang w:val="en-US"/>
+              </w:rPr>
+              <w:t>How would you explain Python's parameter-passing mechanism? Is it more like pass-by-value or pass-by-reference? Justify your answer.</w:t>
+            </w:r>
+            <w:r>
+              <w:t> </w:t>
+            </w:r>
+          </w:p>
+          <w:p/>
+          <w:p/>
+          <w:p>
+            <w:pPr>
+              <w:rPr>
+                <w:lang w:val="en-US"/>
+              </w:rPr>
+            </w:pPr>
+            <w:r>
+              <w:t xml:space="preserve">4. </w:t>
+            </w:r>
+            <w:r>
+              <w:rPr>
+                <w:lang w:val="en-US"/>
+              </w:rPr>
+              <w:t>Given the following Python code, what will be the output and why?</w:t>
+            </w:r>
+          </w:p>
+          <w:p>
+            <w:r>
+              <w:drawing>
+                <wp:inline distT="0" distB="0" distL="0" distR="0" wp14:anchorId="7BA4AA38" wp14:editId="772321F9">
+                  <wp:extent cx="5487166" cy="1876687"/>
+                  <wp:effectExtent l="0" t="0" r="0" b="9525"/>
+                  <wp:docPr id="1070827418" name="Picture 1"/>
+                  <wp:cNvGraphicFramePr>
+                    <a:graphicFrameLocks xmlns:a="http://schemas.openxmlformats.org/drawingml/2006/main" noChangeAspect="1"/>
+                  </wp:cNvGraphicFramePr>
+                  <a:graphic xmlns:a="http://schemas.openxmlformats.org/drawingml/2006/main">
+                    <a:graphicData uri="http://schemas.openxmlformats.org/drawingml/2006/picture">
+                      <pic:pic xmlns:pic="http://schemas.openxmlformats.org/drawingml/2006/picture">
+                        <pic:nvPicPr>
+                          <pic:cNvPr id="1070827418" name=""/>
+                          <pic:cNvPicPr/>
+                        </pic:nvPicPr>
+                        <pic:blipFill>
+                          <a:blip r:embed="rId13"/>
+                          <a:stretch>
+                            <a:fillRect/>
+                          </a:stretch>
+                        </pic:blipFill>
+                        <pic:spPr>
+                          <a:xfrm>
+                            <a:off x="0" y="0"/>
+                            <a:ext cx="5487166" cy="1876687"/>
+                          </a:xfrm>
+                          <a:prstGeom prst="rect">
+                            <a:avLst/>
+                          </a:prstGeom>
+                        </pic:spPr>
+                      </pic:pic>
+                    </a:graphicData>
+                  </a:graphic>
+                </wp:inline>
+              </w:drawing>
+            </w:r>
+          </w:p>
+          <w:p>
+            <w:r>
+              <w:t>#output:</w:t>
+            </w:r>
+          </w:p>
+          <w:p/>
+          <w:p/>
+          <w:p/>
+          <w:p>
+            <w:r>
+              <w:t>#Explanation:</w:t>
+            </w:r>
+          </w:p>
+          <w:p/>
+          <w:p/>
+          <w:p/>
+          <w:p>
+            <w:r>
+              <w:t xml:space="preserve">5. </w:t>
+            </w:r>
+            <w:r>
+              <w:t> List two benefits of modular coding approaches. How do these benefits assist in the development of medium-sized applications?</w:t>
             </w:r>
           </w:p>
           <w:p/>
@@ -1053,7 +1298,6 @@
                 <w:b/>
                 <w:bCs/>
               </w:rPr>
-              <w:lastRenderedPageBreak/>
               <w:t>Task Requirements</w:t>
             </w:r>
             <w:r>
@@ -1076,24 +1320,24 @@
               <w:spacing w:line="276" w:lineRule="auto"/>
               <w:jc w:val="both"/>
               <w:rPr>
-                <w:rFonts w:ascii="Aptos" w:eastAsia="Arial" w:hAnsi="Aptos" w:cs="Arial"/>
+                <w:rFonts w:ascii="Aptos" w:hAnsi="Aptos" w:eastAsia="Arial" w:cs="Arial"/>
               </w:rPr>
             </w:pPr>
             <w:r>
               <w:rPr>
-                <w:rFonts w:ascii="Aptos" w:eastAsia="Arial" w:hAnsi="Aptos" w:cs="Arial"/>
+                <w:rFonts w:ascii="Aptos" w:hAnsi="Aptos" w:eastAsia="Arial" w:cs="Arial"/>
               </w:rPr>
               <w:t xml:space="preserve">To demonstrate </w:t>
             </w:r>
             <w:r>
               <w:rPr>
-                <w:rFonts w:ascii="Aptos" w:eastAsia="Arial" w:hAnsi="Aptos" w:cs="Arial"/>
+                <w:rFonts w:ascii="Aptos" w:hAnsi="Aptos" w:eastAsia="Arial" w:cs="Arial"/>
               </w:rPr>
               <w:t>satisfactory performance</w:t>
             </w:r>
             <w:r>
               <w:rPr>
-                <w:rFonts w:ascii="Aptos" w:eastAsia="Arial" w:hAnsi="Aptos" w:cs="Arial"/>
+                <w:rFonts w:ascii="Aptos" w:hAnsi="Aptos" w:eastAsia="Arial" w:cs="Arial"/>
               </w:rPr>
               <w:t xml:space="preserve"> in this assessment, you will be required to:</w:t>
             </w:r>
@@ -1106,32 +1350,32 @@
               </w:numPr>
               <w:spacing w:before="100" w:beforeAutospacing="1" w:after="100" w:afterAutospacing="1"/>
               <w:rPr>
-                <w:rFonts w:ascii="Aptos" w:eastAsia="Arial" w:hAnsi="Aptos" w:cs="Arial"/>
+                <w:rFonts w:ascii="Aptos" w:hAnsi="Aptos" w:eastAsia="Arial" w:cs="Arial"/>
               </w:rPr>
             </w:pPr>
             <w:r>
               <w:rPr>
-                <w:rFonts w:ascii="Aptos" w:eastAsia="Arial" w:hAnsi="Aptos" w:cs="Arial"/>
+                <w:rFonts w:ascii="Aptos" w:hAnsi="Aptos" w:eastAsia="Arial" w:cs="Arial"/>
               </w:rPr>
               <w:t>S</w:t>
             </w:r>
             <w:r>
               <w:rPr>
-                <w:rFonts w:ascii="Aptos" w:eastAsia="Arial" w:hAnsi="Aptos" w:cs="Arial"/>
+                <w:rFonts w:ascii="Aptos" w:hAnsi="Aptos" w:eastAsia="Arial" w:cs="Arial"/>
               </w:rPr>
               <w:t>ubmit code in ONE .</w:t>
             </w:r>
             <w:proofErr w:type="spellStart"/>
             <w:r>
               <w:rPr>
-                <w:rFonts w:ascii="Aptos" w:eastAsia="Arial" w:hAnsi="Aptos" w:cs="Arial"/>
+                <w:rFonts w:ascii="Aptos" w:hAnsi="Aptos" w:eastAsia="Arial" w:cs="Arial"/>
               </w:rPr>
               <w:t>py</w:t>
             </w:r>
             <w:proofErr w:type="spellEnd"/>
             <w:r>
               <w:rPr>
-                <w:rFonts w:ascii="Aptos" w:eastAsia="Arial" w:hAnsi="Aptos" w:cs="Arial"/>
+                <w:rFonts w:ascii="Aptos" w:hAnsi="Aptos" w:eastAsia="Arial" w:cs="Arial"/>
               </w:rPr>
               <w:t xml:space="preserve"> file with your code and comments covering parts A to E of assessment </w:t>
             </w:r>
@@ -1144,12 +1388,12 @@
               </w:numPr>
               <w:spacing w:before="100" w:beforeAutospacing="1" w:after="100" w:afterAutospacing="1"/>
               <w:rPr>
-                <w:rFonts w:ascii="Aptos" w:eastAsia="Arial" w:hAnsi="Aptos" w:cs="Arial"/>
+                <w:rFonts w:ascii="Aptos" w:hAnsi="Aptos" w:eastAsia="Arial" w:cs="Arial"/>
               </w:rPr>
             </w:pPr>
             <w:r>
               <w:rPr>
-                <w:rFonts w:ascii="Aptos" w:eastAsia="Arial" w:hAnsi="Aptos" w:cs="Arial"/>
+                <w:rFonts w:ascii="Aptos" w:hAnsi="Aptos" w:eastAsia="Arial" w:cs="Arial"/>
               </w:rPr>
               <w:t>write a comment block at the top including program description, name, student ID, date, version etc.</w:t>
             </w:r>
@@ -1160,16 +1404,28 @@
                 <w:ilvl w:val="0"/>
                 <w:numId w:val="40"/>
               </w:numPr>
-              <w:spacing w:before="100" w:beforeAutospacing="1" w:after="100" w:afterAutospacing="1"/>
-              <w:rPr>
-                <w:rFonts w:ascii="Aptos" w:eastAsia="Arial" w:hAnsi="Aptos" w:cs="Arial"/>
+              <w:spacing w:before="100" w:beforeAutospacing="on" w:after="100" w:afterAutospacing="on"/>
+              <w:rPr>
+                <w:rFonts w:ascii="Aptos" w:hAnsi="Aptos" w:eastAsia="Arial" w:cs="Arial"/>
               </w:rPr>
             </w:pPr>
             <w:r>
               <w:rPr>
-                <w:rFonts w:ascii="Aptos" w:eastAsia="Arial" w:hAnsi="Aptos" w:cs="Arial"/>
-              </w:rPr>
-              <w:t>Submit ONE word document with your code and successful tests for each part A to E of assessment.</w:t>
+                <w:rFonts w:ascii="Aptos" w:hAnsi="Aptos" w:eastAsia="Arial" w:cs="Arial"/>
+              </w:rPr>
+              <w:t>Submit ONE word document with your code and successful tests for each part A to E of assessment</w:t>
+            </w:r>
+            <w:r>
+              <w:rPr>
+                <w:rFonts w:ascii="Aptos" w:hAnsi="Aptos" w:eastAsia="Arial" w:cs="Arial"/>
+              </w:rPr>
+              <w:t xml:space="preserve"> a</w:t>
+            </w:r>
+            <w:r>
+              <w:rPr>
+                <w:rFonts w:ascii="Aptos" w:hAnsi="Aptos" w:eastAsia="Arial" w:cs="Arial"/>
+              </w:rPr>
+              <w:t xml:space="preserve">nd answer the Knowledge questions in part F. </w:t>
             </w:r>
           </w:p>
           <w:p>
@@ -1251,7 +1507,7 @@
             </w:pPr>
             <w:r>
               <w:rPr>
-                <w:rFonts w:ascii="Aptos" w:eastAsia="Arial" w:hAnsi="Aptos" w:cs="Arial"/>
+                <w:rFonts w:ascii="Aptos" w:hAnsi="Aptos" w:eastAsia="Arial" w:cs="Arial"/>
               </w:rPr>
               <w:t xml:space="preserve">Upload completed assessment to blackboard by saving it and upload using the 'Browse Computer' option.  </w:t>
             </w:r>
@@ -1267,7 +1523,7 @@
             </w:pPr>
             <w:r>
               <w:rPr>
-                <w:rFonts w:ascii="Aptos" w:eastAsia="Arial" w:hAnsi="Aptos" w:cs="Arial"/>
+                <w:rFonts w:ascii="Aptos" w:hAnsi="Aptos" w:eastAsia="Arial" w:cs="Arial"/>
               </w:rPr>
               <w:t>You will need Internet Access, Microsoft office if you are submitting assessment via Blackboard</w:t>
             </w:r>
@@ -1296,18 +1552,18 @@
               </w:numPr>
               <w:spacing w:before="120" w:after="120"/>
               <w:rPr>
-                <w:rFonts w:ascii="Aptos" w:eastAsia="Arial" w:hAnsi="Aptos" w:cs="Arial"/>
+                <w:rFonts w:ascii="Aptos" w:hAnsi="Aptos" w:eastAsia="Arial" w:cs="Arial"/>
               </w:rPr>
             </w:pPr>
             <w:r>
               <w:rPr>
-                <w:rFonts w:ascii="Aptos" w:eastAsia="Arial" w:hAnsi="Aptos" w:cs="Arial"/>
+                <w:rFonts w:ascii="Aptos" w:hAnsi="Aptos" w:eastAsia="Arial" w:cs="Arial"/>
               </w:rPr>
               <w:t>The result of your assessment will be provided in Blackboard</w:t>
             </w:r>
             <w:r>
               <w:rPr>
-                <w:rFonts w:ascii="Aptos" w:eastAsia="Arial" w:hAnsi="Aptos" w:cs="Arial"/>
+                <w:rFonts w:ascii="Aptos" w:hAnsi="Aptos" w:eastAsia="Arial" w:cs="Arial"/>
               </w:rPr>
               <w:t>.</w:t>
             </w:r>
@@ -1321,30 +1577,30 @@
               </w:numPr>
               <w:spacing w:before="120" w:after="120"/>
               <w:rPr>
-                <w:rFonts w:ascii="Aptos" w:eastAsia="Arial" w:hAnsi="Aptos" w:cs="Arial"/>
+                <w:rFonts w:ascii="Aptos" w:hAnsi="Aptos" w:eastAsia="Arial" w:cs="Arial"/>
               </w:rPr>
             </w:pPr>
             <w:r>
               <w:rPr>
-                <w:rFonts w:ascii="Aptos" w:eastAsia="Arial" w:hAnsi="Aptos" w:cs="Arial"/>
+                <w:rFonts w:ascii="Aptos" w:hAnsi="Aptos" w:eastAsia="Arial" w:cs="Arial"/>
               </w:rPr>
               <w:t>If you do not answer all question</w:t>
             </w:r>
             <w:r>
               <w:rPr>
-                <w:rFonts w:ascii="Aptos" w:eastAsia="Arial" w:hAnsi="Aptos" w:cs="Arial"/>
+                <w:rFonts w:ascii="Aptos" w:hAnsi="Aptos" w:eastAsia="Arial" w:cs="Arial"/>
               </w:rPr>
               <w:t>s</w:t>
             </w:r>
             <w:r>
               <w:rPr>
-                <w:rFonts w:ascii="Aptos" w:eastAsia="Arial" w:hAnsi="Aptos" w:cs="Arial"/>
+                <w:rFonts w:ascii="Aptos" w:hAnsi="Aptos" w:eastAsia="Arial" w:cs="Arial"/>
               </w:rPr>
               <w:t xml:space="preserve"> correctly, the assessor will provide feedback </w:t>
             </w:r>
             <w:r>
               <w:rPr>
-                <w:rFonts w:ascii="Aptos" w:eastAsia="Arial" w:hAnsi="Aptos" w:cs="Arial"/>
+                <w:rFonts w:ascii="Aptos" w:hAnsi="Aptos" w:eastAsia="Arial" w:cs="Arial"/>
               </w:rPr>
               <w:t>in Blackboard</w:t>
             </w:r>
@@ -1358,48 +1614,48 @@
               </w:numPr>
               <w:spacing w:before="120" w:after="120"/>
               <w:rPr>
-                <w:rFonts w:ascii="Aptos" w:eastAsia="Arial" w:hAnsi="Aptos" w:cs="Arial"/>
+                <w:rFonts w:ascii="Aptos" w:hAnsi="Aptos" w:eastAsia="Arial" w:cs="Arial"/>
               </w:rPr>
             </w:pPr>
             <w:r>
               <w:rPr>
-                <w:rFonts w:ascii="Aptos" w:eastAsia="Arial" w:hAnsi="Aptos" w:cs="Arial"/>
+                <w:rFonts w:ascii="Aptos" w:hAnsi="Aptos" w:eastAsia="Arial" w:cs="Arial"/>
               </w:rPr>
               <w:t>For those questions you do not complete to a satisfactory standard</w:t>
             </w:r>
             <w:r>
               <w:rPr>
-                <w:rFonts w:ascii="Aptos" w:eastAsia="Arial" w:hAnsi="Aptos" w:cs="Arial"/>
+                <w:rFonts w:ascii="Aptos" w:hAnsi="Aptos" w:eastAsia="Arial" w:cs="Arial"/>
               </w:rPr>
               <w:t>,</w:t>
             </w:r>
             <w:r>
               <w:rPr>
-                <w:rFonts w:ascii="Aptos" w:eastAsia="Arial" w:hAnsi="Aptos" w:cs="Arial"/>
+                <w:rFonts w:ascii="Aptos" w:hAnsi="Aptos" w:eastAsia="Arial" w:cs="Arial"/>
               </w:rPr>
               <w:t xml:space="preserve"> a</w:t>
             </w:r>
             <w:r>
               <w:rPr>
-                <w:rFonts w:ascii="Aptos" w:eastAsia="Arial" w:hAnsi="Aptos" w:cs="Arial"/>
+                <w:rFonts w:ascii="Aptos" w:hAnsi="Aptos" w:eastAsia="Arial" w:cs="Arial"/>
               </w:rPr>
               <w:t xml:space="preserve"> further opportunity to </w:t>
             </w:r>
             <w:r>
               <w:rPr>
-                <w:rFonts w:ascii="Aptos" w:eastAsia="Arial" w:hAnsi="Aptos" w:cs="Arial"/>
+                <w:rFonts w:ascii="Aptos" w:hAnsi="Aptos" w:eastAsia="Arial" w:cs="Arial"/>
               </w:rPr>
               <w:t>gain a satisfactory result</w:t>
             </w:r>
             <w:r>
               <w:rPr>
-                <w:rFonts w:ascii="Aptos" w:eastAsia="Arial" w:hAnsi="Aptos" w:cs="Arial"/>
+                <w:rFonts w:ascii="Aptos" w:hAnsi="Aptos" w:eastAsia="Arial" w:cs="Arial"/>
               </w:rPr>
               <w:t xml:space="preserve"> will be provided</w:t>
             </w:r>
             <w:r>
               <w:rPr>
-                <w:rFonts w:ascii="Aptos" w:eastAsia="Arial" w:hAnsi="Aptos" w:cs="Arial"/>
+                <w:rFonts w:ascii="Aptos" w:hAnsi="Aptos" w:eastAsia="Arial" w:cs="Arial"/>
               </w:rPr>
               <w:t xml:space="preserve">.  </w:t>
             </w:r>
@@ -1432,7 +1688,7 @@
             </w:pPr>
             <w:r>
               <w:rPr>
-                <w:rFonts w:ascii="Aptos" w:eastAsia="Arial" w:hAnsi="Aptos" w:cs="Arial"/>
+                <w:rFonts w:ascii="Aptos" w:hAnsi="Aptos" w:eastAsia="Arial" w:cs="Arial"/>
               </w:rPr>
               <w:t xml:space="preserve">If you are required to re-answer any of the questions, make sure you apply the feedback provided by your assessor.  </w:t>
             </w:r>
@@ -1449,11 +1705,11 @@
       </w:pPr>
     </w:p>
     <w:sectPr>
-      <w:headerReference w:type="even" r:id="rId13"/>
-      <w:headerReference w:type="default" r:id="rId14"/>
-      <w:footerReference w:type="default" r:id="rId15"/>
-      <w:headerReference w:type="first" r:id="rId16"/>
-      <w:pgSz w:w="11906" w:h="16838"/>
+      <w:headerReference w:type="even" r:id="rId14"/>
+      <w:headerReference w:type="default" r:id="rId15"/>
+      <w:footerReference w:type="default" r:id="rId16"/>
+      <w:headerReference w:type="first" r:id="rId17"/>
+      <w:pgSz w:w="11906" w:h="16838" w:orient="portrait"/>
       <w:pgMar w:top="1440" w:right="991" w:bottom="1440" w:left="851" w:header="426" w:footer="0" w:gutter="0"/>
       <w:cols w:space="708"/>
       <w:docGrid w:linePitch="360"/>
@@ -1495,7 +1751,7 @@
       <w:tblW w:w="10820" w:type="dxa"/>
       <w:jc w:val="center"/>
       <w:tblBorders>
-        <w:top w:val="single" w:sz="4" w:space="0" w:color="auto"/>
+        <w:top w:val="single" w:color="auto" w:sz="4" w:space="0"/>
       </w:tblBorders>
       <w:tblLook w:val="04A0" w:firstRow="1" w:lastRow="0" w:firstColumn="1" w:lastColumn="0" w:noHBand="0" w:noVBand="1"/>
     </w:tblPr>
@@ -1813,7 +2069,7 @@
             <w:spacing w:line="240" w:lineRule="auto"/>
             <w:jc w:val="center"/>
             <w:rPr>
-              <w:rFonts w:ascii="Aptos" w:eastAsiaTheme="minorHAnsi" w:hAnsi="Aptos"/>
+              <w:rFonts w:ascii="Aptos" w:hAnsi="Aptos" w:eastAsiaTheme="minorHAnsi"/>
               <w:bCs/>
               <w:sz w:val="16"/>
               <w:szCs w:val="16"/>
@@ -1822,7 +2078,7 @@
           </w:pPr>
           <w:r>
             <w:rPr>
-              <w:rFonts w:ascii="Aptos" w:eastAsiaTheme="minorHAnsi" w:hAnsi="Aptos"/>
+              <w:rFonts w:ascii="Aptos" w:hAnsi="Aptos" w:eastAsiaTheme="minorHAnsi"/>
               <w:bCs/>
               <w:sz w:val="16"/>
               <w:szCs w:val="16"/>
@@ -1900,7 +2156,7 @@
           </w:pPr>
           <w:r>
             <w:rPr>
-              <w:rFonts w:ascii="Aptos" w:eastAsiaTheme="minorHAnsi" w:hAnsi="Aptos"/>
+              <w:rFonts w:ascii="Aptos" w:hAnsi="Aptos" w:eastAsiaTheme="minorHAnsi"/>
               <w:bCs/>
               <w:sz w:val="16"/>
               <w:szCs w:val="16"/>
@@ -1910,7 +2166,7 @@
           </w:r>
           <w:r>
             <w:rPr>
-              <w:rFonts w:ascii="Aptos" w:eastAsiaTheme="minorHAnsi" w:hAnsi="Aptos"/>
+              <w:rFonts w:ascii="Aptos" w:hAnsi="Aptos" w:eastAsiaTheme="minorHAnsi"/>
               <w:bCs/>
               <w:sz w:val="16"/>
               <w:szCs w:val="16"/>
@@ -2102,7 +2358,7 @@
 </file>
 
 <file path=word/header1.xml><?xml version="1.0" encoding="utf-8"?>
-<w:hdr xmlns:wpc="http://schemas.microsoft.com/office/word/2010/wordprocessingCanvas" xmlns:cx="http://schemas.microsoft.com/office/drawing/2014/chartex" xmlns:cx1="http://schemas.microsoft.com/office/drawing/2015/9/8/chartex" xmlns:cx2="http://schemas.microsoft.com/office/drawing/2015/10/21/chartex" xmlns:cx3="http://schemas.microsoft.com/office/drawing/2016/5/9/chartex" xmlns:cx4="http://schemas.microsoft.com/office/drawing/2016/5/10/chartex" xmlns:cx5="http://schemas.microsoft.com/office/drawing/2016/5/11/chartex" xmlns:cx6="http://schemas.microsoft.com/office/drawing/2016/5/12/chartex" xmlns:cx7="http://schemas.microsoft.com/office/drawing/2016/5/13/chartex" xmlns:cx8="http://schemas.microsoft.com/office/drawing/2016/5/14/chartex" xmlns:mc="http://schemas.openxmlformats.org/markup-compatibility/2006" xmlns:aink="http://schemas.microsoft.com/office/drawing/2016/ink" xmlns:am3d="http://schemas.microsoft.com/office/drawing/2017/model3d" xmlns:o="urn:schemas-microsoft-com:office:office" xmlns:oel="http://schemas.microsoft.com/office/2019/extlst" xmlns:r="http://schemas.openxmlformats.org/officeDocument/2006/relationships" xmlns:m="http://schemas.openxmlformats.org/officeDocument/2006/math" xmlns:v="urn:schemas-microsoft-com:vml" xmlns:wp14="http://schemas.microsoft.com/office/word/2010/wordprocessingDrawing" xmlns:wp="http://schemas.openxmlformats.org/drawingml/2006/wordprocessingDrawing" xmlns:w10="urn:schemas-microsoft-com:office:word" xmlns:w="http://schemas.openxmlformats.org/wordprocessingml/2006/main" xmlns:w14="http://schemas.microsoft.com/office/word/2010/wordml" xmlns:w15="http://schemas.microsoft.com/office/word/2012/wordml" xmlns:w16cex="http://schemas.microsoft.com/office/word/2018/wordml/cex" xmlns:w16cid="http://schemas.microsoft.com/office/word/2016/wordml/cid" xmlns:w16="http://schemas.microsoft.com/office/word/2018/wordml" xmlns:w16du="http://schemas.microsoft.com/office/word/2023/wordml/word16du" xmlns:w16sdtdh="http://schemas.microsoft.com/office/word/2020/wordml/sdtdatahash" xmlns:w16sdtfl="http://schemas.microsoft.com/office/word/2024/wordml/sdtformatlock" xmlns:w16se="http://schemas.microsoft.com/office/word/2015/wordml/symex" xmlns:wpg="http://schemas.microsoft.com/office/word/2010/wordprocessingGroup" xmlns:wpi="http://schemas.microsoft.com/office/word/2010/wordprocessingInk" xmlns:wne="http://schemas.microsoft.com/office/word/2006/wordml" xmlns:wps="http://schemas.microsoft.com/office/word/2010/wordprocessingShape" mc:Ignorable="w14 w15 w16se w16cid w16 w16cex w16sdtdh w16sdtfl w16du wp14">
+<w:hdr xmlns:wpc="http://schemas.microsoft.com/office/word/2010/wordprocessingCanvas" xmlns:cx="http://schemas.microsoft.com/office/drawing/2014/chartex" xmlns:cx1="http://schemas.microsoft.com/office/drawing/2015/9/8/chartex" xmlns:cx2="http://schemas.microsoft.com/office/drawing/2015/10/21/chartex" xmlns:cx3="http://schemas.microsoft.com/office/drawing/2016/5/9/chartex" xmlns:cx4="http://schemas.microsoft.com/office/drawing/2016/5/10/chartex" xmlns:cx5="http://schemas.microsoft.com/office/drawing/2016/5/11/chartex" xmlns:cx6="http://schemas.microsoft.com/office/drawing/2016/5/12/chartex" xmlns:cx7="http://schemas.microsoft.com/office/drawing/2016/5/13/chartex" xmlns:cx8="http://schemas.microsoft.com/office/drawing/2016/5/14/chartex" xmlns:mc="http://schemas.openxmlformats.org/markup-compatibility/2006" xmlns:aink="http://schemas.microsoft.com/office/drawing/2016/ink" xmlns:am3d="http://schemas.microsoft.com/office/drawing/2017/model3d" xmlns:o="urn:schemas-microsoft-com:office:office" xmlns:oel="http://schemas.microsoft.com/office/2019/extlst" xmlns:r="http://schemas.openxmlformats.org/officeDocument/2006/relationships" xmlns:m="http://schemas.openxmlformats.org/officeDocument/2006/math" xmlns:v="urn:schemas-microsoft-com:vml" xmlns:wp14="http://schemas.microsoft.com/office/word/2010/wordprocessingDrawing" xmlns:wp="http://schemas.openxmlformats.org/drawingml/2006/wordprocessingDrawing" xmlns:w10="urn:schemas-microsoft-com:office:word" xmlns:w="http://schemas.openxmlformats.org/wordprocessingml/2006/main" xmlns:w14="http://schemas.microsoft.com/office/word/2010/wordml" xmlns:w15="http://schemas.microsoft.com/office/word/2012/wordml" xmlns:w16cex="http://schemas.microsoft.com/office/word/2018/wordml/cex" xmlns:w16cid="http://schemas.microsoft.com/office/word/2016/wordml/cid" xmlns:w16="http://schemas.microsoft.com/office/word/2018/wordml" xmlns:w16du="http://schemas.microsoft.com/office/word/2023/wordml/word16du" xmlns:w16sdtdh="http://schemas.microsoft.com/office/word/2020/wordml/sdtdatahash" xmlns:w16sdtfl="http://schemas.microsoft.com/office/word/2024/wordml/sdtformatlock" xmlns:w16se="http://schemas.microsoft.com/office/word/2015/wordml/symex" xmlns:wpg="http://schemas.microsoft.com/office/word/2010/wordprocessingGroup" xmlns:wpi="http://schemas.microsoft.com/office/word/2010/wordprocessingInk" xmlns:wne="http://schemas.microsoft.com/office/word/2006/wordml" xmlns:wps="http://schemas.microsoft.com/office/word/2010/wordprocessingShape" xmlns:a="http://schemas.openxmlformats.org/drawingml/2006/main" xmlns:aclsh="http://schemas.microsoft.com/office/drawing/2020/classificationShape" mc:Ignorable="w14 w15 w16se w16cid w16 w16cex w16sdtdh w16sdtfl w16du wp14">
   <w:p>
     <w:pPr>
       <w:pStyle w:val="Header"/>
@@ -2156,7 +2412,7 @@
                           <w:pPr>
                             <w:spacing w:after="0"/>
                             <w:rPr>
-                              <w:rFonts w:ascii="Calibri" w:eastAsia="Calibri" w:hAnsi="Calibri" w:cs="Calibri"/>
+                              <w:rFonts w:ascii="Calibri" w:hAnsi="Calibri" w:eastAsia="Calibri" w:cs="Calibri"/>
                               <w:color w:val="FF0000"/>
                               <w:sz w:val="20"/>
                               <w:szCs w:val="20"/>
@@ -2164,7 +2420,7 @@
                           </w:pPr>
                           <w:r>
                             <w:rPr>
-                              <w:rFonts w:ascii="Calibri" w:eastAsia="Calibri" w:hAnsi="Calibri" w:cs="Calibri"/>
+                              <w:rFonts w:ascii="Calibri" w:hAnsi="Calibri" w:eastAsia="Calibri" w:cs="Calibri"/>
                               <w:color w:val="FF0000"/>
                               <w:sz w:val="20"/>
                               <w:szCs w:val="20"/>
@@ -2187,19 +2443,19 @@
           </w:drawing>
         </mc:Choice>
         <mc:Fallback>
-          <w:pict>
-            <v:shapetype w14:anchorId="353BF5F1" id="_x0000_t202" coordsize="21600,21600" o:spt="202" path="m,l,21600r21600,l21600,xe">
+          <w:pict w14:anchorId="3DE9CA63">
+            <v:shapetype id="_x0000_t202" coordsize="21600,21600" o:spt="202" path="m,l,21600r21600,l21600,xe" w14:anchorId="353BF5F1">
               <v:stroke joinstyle="miter"/>
               <v:path gradientshapeok="t" o:connecttype="rect"/>
             </v:shapetype>
-            <v:shape id="Text Box 2" o:spid="_x0000_s1026" type="#_x0000_t202" alt="OFFICIAL" style="position:absolute;margin-left:0;margin-top:0;width:36.2pt;height:29.15pt;z-index:251658241;visibility:visible;mso-wrap-style:none;mso-wrap-distance-left:0;mso-wrap-distance-top:0;mso-wrap-distance-right:0;mso-wrap-distance-bottom:0;mso-position-horizontal:center;mso-position-horizontal-relative:page;mso-position-vertical:top;mso-position-vertical-relative:page;v-text-anchor:top" o:gfxdata="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" filled="f" stroked="f">
+            <v:shape id="Text Box 2" style="position:absolute;margin-left:0;margin-top:0;width:36.2pt;height:29.15pt;z-index:251658241;visibility:visible;mso-wrap-style:none;mso-wrap-distance-left:0;mso-wrap-distance-top:0;mso-wrap-distance-right:0;mso-wrap-distance-bottom:0;mso-position-horizontal:center;mso-position-horizontal-relative:page;mso-position-vertical:top;mso-position-vertical-relative:page;v-text-anchor:top" alt="OFFICIAL" o:spid="_x0000_s1026" filled="f" stroked="f" type="#_x0000_t202" o:gfxdata="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">
               <v:textbox style="mso-fit-shape-to-text:t" inset="0,15pt,0,0">
                 <w:txbxContent>
                   <w:p>
                     <w:pPr>
                       <w:spacing w:after="0"/>
                       <w:rPr>
-                        <w:rFonts w:ascii="Calibri" w:eastAsia="Calibri" w:hAnsi="Calibri" w:cs="Calibri"/>
+                        <w:rFonts w:ascii="Calibri" w:hAnsi="Calibri" w:eastAsia="Calibri" w:cs="Calibri"/>
                         <w:color w:val="FF0000"/>
                         <w:sz w:val="20"/>
                         <w:szCs w:val="20"/>
@@ -2207,7 +2463,7 @@
                     </w:pPr>
                     <w:r>
                       <w:rPr>
-                        <w:rFonts w:ascii="Calibri" w:eastAsia="Calibri" w:hAnsi="Calibri" w:cs="Calibri"/>
+                        <w:rFonts w:ascii="Calibri" w:hAnsi="Calibri" w:eastAsia="Calibri" w:cs="Calibri"/>
                         <w:color w:val="FF0000"/>
                         <w:sz w:val="20"/>
                         <w:szCs w:val="20"/>
@@ -2228,7 +2484,7 @@
 </file>
 
 <file path=word/header2.xml><?xml version="1.0" encoding="utf-8"?>
-<w:hdr xmlns:wpc="http://schemas.microsoft.com/office/word/2010/wordprocessingCanvas" xmlns:cx="http://schemas.microsoft.com/office/drawing/2014/chartex" xmlns:cx1="http://schemas.microsoft.com/office/drawing/2015/9/8/chartex" xmlns:cx2="http://schemas.microsoft.com/office/drawing/2015/10/21/chartex" xmlns:cx3="http://schemas.microsoft.com/office/drawing/2016/5/9/chartex" xmlns:cx4="http://schemas.microsoft.com/office/drawing/2016/5/10/chartex" xmlns:cx5="http://schemas.microsoft.com/office/drawing/2016/5/11/chartex" xmlns:cx6="http://schemas.microsoft.com/office/drawing/2016/5/12/chartex" xmlns:cx7="http://schemas.microsoft.com/office/drawing/2016/5/13/chartex" xmlns:cx8="http://schemas.microsoft.com/office/drawing/2016/5/14/chartex" xmlns:mc="http://schemas.openxmlformats.org/markup-compatibility/2006" xmlns:aink="http://schemas.microsoft.com/office/drawing/2016/ink" xmlns:am3d="http://schemas.microsoft.com/office/drawing/2017/model3d" xmlns:o="urn:schemas-microsoft-com:office:office" xmlns:oel="http://schemas.microsoft.com/office/2019/extlst" xmlns:r="http://schemas.openxmlformats.org/officeDocument/2006/relationships" xmlns:m="http://schemas.openxmlformats.org/officeDocument/2006/math" xmlns:v="urn:schemas-microsoft-com:vml" xmlns:wp14="http://schemas.microsoft.com/office/word/2010/wordprocessingDrawing" xmlns:wp="http://schemas.openxmlformats.org/drawingml/2006/wordprocessingDrawing" xmlns:w10="urn:schemas-microsoft-com:office:word" xmlns:w="http://schemas.openxmlformats.org/wordprocessingml/2006/main" xmlns:w14="http://schemas.microsoft.com/office/word/2010/wordml" xmlns:w15="http://schemas.microsoft.com/office/word/2012/wordml" xmlns:w16cex="http://schemas.microsoft.com/office/word/2018/wordml/cex" xmlns:w16cid="http://schemas.microsoft.com/office/word/2016/wordml/cid" xmlns:w16="http://schemas.microsoft.com/office/word/2018/wordml" xmlns:w16du="http://schemas.microsoft.com/office/word/2023/wordml/word16du" xmlns:w16sdtdh="http://schemas.microsoft.com/office/word/2020/wordml/sdtdatahash" xmlns:w16sdtfl="http://schemas.microsoft.com/office/word/2024/wordml/sdtformatlock" xmlns:w16se="http://schemas.microsoft.com/office/word/2015/wordml/symex" xmlns:wpg="http://schemas.microsoft.com/office/word/2010/wordprocessingGroup" xmlns:wpi="http://schemas.microsoft.com/office/word/2010/wordprocessingInk" xmlns:wne="http://schemas.microsoft.com/office/word/2006/wordml" xmlns:wps="http://schemas.microsoft.com/office/word/2010/wordprocessingShape" mc:Ignorable="w14 w15 w16se w16cid w16 w16cex w16sdtdh w16sdtfl w16du wp14">
+<w:hdr xmlns:wpc="http://schemas.microsoft.com/office/word/2010/wordprocessingCanvas" xmlns:cx="http://schemas.microsoft.com/office/drawing/2014/chartex" xmlns:cx1="http://schemas.microsoft.com/office/drawing/2015/9/8/chartex" xmlns:cx2="http://schemas.microsoft.com/office/drawing/2015/10/21/chartex" xmlns:cx3="http://schemas.microsoft.com/office/drawing/2016/5/9/chartex" xmlns:cx4="http://schemas.microsoft.com/office/drawing/2016/5/10/chartex" xmlns:cx5="http://schemas.microsoft.com/office/drawing/2016/5/11/chartex" xmlns:cx6="http://schemas.microsoft.com/office/drawing/2016/5/12/chartex" xmlns:cx7="http://schemas.microsoft.com/office/drawing/2016/5/13/chartex" xmlns:cx8="http://schemas.microsoft.com/office/drawing/2016/5/14/chartex" xmlns:mc="http://schemas.openxmlformats.org/markup-compatibility/2006" xmlns:aink="http://schemas.microsoft.com/office/drawing/2016/ink" xmlns:am3d="http://schemas.microsoft.com/office/drawing/2017/model3d" xmlns:o="urn:schemas-microsoft-com:office:office" xmlns:oel="http://schemas.microsoft.com/office/2019/extlst" xmlns:r="http://schemas.openxmlformats.org/officeDocument/2006/relationships" xmlns:m="http://schemas.openxmlformats.org/officeDocument/2006/math" xmlns:v="urn:schemas-microsoft-com:vml" xmlns:wp14="http://schemas.microsoft.com/office/word/2010/wordprocessingDrawing" xmlns:wp="http://schemas.openxmlformats.org/drawingml/2006/wordprocessingDrawing" xmlns:w10="urn:schemas-microsoft-com:office:word" xmlns:w="http://schemas.openxmlformats.org/wordprocessingml/2006/main" xmlns:w14="http://schemas.microsoft.com/office/word/2010/wordml" xmlns:w15="http://schemas.microsoft.com/office/word/2012/wordml" xmlns:w16cex="http://schemas.microsoft.com/office/word/2018/wordml/cex" xmlns:w16cid="http://schemas.microsoft.com/office/word/2016/wordml/cid" xmlns:w16="http://schemas.microsoft.com/office/word/2018/wordml" xmlns:w16du="http://schemas.microsoft.com/office/word/2023/wordml/word16du" xmlns:w16sdtdh="http://schemas.microsoft.com/office/word/2020/wordml/sdtdatahash" xmlns:w16sdtfl="http://schemas.microsoft.com/office/word/2024/wordml/sdtformatlock" xmlns:w16se="http://schemas.microsoft.com/office/word/2015/wordml/symex" xmlns:wpg="http://schemas.microsoft.com/office/word/2010/wordprocessingGroup" xmlns:wpi="http://schemas.microsoft.com/office/word/2010/wordprocessingInk" xmlns:wne="http://schemas.microsoft.com/office/word/2006/wordml" xmlns:wps="http://schemas.microsoft.com/office/word/2010/wordprocessingShape" xmlns:a="http://schemas.openxmlformats.org/drawingml/2006/main" xmlns:aclsh="http://schemas.microsoft.com/office/drawing/2020/classificationShape" xmlns:pic="http://schemas.openxmlformats.org/drawingml/2006/picture" xmlns:a14="http://schemas.microsoft.com/office/drawing/2010/main" mc:Ignorable="w14 w15 w16se w16cid w16 w16cex w16sdtdh w16sdtfl w16du wp14">
   <w:p>
     <w:pPr>
       <w:pStyle w:val="Header"/>
@@ -2283,7 +2539,7 @@
                           <w:pPr>
                             <w:spacing w:after="0"/>
                             <w:rPr>
-                              <w:rFonts w:ascii="Calibri" w:eastAsia="Calibri" w:hAnsi="Calibri" w:cs="Calibri"/>
+                              <w:rFonts w:ascii="Calibri" w:hAnsi="Calibri" w:eastAsia="Calibri" w:cs="Calibri"/>
                               <w:color w:val="FF0000"/>
                               <w:sz w:val="20"/>
                               <w:szCs w:val="20"/>
@@ -2291,7 +2547,7 @@
                           </w:pPr>
                           <w:r>
                             <w:rPr>
-                              <w:rFonts w:ascii="Calibri" w:eastAsia="Calibri" w:hAnsi="Calibri" w:cs="Calibri"/>
+                              <w:rFonts w:ascii="Calibri" w:hAnsi="Calibri" w:eastAsia="Calibri" w:cs="Calibri"/>
                               <w:color w:val="FF0000"/>
                               <w:sz w:val="20"/>
                               <w:szCs w:val="20"/>
@@ -2317,19 +2573,19 @@
           </w:drawing>
         </mc:Choice>
         <mc:Fallback>
-          <w:pict>
-            <v:shapetype w14:anchorId="368C6AD7" id="_x0000_t202" coordsize="21600,21600" o:spt="202" path="m,l,21600r21600,l21600,xe">
+          <w:pict w14:anchorId="394064C7">
+            <v:shapetype id="_x0000_t202" coordsize="21600,21600" o:spt="202" path="m,l,21600r21600,l21600,xe" w14:anchorId="368C6AD7">
               <v:stroke joinstyle="miter"/>
               <v:path gradientshapeok="t" o:connecttype="rect"/>
             </v:shapetype>
-            <v:shape id="Text Box 3" o:spid="_x0000_s1027" type="#_x0000_t202" alt="OFFICIAL" style="position:absolute;margin-left:0;margin-top:0;width:36.2pt;height:29.15pt;z-index:251658242;visibility:visible;mso-wrap-style:none;mso-height-percent:0;mso-wrap-distance-left:0;mso-wrap-distance-top:0;mso-wrap-distance-right:0;mso-wrap-distance-bottom:0;mso-position-horizontal:center;mso-position-horizontal-relative:page;mso-position-vertical:top;mso-position-vertical-relative:page;mso-height-percent:0;mso-height-relative:margin;v-text-anchor:top" o:gfxdata="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" filled="f" stroked="f">
+            <v:shape id="Text Box 3" style="position:absolute;margin-left:0;margin-top:0;width:36.2pt;height:29.15pt;z-index:251658242;visibility:visible;mso-wrap-style:none;mso-height-percent:0;mso-wrap-distance-left:0;mso-wrap-distance-top:0;mso-wrap-distance-right:0;mso-wrap-distance-bottom:0;mso-position-horizontal:center;mso-position-horizontal-relative:page;mso-position-vertical:top;mso-position-vertical-relative:page;mso-height-percent:0;mso-height-relative:margin;v-text-anchor:top" alt="OFFICIAL" o:spid="_x0000_s1027" filled="f" stroked="f" type="#_x0000_t202" o:gfxdata="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">
               <v:textbox style="mso-fit-shape-to-text:t" inset="0,15pt,0,0">
                 <w:txbxContent>
                   <w:p>
                     <w:pPr>
                       <w:spacing w:after="0"/>
                       <w:rPr>
-                        <w:rFonts w:ascii="Calibri" w:eastAsia="Calibri" w:hAnsi="Calibri" w:cs="Calibri"/>
+                        <w:rFonts w:ascii="Calibri" w:hAnsi="Calibri" w:eastAsia="Calibri" w:cs="Calibri"/>
                         <w:color w:val="FF0000"/>
                         <w:sz w:val="20"/>
                         <w:szCs w:val="20"/>
@@ -2337,7 +2593,7 @@
                     </w:pPr>
                     <w:r>
                       <w:rPr>
-                        <w:rFonts w:ascii="Calibri" w:eastAsia="Calibri" w:hAnsi="Calibri" w:cs="Calibri"/>
+                        <w:rFonts w:ascii="Calibri" w:hAnsi="Calibri" w:eastAsia="Calibri" w:cs="Calibri"/>
                         <w:color w:val="FF0000"/>
                         <w:sz w:val="20"/>
                         <w:szCs w:val="20"/>
@@ -2442,12 +2698,12 @@
       <w:tblW w:w="10206" w:type="dxa"/>
       <w:tblInd w:w="-5" w:type="dxa"/>
       <w:tblBorders>
-        <w:top w:val="single" w:sz="4" w:space="0" w:color="auto"/>
-        <w:left w:val="single" w:sz="4" w:space="0" w:color="auto"/>
-        <w:bottom w:val="single" w:sz="4" w:space="0" w:color="auto"/>
-        <w:right w:val="single" w:sz="4" w:space="0" w:color="auto"/>
-        <w:insideH w:val="single" w:sz="4" w:space="0" w:color="auto"/>
-        <w:insideV w:val="single" w:sz="4" w:space="0" w:color="auto"/>
+        <w:top w:val="single" w:color="auto" w:sz="4" w:space="0"/>
+        <w:left w:val="single" w:color="auto" w:sz="4" w:space="0"/>
+        <w:bottom w:val="single" w:color="auto" w:sz="4" w:space="0"/>
+        <w:right w:val="single" w:color="auto" w:sz="4" w:space="0"/>
+        <w:insideH w:val="single" w:color="auto" w:sz="4" w:space="0"/>
+        <w:insideV w:val="single" w:color="auto" w:sz="4" w:space="0"/>
       </w:tblBorders>
       <w:tblLayout w:type="fixed"/>
       <w:tblLook w:val="01E0" w:firstRow="1" w:lastRow="1" w:firstColumn="1" w:lastColumn="1" w:noHBand="0" w:noVBand="0"/>
@@ -2534,7 +2790,7 @@
               <w:szCs w:val="22"/>
             </w:rPr>
           </w:pPr>
-          <w:bookmarkStart w:id="1" w:name="_Hlk192581988"/>
+          <w:bookmarkStart w:name="_Hlk192581988" w:id="1"/>
           <w:r>
             <w:rPr>
               <w:rFonts w:ascii="Aptos" w:hAnsi="Aptos"/>
@@ -2592,7 +2848,7 @@
 </file>
 
 <file path=word/header3.xml><?xml version="1.0" encoding="utf-8"?>
-<w:hdr xmlns:wpc="http://schemas.microsoft.com/office/word/2010/wordprocessingCanvas" xmlns:cx="http://schemas.microsoft.com/office/drawing/2014/chartex" xmlns:cx1="http://schemas.microsoft.com/office/drawing/2015/9/8/chartex" xmlns:cx2="http://schemas.microsoft.com/office/drawing/2015/10/21/chartex" xmlns:cx3="http://schemas.microsoft.com/office/drawing/2016/5/9/chartex" xmlns:cx4="http://schemas.microsoft.com/office/drawing/2016/5/10/chartex" xmlns:cx5="http://schemas.microsoft.com/office/drawing/2016/5/11/chartex" xmlns:cx6="http://schemas.microsoft.com/office/drawing/2016/5/12/chartex" xmlns:cx7="http://schemas.microsoft.com/office/drawing/2016/5/13/chartex" xmlns:cx8="http://schemas.microsoft.com/office/drawing/2016/5/14/chartex" xmlns:mc="http://schemas.openxmlformats.org/markup-compatibility/2006" xmlns:aink="http://schemas.microsoft.com/office/drawing/2016/ink" xmlns:am3d="http://schemas.microsoft.com/office/drawing/2017/model3d" xmlns:o="urn:schemas-microsoft-com:office:office" xmlns:oel="http://schemas.microsoft.com/office/2019/extlst" xmlns:r="http://schemas.openxmlformats.org/officeDocument/2006/relationships" xmlns:m="http://schemas.openxmlformats.org/officeDocument/2006/math" xmlns:v="urn:schemas-microsoft-com:vml" xmlns:wp14="http://schemas.microsoft.com/office/word/2010/wordprocessingDrawing" xmlns:wp="http://schemas.openxmlformats.org/drawingml/2006/wordprocessingDrawing" xmlns:w10="urn:schemas-microsoft-com:office:word" xmlns:w="http://schemas.openxmlformats.org/wordprocessingml/2006/main" xmlns:w14="http://schemas.microsoft.com/office/word/2010/wordml" xmlns:w15="http://schemas.microsoft.com/office/word/2012/wordml" xmlns:w16cex="http://schemas.microsoft.com/office/word/2018/wordml/cex" xmlns:w16cid="http://schemas.microsoft.com/office/word/2016/wordml/cid" xmlns:w16="http://schemas.microsoft.com/office/word/2018/wordml" xmlns:w16du="http://schemas.microsoft.com/office/word/2023/wordml/word16du" xmlns:w16sdtdh="http://schemas.microsoft.com/office/word/2020/wordml/sdtdatahash" xmlns:w16sdtfl="http://schemas.microsoft.com/office/word/2024/wordml/sdtformatlock" xmlns:w16se="http://schemas.microsoft.com/office/word/2015/wordml/symex" xmlns:wpg="http://schemas.microsoft.com/office/word/2010/wordprocessingGroup" xmlns:wpi="http://schemas.microsoft.com/office/word/2010/wordprocessingInk" xmlns:wne="http://schemas.microsoft.com/office/word/2006/wordml" xmlns:wps="http://schemas.microsoft.com/office/word/2010/wordprocessingShape" mc:Ignorable="w14 w15 w16se w16cid w16 w16cex w16sdtdh w16sdtfl w16du wp14">
+<w:hdr xmlns:wpc="http://schemas.microsoft.com/office/word/2010/wordprocessingCanvas" xmlns:cx="http://schemas.microsoft.com/office/drawing/2014/chartex" xmlns:cx1="http://schemas.microsoft.com/office/drawing/2015/9/8/chartex" xmlns:cx2="http://schemas.microsoft.com/office/drawing/2015/10/21/chartex" xmlns:cx3="http://schemas.microsoft.com/office/drawing/2016/5/9/chartex" xmlns:cx4="http://schemas.microsoft.com/office/drawing/2016/5/10/chartex" xmlns:cx5="http://schemas.microsoft.com/office/drawing/2016/5/11/chartex" xmlns:cx6="http://schemas.microsoft.com/office/drawing/2016/5/12/chartex" xmlns:cx7="http://schemas.microsoft.com/office/drawing/2016/5/13/chartex" xmlns:cx8="http://schemas.microsoft.com/office/drawing/2016/5/14/chartex" xmlns:mc="http://schemas.openxmlformats.org/markup-compatibility/2006" xmlns:aink="http://schemas.microsoft.com/office/drawing/2016/ink" xmlns:am3d="http://schemas.microsoft.com/office/drawing/2017/model3d" xmlns:o="urn:schemas-microsoft-com:office:office" xmlns:oel="http://schemas.microsoft.com/office/2019/extlst" xmlns:r="http://schemas.openxmlformats.org/officeDocument/2006/relationships" xmlns:m="http://schemas.openxmlformats.org/officeDocument/2006/math" xmlns:v="urn:schemas-microsoft-com:vml" xmlns:wp14="http://schemas.microsoft.com/office/word/2010/wordprocessingDrawing" xmlns:wp="http://schemas.openxmlformats.org/drawingml/2006/wordprocessingDrawing" xmlns:w10="urn:schemas-microsoft-com:office:word" xmlns:w="http://schemas.openxmlformats.org/wordprocessingml/2006/main" xmlns:w14="http://schemas.microsoft.com/office/word/2010/wordml" xmlns:w15="http://schemas.microsoft.com/office/word/2012/wordml" xmlns:w16cex="http://schemas.microsoft.com/office/word/2018/wordml/cex" xmlns:w16cid="http://schemas.microsoft.com/office/word/2016/wordml/cid" xmlns:w16="http://schemas.microsoft.com/office/word/2018/wordml" xmlns:w16du="http://schemas.microsoft.com/office/word/2023/wordml/word16du" xmlns:w16sdtdh="http://schemas.microsoft.com/office/word/2020/wordml/sdtdatahash" xmlns:w16sdtfl="http://schemas.microsoft.com/office/word/2024/wordml/sdtformatlock" xmlns:w16se="http://schemas.microsoft.com/office/word/2015/wordml/symex" xmlns:wpg="http://schemas.microsoft.com/office/word/2010/wordprocessingGroup" xmlns:wpi="http://schemas.microsoft.com/office/word/2010/wordprocessingInk" xmlns:wne="http://schemas.microsoft.com/office/word/2006/wordml" xmlns:wps="http://schemas.microsoft.com/office/word/2010/wordprocessingShape" xmlns:a="http://schemas.openxmlformats.org/drawingml/2006/main" xmlns:aclsh="http://schemas.microsoft.com/office/drawing/2020/classificationShape" mc:Ignorable="w14 w15 w16se w16cid w16 w16cex w16sdtdh w16sdtfl w16du wp14">
   <w:p>
     <w:pPr>
       <w:pStyle w:val="Header"/>
@@ -2646,7 +2902,7 @@
                           <w:pPr>
                             <w:spacing w:after="0"/>
                             <w:rPr>
-                              <w:rFonts w:ascii="Calibri" w:eastAsia="Calibri" w:hAnsi="Calibri" w:cs="Calibri"/>
+                              <w:rFonts w:ascii="Calibri" w:hAnsi="Calibri" w:eastAsia="Calibri" w:cs="Calibri"/>
                               <w:color w:val="FF0000"/>
                               <w:sz w:val="20"/>
                               <w:szCs w:val="20"/>
@@ -2654,7 +2910,7 @@
                           </w:pPr>
                           <w:r>
                             <w:rPr>
-                              <w:rFonts w:ascii="Calibri" w:eastAsia="Calibri" w:hAnsi="Calibri" w:cs="Calibri"/>
+                              <w:rFonts w:ascii="Calibri" w:hAnsi="Calibri" w:eastAsia="Calibri" w:cs="Calibri"/>
                               <w:color w:val="FF0000"/>
                               <w:sz w:val="20"/>
                               <w:szCs w:val="20"/>
@@ -2677,19 +2933,19 @@
           </w:drawing>
         </mc:Choice>
         <mc:Fallback>
-          <w:pict>
-            <v:shapetype w14:anchorId="72C04DE0" id="_x0000_t202" coordsize="21600,21600" o:spt="202" path="m,l,21600r21600,l21600,xe">
+          <w:pict w14:anchorId="76FC9867">
+            <v:shapetype id="_x0000_t202" coordsize="21600,21600" o:spt="202" path="m,l,21600r21600,l21600,xe" w14:anchorId="72C04DE0">
               <v:stroke joinstyle="miter"/>
               <v:path gradientshapeok="t" o:connecttype="rect"/>
             </v:shapetype>
-            <v:shape id="Text Box 1" o:spid="_x0000_s1028" type="#_x0000_t202" alt="OFFICIAL" style="position:absolute;margin-left:0;margin-top:0;width:36.2pt;height:29.15pt;z-index:251658240;visibility:visible;mso-wrap-style:none;mso-wrap-distance-left:0;mso-wrap-distance-top:0;mso-wrap-distance-right:0;mso-wrap-distance-bottom:0;mso-position-horizontal:center;mso-position-horizontal-relative:page;mso-position-vertical:top;mso-position-vertical-relative:page;v-text-anchor:top" o:gfxdata="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" filled="f" stroked="f">
+            <v:shape id="Text Box 1" style="position:absolute;margin-left:0;margin-top:0;width:36.2pt;height:29.15pt;z-index:251658240;visibility:visible;mso-wrap-style:none;mso-wrap-distance-left:0;mso-wrap-distance-top:0;mso-wrap-distance-right:0;mso-wrap-distance-bottom:0;mso-position-horizontal:center;mso-position-horizontal-relative:page;mso-position-vertical:top;mso-position-vertical-relative:page;v-text-anchor:top" alt="OFFICIAL" o:spid="_x0000_s1028" filled="f" stroked="f" type="#_x0000_t202" o:gfxdata="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">
               <v:textbox style="mso-fit-shape-to-text:t" inset="0,15pt,0,0">
                 <w:txbxContent>
                   <w:p>
                     <w:pPr>
                       <w:spacing w:after="0"/>
                       <w:rPr>
-                        <w:rFonts w:ascii="Calibri" w:eastAsia="Calibri" w:hAnsi="Calibri" w:cs="Calibri"/>
+                        <w:rFonts w:ascii="Calibri" w:hAnsi="Calibri" w:eastAsia="Calibri" w:cs="Calibri"/>
                         <w:color w:val="FF0000"/>
                         <w:sz w:val="20"/>
                         <w:szCs w:val="20"/>
@@ -2697,7 +2953,7 @@
                     </w:pPr>
                     <w:r>
                       <w:rPr>
-                        <w:rFonts w:ascii="Calibri" w:eastAsia="Calibri" w:hAnsi="Calibri" w:cs="Calibri"/>
+                        <w:rFonts w:ascii="Calibri" w:hAnsi="Calibri" w:eastAsia="Calibri" w:cs="Calibri"/>
                         <w:color w:val="FF0000"/>
                         <w:sz w:val="20"/>
                         <w:szCs w:val="20"/>
@@ -2845,7 +3101,7 @@
         <w:ind w:left="720" w:hanging="360"/>
       </w:pPr>
       <w:rPr>
-        <w:rFonts w:ascii="Symbol" w:hAnsi="Symbol" w:hint="default"/>
+        <w:rFonts w:hint="default" w:ascii="Symbol" w:hAnsi="Symbol"/>
       </w:rPr>
     </w:lvl>
     <w:lvl w:ilvl="1" w:tplc="5972CEA0">
@@ -2857,7 +3113,7 @@
         <w:ind w:left="1440" w:hanging="360"/>
       </w:pPr>
       <w:rPr>
-        <w:rFonts w:ascii="Courier New" w:hAnsi="Courier New" w:hint="default"/>
+        <w:rFonts w:hint="default" w:ascii="Courier New" w:hAnsi="Courier New"/>
       </w:rPr>
     </w:lvl>
     <w:lvl w:ilvl="2" w:tplc="77A8FD02">
@@ -2869,7 +3125,7 @@
         <w:ind w:left="2160" w:hanging="360"/>
       </w:pPr>
       <w:rPr>
-        <w:rFonts w:ascii="Wingdings" w:hAnsi="Wingdings" w:hint="default"/>
+        <w:rFonts w:hint="default" w:ascii="Wingdings" w:hAnsi="Wingdings"/>
       </w:rPr>
     </w:lvl>
     <w:lvl w:ilvl="3" w:tplc="D5803890">
@@ -2881,7 +3137,7 @@
         <w:ind w:left="2880" w:hanging="360"/>
       </w:pPr>
       <w:rPr>
-        <w:rFonts w:ascii="Symbol" w:hAnsi="Symbol" w:hint="default"/>
+        <w:rFonts w:hint="default" w:ascii="Symbol" w:hAnsi="Symbol"/>
       </w:rPr>
     </w:lvl>
     <w:lvl w:ilvl="4" w:tplc="4F9A4F88">
@@ -2893,7 +3149,7 @@
         <w:ind w:left="3600" w:hanging="360"/>
       </w:pPr>
       <w:rPr>
-        <w:rFonts w:ascii="Courier New" w:hAnsi="Courier New" w:hint="default"/>
+        <w:rFonts w:hint="default" w:ascii="Courier New" w:hAnsi="Courier New"/>
       </w:rPr>
     </w:lvl>
     <w:lvl w:ilvl="5" w:tplc="82289902">
@@ -2905,7 +3161,7 @@
         <w:ind w:left="4320" w:hanging="360"/>
       </w:pPr>
       <w:rPr>
-        <w:rFonts w:ascii="Wingdings" w:hAnsi="Wingdings" w:hint="default"/>
+        <w:rFonts w:hint="default" w:ascii="Wingdings" w:hAnsi="Wingdings"/>
       </w:rPr>
     </w:lvl>
     <w:lvl w:ilvl="6" w:tplc="7940F21E">
@@ -2917,7 +3173,7 @@
         <w:ind w:left="5040" w:hanging="360"/>
       </w:pPr>
       <w:rPr>
-        <w:rFonts w:ascii="Symbol" w:hAnsi="Symbol" w:hint="default"/>
+        <w:rFonts w:hint="default" w:ascii="Symbol" w:hAnsi="Symbol"/>
       </w:rPr>
     </w:lvl>
     <w:lvl w:ilvl="7" w:tplc="EBD63886">
@@ -2929,7 +3185,7 @@
         <w:ind w:left="5760" w:hanging="360"/>
       </w:pPr>
       <w:rPr>
-        <w:rFonts w:ascii="Courier New" w:hAnsi="Courier New" w:hint="default"/>
+        <w:rFonts w:hint="default" w:ascii="Courier New" w:hAnsi="Courier New"/>
       </w:rPr>
     </w:lvl>
     <w:lvl w:ilvl="8" w:tplc="CCB85AB4">
@@ -2941,7 +3197,7 @@
         <w:ind w:left="6480" w:hanging="360"/>
       </w:pPr>
       <w:rPr>
-        <w:rFonts w:ascii="Wingdings" w:hAnsi="Wingdings" w:hint="default"/>
+        <w:rFonts w:hint="default" w:ascii="Wingdings" w:hAnsi="Wingdings"/>
       </w:rPr>
     </w:lvl>
   </w:abstractNum>
@@ -2958,7 +3214,7 @@
         <w:ind w:left="720" w:hanging="360"/>
       </w:pPr>
       <w:rPr>
-        <w:rFonts w:ascii="Symbol" w:hAnsi="Symbol" w:hint="default"/>
+        <w:rFonts w:hint="default" w:ascii="Symbol" w:hAnsi="Symbol"/>
       </w:rPr>
     </w:lvl>
     <w:lvl w:ilvl="1" w:tplc="5E6AA3A4">
@@ -2970,7 +3226,7 @@
         <w:ind w:left="1440" w:hanging="360"/>
       </w:pPr>
       <w:rPr>
-        <w:rFonts w:ascii="Courier New" w:hAnsi="Courier New" w:hint="default"/>
+        <w:rFonts w:hint="default" w:ascii="Courier New" w:hAnsi="Courier New"/>
       </w:rPr>
     </w:lvl>
     <w:lvl w:ilvl="2" w:tplc="503CA3EC">
@@ -2982,7 +3238,7 @@
         <w:ind w:left="2160" w:hanging="360"/>
       </w:pPr>
       <w:rPr>
-        <w:rFonts w:ascii="Wingdings" w:hAnsi="Wingdings" w:hint="default"/>
+        <w:rFonts w:hint="default" w:ascii="Wingdings" w:hAnsi="Wingdings"/>
       </w:rPr>
     </w:lvl>
     <w:lvl w:ilvl="3" w:tplc="2C10E21C">
@@ -2994,7 +3250,7 @@
         <w:ind w:left="2880" w:hanging="360"/>
       </w:pPr>
       <w:rPr>
-        <w:rFonts w:ascii="Symbol" w:hAnsi="Symbol" w:hint="default"/>
+        <w:rFonts w:hint="default" w:ascii="Symbol" w:hAnsi="Symbol"/>
       </w:rPr>
     </w:lvl>
     <w:lvl w:ilvl="4" w:tplc="E68AC510">
@@ -3006,7 +3262,7 @@
         <w:ind w:left="3600" w:hanging="360"/>
       </w:pPr>
       <w:rPr>
-        <w:rFonts w:ascii="Courier New" w:hAnsi="Courier New" w:hint="default"/>
+        <w:rFonts w:hint="default" w:ascii="Courier New" w:hAnsi="Courier New"/>
       </w:rPr>
     </w:lvl>
     <w:lvl w:ilvl="5" w:tplc="9C3E8180">
@@ -3018,7 +3274,7 @@
         <w:ind w:left="4320" w:hanging="360"/>
       </w:pPr>
       <w:rPr>
-        <w:rFonts w:ascii="Wingdings" w:hAnsi="Wingdings" w:hint="default"/>
+        <w:rFonts w:hint="default" w:ascii="Wingdings" w:hAnsi="Wingdings"/>
       </w:rPr>
     </w:lvl>
     <w:lvl w:ilvl="6" w:tplc="7CB0FDC0">
@@ -3030,7 +3286,7 @@
         <w:ind w:left="5040" w:hanging="360"/>
       </w:pPr>
       <w:rPr>
-        <w:rFonts w:ascii="Symbol" w:hAnsi="Symbol" w:hint="default"/>
+        <w:rFonts w:hint="default" w:ascii="Symbol" w:hAnsi="Symbol"/>
       </w:rPr>
     </w:lvl>
     <w:lvl w:ilvl="7" w:tplc="3904DBA8">
@@ -3042,7 +3298,7 @@
         <w:ind w:left="5760" w:hanging="360"/>
       </w:pPr>
       <w:rPr>
-        <w:rFonts w:ascii="Courier New" w:hAnsi="Courier New" w:hint="default"/>
+        <w:rFonts w:hint="default" w:ascii="Courier New" w:hAnsi="Courier New"/>
       </w:rPr>
     </w:lvl>
     <w:lvl w:ilvl="8" w:tplc="65AC185E">
@@ -3054,7 +3310,7 @@
         <w:ind w:left="6480" w:hanging="360"/>
       </w:pPr>
       <w:rPr>
-        <w:rFonts w:ascii="Wingdings" w:hAnsi="Wingdings" w:hint="default"/>
+        <w:rFonts w:hint="default" w:ascii="Wingdings" w:hAnsi="Wingdings"/>
       </w:rPr>
     </w:lvl>
   </w:abstractNum>
@@ -3160,7 +3416,7 @@
         <w:ind w:left="720" w:hanging="360"/>
       </w:pPr>
       <w:rPr>
-        <w:rFonts w:ascii="Symbol" w:hAnsi="Symbol" w:hint="default"/>
+        <w:rFonts w:hint="default" w:ascii="Symbol" w:hAnsi="Symbol"/>
         <w:sz w:val="20"/>
       </w:rPr>
     </w:lvl>
@@ -3176,7 +3432,7 @@
         <w:ind w:left="1440" w:hanging="360"/>
       </w:pPr>
       <w:rPr>
-        <w:rFonts w:ascii="Symbol" w:hAnsi="Symbol" w:hint="default"/>
+        <w:rFonts w:hint="default" w:ascii="Symbol" w:hAnsi="Symbol"/>
         <w:sz w:val="20"/>
       </w:rPr>
     </w:lvl>
@@ -3192,7 +3448,7 @@
         <w:ind w:left="2160" w:hanging="360"/>
       </w:pPr>
       <w:rPr>
-        <w:rFonts w:ascii="Symbol" w:hAnsi="Symbol" w:hint="default"/>
+        <w:rFonts w:hint="default" w:ascii="Symbol" w:hAnsi="Symbol"/>
         <w:sz w:val="20"/>
       </w:rPr>
     </w:lvl>
@@ -3208,7 +3464,7 @@
         <w:ind w:left="2880" w:hanging="360"/>
       </w:pPr>
       <w:rPr>
-        <w:rFonts w:ascii="Symbol" w:hAnsi="Symbol" w:hint="default"/>
+        <w:rFonts w:hint="default" w:ascii="Symbol" w:hAnsi="Symbol"/>
         <w:sz w:val="20"/>
       </w:rPr>
     </w:lvl>
@@ -3224,7 +3480,7 @@
         <w:ind w:left="3600" w:hanging="360"/>
       </w:pPr>
       <w:rPr>
-        <w:rFonts w:ascii="Symbol" w:hAnsi="Symbol" w:hint="default"/>
+        <w:rFonts w:hint="default" w:ascii="Symbol" w:hAnsi="Symbol"/>
         <w:sz w:val="20"/>
       </w:rPr>
     </w:lvl>
@@ -3240,7 +3496,7 @@
         <w:ind w:left="4320" w:hanging="360"/>
       </w:pPr>
       <w:rPr>
-        <w:rFonts w:ascii="Symbol" w:hAnsi="Symbol" w:hint="default"/>
+        <w:rFonts w:hint="default" w:ascii="Symbol" w:hAnsi="Symbol"/>
         <w:sz w:val="20"/>
       </w:rPr>
     </w:lvl>
@@ -3256,7 +3512,7 @@
         <w:ind w:left="5040" w:hanging="360"/>
       </w:pPr>
       <w:rPr>
-        <w:rFonts w:ascii="Symbol" w:hAnsi="Symbol" w:hint="default"/>
+        <w:rFonts w:hint="default" w:ascii="Symbol" w:hAnsi="Symbol"/>
         <w:sz w:val="20"/>
       </w:rPr>
     </w:lvl>
@@ -3272,7 +3528,7 @@
         <w:ind w:left="5760" w:hanging="360"/>
       </w:pPr>
       <w:rPr>
-        <w:rFonts w:ascii="Symbol" w:hAnsi="Symbol" w:hint="default"/>
+        <w:rFonts w:hint="default" w:ascii="Symbol" w:hAnsi="Symbol"/>
         <w:sz w:val="20"/>
       </w:rPr>
     </w:lvl>
@@ -3288,7 +3544,7 @@
         <w:ind w:left="6480" w:hanging="360"/>
       </w:pPr>
       <w:rPr>
-        <w:rFonts w:ascii="Symbol" w:hAnsi="Symbol" w:hint="default"/>
+        <w:rFonts w:hint="default" w:ascii="Symbol" w:hAnsi="Symbol"/>
         <w:sz w:val="20"/>
       </w:rPr>
     </w:lvl>
@@ -3309,7 +3565,7 @@
         <w:ind w:left="720" w:hanging="360"/>
       </w:pPr>
       <w:rPr>
-        <w:rFonts w:ascii="Symbol" w:hAnsi="Symbol" w:hint="default"/>
+        <w:rFonts w:hint="default" w:ascii="Symbol" w:hAnsi="Symbol"/>
         <w:sz w:val="20"/>
       </w:rPr>
     </w:lvl>
@@ -3325,7 +3581,7 @@
         <w:ind w:left="1440" w:hanging="360"/>
       </w:pPr>
       <w:rPr>
-        <w:rFonts w:ascii="Symbol" w:hAnsi="Symbol" w:hint="default"/>
+        <w:rFonts w:hint="default" w:ascii="Symbol" w:hAnsi="Symbol"/>
         <w:sz w:val="20"/>
       </w:rPr>
     </w:lvl>
@@ -3341,7 +3597,7 @@
         <w:ind w:left="2160" w:hanging="360"/>
       </w:pPr>
       <w:rPr>
-        <w:rFonts w:ascii="Symbol" w:hAnsi="Symbol" w:hint="default"/>
+        <w:rFonts w:hint="default" w:ascii="Symbol" w:hAnsi="Symbol"/>
         <w:sz w:val="20"/>
       </w:rPr>
     </w:lvl>
@@ -3357,7 +3613,7 @@
         <w:ind w:left="2880" w:hanging="360"/>
       </w:pPr>
       <w:rPr>
-        <w:rFonts w:ascii="Symbol" w:hAnsi="Symbol" w:hint="default"/>
+        <w:rFonts w:hint="default" w:ascii="Symbol" w:hAnsi="Symbol"/>
         <w:sz w:val="20"/>
       </w:rPr>
     </w:lvl>
@@ -3373,7 +3629,7 @@
         <w:ind w:left="3600" w:hanging="360"/>
       </w:pPr>
       <w:rPr>
-        <w:rFonts w:ascii="Symbol" w:hAnsi="Symbol" w:hint="default"/>
+        <w:rFonts w:hint="default" w:ascii="Symbol" w:hAnsi="Symbol"/>
         <w:sz w:val="20"/>
       </w:rPr>
     </w:lvl>
@@ -3389,7 +3645,7 @@
         <w:ind w:left="4320" w:hanging="360"/>
       </w:pPr>
       <w:rPr>
-        <w:rFonts w:ascii="Symbol" w:hAnsi="Symbol" w:hint="default"/>
+        <w:rFonts w:hint="default" w:ascii="Symbol" w:hAnsi="Symbol"/>
         <w:sz w:val="20"/>
       </w:rPr>
     </w:lvl>
@@ -3405,7 +3661,7 @@
         <w:ind w:left="5040" w:hanging="360"/>
       </w:pPr>
       <w:rPr>
-        <w:rFonts w:ascii="Symbol" w:hAnsi="Symbol" w:hint="default"/>
+        <w:rFonts w:hint="default" w:ascii="Symbol" w:hAnsi="Symbol"/>
         <w:sz w:val="20"/>
       </w:rPr>
     </w:lvl>
@@ -3421,7 +3677,7 @@
         <w:ind w:left="5760" w:hanging="360"/>
       </w:pPr>
       <w:rPr>
-        <w:rFonts w:ascii="Symbol" w:hAnsi="Symbol" w:hint="default"/>
+        <w:rFonts w:hint="default" w:ascii="Symbol" w:hAnsi="Symbol"/>
         <w:sz w:val="20"/>
       </w:rPr>
     </w:lvl>
@@ -3437,7 +3693,7 @@
         <w:ind w:left="6480" w:hanging="360"/>
       </w:pPr>
       <w:rPr>
-        <w:rFonts w:ascii="Symbol" w:hAnsi="Symbol" w:hint="default"/>
+        <w:rFonts w:hint="default" w:ascii="Symbol" w:hAnsi="Symbol"/>
         <w:sz w:val="20"/>
       </w:rPr>
     </w:lvl>
@@ -3553,7 +3809,7 @@
         <w:ind w:left="1440" w:hanging="360"/>
       </w:pPr>
       <w:rPr>
-        <w:rFonts w:ascii="Courier New" w:hAnsi="Courier New" w:hint="default"/>
+        <w:rFonts w:hint="default" w:ascii="Courier New" w:hAnsi="Courier New"/>
       </w:rPr>
     </w:lvl>
     <w:lvl w:ilvl="2" w:tplc="6E38DCA2">
@@ -3565,7 +3821,7 @@
         <w:ind w:left="2160" w:hanging="360"/>
       </w:pPr>
       <w:rPr>
-        <w:rFonts w:ascii="Wingdings" w:hAnsi="Wingdings" w:hint="default"/>
+        <w:rFonts w:hint="default" w:ascii="Wingdings" w:hAnsi="Wingdings"/>
       </w:rPr>
     </w:lvl>
     <w:lvl w:ilvl="3" w:tplc="BC8E12A2">
@@ -3577,7 +3833,7 @@
         <w:ind w:left="2880" w:hanging="360"/>
       </w:pPr>
       <w:rPr>
-        <w:rFonts w:ascii="Symbol" w:hAnsi="Symbol" w:hint="default"/>
+        <w:rFonts w:hint="default" w:ascii="Symbol" w:hAnsi="Symbol"/>
       </w:rPr>
     </w:lvl>
     <w:lvl w:ilvl="4" w:tplc="2186530C">
@@ -3589,7 +3845,7 @@
         <w:ind w:left="3600" w:hanging="360"/>
       </w:pPr>
       <w:rPr>
-        <w:rFonts w:ascii="Courier New" w:hAnsi="Courier New" w:hint="default"/>
+        <w:rFonts w:hint="default" w:ascii="Courier New" w:hAnsi="Courier New"/>
       </w:rPr>
     </w:lvl>
     <w:lvl w:ilvl="5" w:tplc="595A600A">
@@ -3601,7 +3857,7 @@
         <w:ind w:left="4320" w:hanging="360"/>
       </w:pPr>
       <w:rPr>
-        <w:rFonts w:ascii="Wingdings" w:hAnsi="Wingdings" w:hint="default"/>
+        <w:rFonts w:hint="default" w:ascii="Wingdings" w:hAnsi="Wingdings"/>
       </w:rPr>
     </w:lvl>
     <w:lvl w:ilvl="6" w:tplc="B4884C48">
@@ -3613,7 +3869,7 @@
         <w:ind w:left="5040" w:hanging="360"/>
       </w:pPr>
       <w:rPr>
-        <w:rFonts w:ascii="Symbol" w:hAnsi="Symbol" w:hint="default"/>
+        <w:rFonts w:hint="default" w:ascii="Symbol" w:hAnsi="Symbol"/>
       </w:rPr>
     </w:lvl>
     <w:lvl w:ilvl="7" w:tplc="D96A477A">
@@ -3625,7 +3881,7 @@
         <w:ind w:left="5760" w:hanging="360"/>
       </w:pPr>
       <w:rPr>
-        <w:rFonts w:ascii="Courier New" w:hAnsi="Courier New" w:hint="default"/>
+        <w:rFonts w:hint="default" w:ascii="Courier New" w:hAnsi="Courier New"/>
       </w:rPr>
     </w:lvl>
     <w:lvl w:ilvl="8" w:tplc="9FB6A2C8">
@@ -3637,7 +3893,7 @@
         <w:ind w:left="6480" w:hanging="360"/>
       </w:pPr>
       <w:rPr>
-        <w:rFonts w:ascii="Wingdings" w:hAnsi="Wingdings" w:hint="default"/>
+        <w:rFonts w:hint="default" w:ascii="Wingdings" w:hAnsi="Wingdings"/>
       </w:rPr>
     </w:lvl>
   </w:abstractNum>
@@ -3654,7 +3910,7 @@
         <w:ind w:left="862" w:hanging="360"/>
       </w:pPr>
       <w:rPr>
-        <w:rFonts w:ascii="Symbol" w:hAnsi="Symbol" w:hint="default"/>
+        <w:rFonts w:hint="default" w:ascii="Symbol" w:hAnsi="Symbol"/>
       </w:rPr>
     </w:lvl>
     <w:lvl w:ilvl="1" w:tplc="0C090003" w:tentative="1">
@@ -3666,7 +3922,7 @@
         <w:ind w:left="1582" w:hanging="360"/>
       </w:pPr>
       <w:rPr>
-        <w:rFonts w:ascii="Courier New" w:hAnsi="Courier New" w:cs="Courier New" w:hint="default"/>
+        <w:rFonts w:hint="default" w:ascii="Courier New" w:hAnsi="Courier New" w:cs="Courier New"/>
       </w:rPr>
     </w:lvl>
     <w:lvl w:ilvl="2" w:tplc="0C090005" w:tentative="1">
@@ -3678,7 +3934,7 @@
         <w:ind w:left="2302" w:hanging="360"/>
       </w:pPr>
       <w:rPr>
-        <w:rFonts w:ascii="Wingdings" w:hAnsi="Wingdings" w:hint="default"/>
+        <w:rFonts w:hint="default" w:ascii="Wingdings" w:hAnsi="Wingdings"/>
       </w:rPr>
     </w:lvl>
     <w:lvl w:ilvl="3" w:tplc="0C090001" w:tentative="1">
@@ -3690,7 +3946,7 @@
         <w:ind w:left="3022" w:hanging="360"/>
       </w:pPr>
       <w:rPr>
-        <w:rFonts w:ascii="Symbol" w:hAnsi="Symbol" w:hint="default"/>
+        <w:rFonts w:hint="default" w:ascii="Symbol" w:hAnsi="Symbol"/>
       </w:rPr>
     </w:lvl>
     <w:lvl w:ilvl="4" w:tplc="0C090003" w:tentative="1">
@@ -3702,7 +3958,7 @@
         <w:ind w:left="3742" w:hanging="360"/>
       </w:pPr>
       <w:rPr>
-        <w:rFonts w:ascii="Courier New" w:hAnsi="Courier New" w:cs="Courier New" w:hint="default"/>
+        <w:rFonts w:hint="default" w:ascii="Courier New" w:hAnsi="Courier New" w:cs="Courier New"/>
       </w:rPr>
     </w:lvl>
     <w:lvl w:ilvl="5" w:tplc="0C090005" w:tentative="1">
@@ -3714,7 +3970,7 @@
         <w:ind w:left="4462" w:hanging="360"/>
       </w:pPr>
       <w:rPr>
-        <w:rFonts w:ascii="Wingdings" w:hAnsi="Wingdings" w:hint="default"/>
+        <w:rFonts w:hint="default" w:ascii="Wingdings" w:hAnsi="Wingdings"/>
       </w:rPr>
     </w:lvl>
     <w:lvl w:ilvl="6" w:tplc="0C090001" w:tentative="1">
@@ -3726,7 +3982,7 @@
         <w:ind w:left="5182" w:hanging="360"/>
       </w:pPr>
       <w:rPr>
-        <w:rFonts w:ascii="Symbol" w:hAnsi="Symbol" w:hint="default"/>
+        <w:rFonts w:hint="default" w:ascii="Symbol" w:hAnsi="Symbol"/>
       </w:rPr>
     </w:lvl>
     <w:lvl w:ilvl="7" w:tplc="0C090003" w:tentative="1">
@@ -3738,7 +3994,7 @@
         <w:ind w:left="5902" w:hanging="360"/>
       </w:pPr>
       <w:rPr>
-        <w:rFonts w:ascii="Courier New" w:hAnsi="Courier New" w:cs="Courier New" w:hint="default"/>
+        <w:rFonts w:hint="default" w:ascii="Courier New" w:hAnsi="Courier New" w:cs="Courier New"/>
       </w:rPr>
     </w:lvl>
     <w:lvl w:ilvl="8" w:tplc="0C090005" w:tentative="1">
@@ -3750,7 +4006,7 @@
         <w:ind w:left="6622" w:hanging="360"/>
       </w:pPr>
       <w:rPr>
-        <w:rFonts w:ascii="Wingdings" w:hAnsi="Wingdings" w:hint="default"/>
+        <w:rFonts w:hint="default" w:ascii="Wingdings" w:hAnsi="Wingdings"/>
       </w:rPr>
     </w:lvl>
   </w:abstractNum>
@@ -3770,7 +4026,7 @@
         <w:ind w:left="720" w:hanging="360"/>
       </w:pPr>
       <w:rPr>
-        <w:rFonts w:ascii="Symbol" w:hAnsi="Symbol" w:hint="default"/>
+        <w:rFonts w:hint="default" w:ascii="Symbol" w:hAnsi="Symbol"/>
         <w:sz w:val="20"/>
       </w:rPr>
     </w:lvl>
@@ -3786,7 +4042,7 @@
         <w:ind w:left="1440" w:hanging="360"/>
       </w:pPr>
       <w:rPr>
-        <w:rFonts w:ascii="Symbol" w:hAnsi="Symbol" w:hint="default"/>
+        <w:rFonts w:hint="default" w:ascii="Symbol" w:hAnsi="Symbol"/>
         <w:sz w:val="20"/>
       </w:rPr>
     </w:lvl>
@@ -3802,7 +4058,7 @@
         <w:ind w:left="2160" w:hanging="360"/>
       </w:pPr>
       <w:rPr>
-        <w:rFonts w:ascii="Symbol" w:hAnsi="Symbol" w:hint="default"/>
+        <w:rFonts w:hint="default" w:ascii="Symbol" w:hAnsi="Symbol"/>
         <w:sz w:val="20"/>
       </w:rPr>
     </w:lvl>
@@ -3818,7 +4074,7 @@
         <w:ind w:left="2880" w:hanging="360"/>
       </w:pPr>
       <w:rPr>
-        <w:rFonts w:ascii="Symbol" w:hAnsi="Symbol" w:hint="default"/>
+        <w:rFonts w:hint="default" w:ascii="Symbol" w:hAnsi="Symbol"/>
         <w:sz w:val="20"/>
       </w:rPr>
     </w:lvl>
@@ -3834,7 +4090,7 @@
         <w:ind w:left="3600" w:hanging="360"/>
       </w:pPr>
       <w:rPr>
-        <w:rFonts w:ascii="Symbol" w:hAnsi="Symbol" w:hint="default"/>
+        <w:rFonts w:hint="default" w:ascii="Symbol" w:hAnsi="Symbol"/>
         <w:sz w:val="20"/>
       </w:rPr>
     </w:lvl>
@@ -3850,7 +4106,7 @@
         <w:ind w:left="4320" w:hanging="360"/>
       </w:pPr>
       <w:rPr>
-        <w:rFonts w:ascii="Symbol" w:hAnsi="Symbol" w:hint="default"/>
+        <w:rFonts w:hint="default" w:ascii="Symbol" w:hAnsi="Symbol"/>
         <w:sz w:val="20"/>
       </w:rPr>
     </w:lvl>
@@ -3866,7 +4122,7 @@
         <w:ind w:left="5040" w:hanging="360"/>
       </w:pPr>
       <w:rPr>
-        <w:rFonts w:ascii="Symbol" w:hAnsi="Symbol" w:hint="default"/>
+        <w:rFonts w:hint="default" w:ascii="Symbol" w:hAnsi="Symbol"/>
         <w:sz w:val="20"/>
       </w:rPr>
     </w:lvl>
@@ -3882,7 +4138,7 @@
         <w:ind w:left="5760" w:hanging="360"/>
       </w:pPr>
       <w:rPr>
-        <w:rFonts w:ascii="Symbol" w:hAnsi="Symbol" w:hint="default"/>
+        <w:rFonts w:hint="default" w:ascii="Symbol" w:hAnsi="Symbol"/>
         <w:sz w:val="20"/>
       </w:rPr>
     </w:lvl>
@@ -3898,7 +4154,7 @@
         <w:ind w:left="6480" w:hanging="360"/>
       </w:pPr>
       <w:rPr>
-        <w:rFonts w:ascii="Symbol" w:hAnsi="Symbol" w:hint="default"/>
+        <w:rFonts w:hint="default" w:ascii="Symbol" w:hAnsi="Symbol"/>
         <w:sz w:val="20"/>
       </w:rPr>
     </w:lvl>
@@ -3919,7 +4175,7 @@
         <w:ind w:left="720" w:hanging="360"/>
       </w:pPr>
       <w:rPr>
-        <w:rFonts w:ascii="Symbol" w:hAnsi="Symbol" w:hint="default"/>
+        <w:rFonts w:hint="default" w:ascii="Symbol" w:hAnsi="Symbol"/>
         <w:sz w:val="20"/>
       </w:rPr>
     </w:lvl>
@@ -3935,7 +4191,7 @@
         <w:ind w:left="1440" w:hanging="360"/>
       </w:pPr>
       <w:rPr>
-        <w:rFonts w:ascii="Symbol" w:hAnsi="Symbol" w:hint="default"/>
+        <w:rFonts w:hint="default" w:ascii="Symbol" w:hAnsi="Symbol"/>
         <w:sz w:val="20"/>
       </w:rPr>
     </w:lvl>
@@ -3951,7 +4207,7 @@
         <w:ind w:left="2160" w:hanging="360"/>
       </w:pPr>
       <w:rPr>
-        <w:rFonts w:ascii="Symbol" w:hAnsi="Symbol" w:hint="default"/>
+        <w:rFonts w:hint="default" w:ascii="Symbol" w:hAnsi="Symbol"/>
         <w:sz w:val="20"/>
       </w:rPr>
     </w:lvl>
@@ -3967,7 +4223,7 @@
         <w:ind w:left="2880" w:hanging="360"/>
       </w:pPr>
       <w:rPr>
-        <w:rFonts w:ascii="Symbol" w:hAnsi="Symbol" w:hint="default"/>
+        <w:rFonts w:hint="default" w:ascii="Symbol" w:hAnsi="Symbol"/>
         <w:sz w:val="20"/>
       </w:rPr>
     </w:lvl>
@@ -3983,7 +4239,7 @@
         <w:ind w:left="3600" w:hanging="360"/>
       </w:pPr>
       <w:rPr>
-        <w:rFonts w:ascii="Symbol" w:hAnsi="Symbol" w:hint="default"/>
+        <w:rFonts w:hint="default" w:ascii="Symbol" w:hAnsi="Symbol"/>
         <w:sz w:val="20"/>
       </w:rPr>
     </w:lvl>
@@ -3999,7 +4255,7 @@
         <w:ind w:left="4320" w:hanging="360"/>
       </w:pPr>
       <w:rPr>
-        <w:rFonts w:ascii="Symbol" w:hAnsi="Symbol" w:hint="default"/>
+        <w:rFonts w:hint="default" w:ascii="Symbol" w:hAnsi="Symbol"/>
         <w:sz w:val="20"/>
       </w:rPr>
     </w:lvl>
@@ -4015,7 +4271,7 @@
         <w:ind w:left="5040" w:hanging="360"/>
       </w:pPr>
       <w:rPr>
-        <w:rFonts w:ascii="Symbol" w:hAnsi="Symbol" w:hint="default"/>
+        <w:rFonts w:hint="default" w:ascii="Symbol" w:hAnsi="Symbol"/>
         <w:sz w:val="20"/>
       </w:rPr>
     </w:lvl>
@@ -4031,7 +4287,7 @@
         <w:ind w:left="5760" w:hanging="360"/>
       </w:pPr>
       <w:rPr>
-        <w:rFonts w:ascii="Symbol" w:hAnsi="Symbol" w:hint="default"/>
+        <w:rFonts w:hint="default" w:ascii="Symbol" w:hAnsi="Symbol"/>
         <w:sz w:val="20"/>
       </w:rPr>
     </w:lvl>
@@ -4047,7 +4303,7 @@
         <w:ind w:left="6480" w:hanging="360"/>
       </w:pPr>
       <w:rPr>
-        <w:rFonts w:ascii="Symbol" w:hAnsi="Symbol" w:hint="default"/>
+        <w:rFonts w:hint="default" w:ascii="Symbol" w:hAnsi="Symbol"/>
         <w:sz w:val="20"/>
       </w:rPr>
     </w:lvl>
@@ -4065,7 +4321,7 @@
         <w:ind w:left="720" w:hanging="360"/>
       </w:pPr>
       <w:rPr>
-        <w:rFonts w:ascii="Symbol" w:hAnsi="Symbol" w:hint="default"/>
+        <w:rFonts w:hint="default" w:ascii="Symbol" w:hAnsi="Symbol"/>
       </w:rPr>
     </w:lvl>
     <w:lvl w:ilvl="1" w:tplc="7F207F4A">
@@ -4077,7 +4333,7 @@
         <w:ind w:left="1440" w:hanging="360"/>
       </w:pPr>
       <w:rPr>
-        <w:rFonts w:ascii="Courier New" w:hAnsi="Courier New" w:hint="default"/>
+        <w:rFonts w:hint="default" w:ascii="Courier New" w:hAnsi="Courier New"/>
       </w:rPr>
     </w:lvl>
     <w:lvl w:ilvl="2" w:tplc="AED237C0">
@@ -4089,7 +4345,7 @@
         <w:ind w:left="2160" w:hanging="360"/>
       </w:pPr>
       <w:rPr>
-        <w:rFonts w:ascii="Wingdings" w:hAnsi="Wingdings" w:hint="default"/>
+        <w:rFonts w:hint="default" w:ascii="Wingdings" w:hAnsi="Wingdings"/>
       </w:rPr>
     </w:lvl>
     <w:lvl w:ilvl="3" w:tplc="0E6ECEC4">
@@ -4101,7 +4357,7 @@
         <w:ind w:left="2880" w:hanging="360"/>
       </w:pPr>
       <w:rPr>
-        <w:rFonts w:ascii="Symbol" w:hAnsi="Symbol" w:hint="default"/>
+        <w:rFonts w:hint="default" w:ascii="Symbol" w:hAnsi="Symbol"/>
       </w:rPr>
     </w:lvl>
     <w:lvl w:ilvl="4" w:tplc="B0F8B15E">
@@ -4113,7 +4369,7 @@
         <w:ind w:left="3600" w:hanging="360"/>
       </w:pPr>
       <w:rPr>
-        <w:rFonts w:ascii="Courier New" w:hAnsi="Courier New" w:hint="default"/>
+        <w:rFonts w:hint="default" w:ascii="Courier New" w:hAnsi="Courier New"/>
       </w:rPr>
     </w:lvl>
     <w:lvl w:ilvl="5" w:tplc="E42AE506">
@@ -4125,7 +4381,7 @@
         <w:ind w:left="4320" w:hanging="360"/>
       </w:pPr>
       <w:rPr>
-        <w:rFonts w:ascii="Wingdings" w:hAnsi="Wingdings" w:hint="default"/>
+        <w:rFonts w:hint="default" w:ascii="Wingdings" w:hAnsi="Wingdings"/>
       </w:rPr>
     </w:lvl>
     <w:lvl w:ilvl="6" w:tplc="D846B460">
@@ -4137,7 +4393,7 @@
         <w:ind w:left="5040" w:hanging="360"/>
       </w:pPr>
       <w:rPr>
-        <w:rFonts w:ascii="Symbol" w:hAnsi="Symbol" w:hint="default"/>
+        <w:rFonts w:hint="default" w:ascii="Symbol" w:hAnsi="Symbol"/>
       </w:rPr>
     </w:lvl>
     <w:lvl w:ilvl="7" w:tplc="3E581AC4">
@@ -4149,7 +4405,7 @@
         <w:ind w:left="5760" w:hanging="360"/>
       </w:pPr>
       <w:rPr>
-        <w:rFonts w:ascii="Courier New" w:hAnsi="Courier New" w:hint="default"/>
+        <w:rFonts w:hint="default" w:ascii="Courier New" w:hAnsi="Courier New"/>
       </w:rPr>
     </w:lvl>
     <w:lvl w:ilvl="8" w:tplc="39E8C85A">
@@ -4161,7 +4417,7 @@
         <w:ind w:left="6480" w:hanging="360"/>
       </w:pPr>
       <w:rPr>
-        <w:rFonts w:ascii="Wingdings" w:hAnsi="Wingdings" w:hint="default"/>
+        <w:rFonts w:hint="default" w:ascii="Wingdings" w:hAnsi="Wingdings"/>
       </w:rPr>
     </w:lvl>
   </w:abstractNum>
@@ -4178,7 +4434,7 @@
         <w:ind w:left="720" w:hanging="360"/>
       </w:pPr>
       <w:rPr>
-        <w:rFonts w:ascii="Symbol" w:hAnsi="Symbol" w:hint="default"/>
+        <w:rFonts w:hint="default" w:ascii="Symbol" w:hAnsi="Symbol"/>
       </w:rPr>
     </w:lvl>
     <w:lvl w:ilvl="1" w:tplc="0C090003" w:tentative="1">
@@ -4190,7 +4446,7 @@
         <w:ind w:left="1440" w:hanging="360"/>
       </w:pPr>
       <w:rPr>
-        <w:rFonts w:ascii="Courier New" w:hAnsi="Courier New" w:cs="Courier New" w:hint="default"/>
+        <w:rFonts w:hint="default" w:ascii="Courier New" w:hAnsi="Courier New" w:cs="Courier New"/>
       </w:rPr>
     </w:lvl>
     <w:lvl w:ilvl="2" w:tplc="0C090005" w:tentative="1">
@@ -4202,7 +4458,7 @@
         <w:ind w:left="2160" w:hanging="360"/>
       </w:pPr>
       <w:rPr>
-        <w:rFonts w:ascii="Wingdings" w:hAnsi="Wingdings" w:hint="default"/>
+        <w:rFonts w:hint="default" w:ascii="Wingdings" w:hAnsi="Wingdings"/>
       </w:rPr>
     </w:lvl>
     <w:lvl w:ilvl="3" w:tplc="0C090001" w:tentative="1">
@@ -4214,7 +4470,7 @@
         <w:ind w:left="2880" w:hanging="360"/>
       </w:pPr>
       <w:rPr>
-        <w:rFonts w:ascii="Symbol" w:hAnsi="Symbol" w:hint="default"/>
+        <w:rFonts w:hint="default" w:ascii="Symbol" w:hAnsi="Symbol"/>
       </w:rPr>
     </w:lvl>
     <w:lvl w:ilvl="4" w:tplc="0C090003" w:tentative="1">
@@ -4226,7 +4482,7 @@
         <w:ind w:left="3600" w:hanging="360"/>
       </w:pPr>
       <w:rPr>
-        <w:rFonts w:ascii="Courier New" w:hAnsi="Courier New" w:cs="Courier New" w:hint="default"/>
+        <w:rFonts w:hint="default" w:ascii="Courier New" w:hAnsi="Courier New" w:cs="Courier New"/>
       </w:rPr>
     </w:lvl>
     <w:lvl w:ilvl="5" w:tplc="0C090005" w:tentative="1">
@@ -4238,7 +4494,7 @@
         <w:ind w:left="4320" w:hanging="360"/>
       </w:pPr>
       <w:rPr>
-        <w:rFonts w:ascii="Wingdings" w:hAnsi="Wingdings" w:hint="default"/>
+        <w:rFonts w:hint="default" w:ascii="Wingdings" w:hAnsi="Wingdings"/>
       </w:rPr>
     </w:lvl>
     <w:lvl w:ilvl="6" w:tplc="0C090001" w:tentative="1">
@@ -4250,7 +4506,7 @@
         <w:ind w:left="5040" w:hanging="360"/>
       </w:pPr>
       <w:rPr>
-        <w:rFonts w:ascii="Symbol" w:hAnsi="Symbol" w:hint="default"/>
+        <w:rFonts w:hint="default" w:ascii="Symbol" w:hAnsi="Symbol"/>
       </w:rPr>
     </w:lvl>
     <w:lvl w:ilvl="7" w:tplc="0C090003" w:tentative="1">
@@ -4262,7 +4518,7 @@
         <w:ind w:left="5760" w:hanging="360"/>
       </w:pPr>
       <w:rPr>
-        <w:rFonts w:ascii="Courier New" w:hAnsi="Courier New" w:cs="Courier New" w:hint="default"/>
+        <w:rFonts w:hint="default" w:ascii="Courier New" w:hAnsi="Courier New" w:cs="Courier New"/>
       </w:rPr>
     </w:lvl>
     <w:lvl w:ilvl="8" w:tplc="0C090005" w:tentative="1">
@@ -4274,7 +4530,7 @@
         <w:ind w:left="6480" w:hanging="360"/>
       </w:pPr>
       <w:rPr>
-        <w:rFonts w:ascii="Wingdings" w:hAnsi="Wingdings" w:hint="default"/>
+        <w:rFonts w:hint="default" w:ascii="Wingdings" w:hAnsi="Wingdings"/>
       </w:rPr>
     </w:lvl>
   </w:abstractNum>
@@ -4291,7 +4547,7 @@
         <w:ind w:left="360" w:hanging="360"/>
       </w:pPr>
       <w:rPr>
-        <w:rFonts w:ascii="Symbol" w:hAnsi="Symbol" w:hint="default"/>
+        <w:rFonts w:hint="default" w:ascii="Symbol" w:hAnsi="Symbol"/>
       </w:rPr>
     </w:lvl>
     <w:lvl w:ilvl="1" w:tplc="8A4C2060">
@@ -4303,7 +4559,7 @@
         <w:ind w:left="1080" w:hanging="360"/>
       </w:pPr>
       <w:rPr>
-        <w:rFonts w:ascii="Courier New" w:hAnsi="Courier New" w:hint="default"/>
+        <w:rFonts w:hint="default" w:ascii="Courier New" w:hAnsi="Courier New"/>
       </w:rPr>
     </w:lvl>
     <w:lvl w:ilvl="2" w:tplc="0C090005" w:tentative="1">
@@ -4315,7 +4571,7 @@
         <w:ind w:left="1800" w:hanging="360"/>
       </w:pPr>
       <w:rPr>
-        <w:rFonts w:ascii="Wingdings" w:hAnsi="Wingdings" w:hint="default"/>
+        <w:rFonts w:hint="default" w:ascii="Wingdings" w:hAnsi="Wingdings"/>
       </w:rPr>
     </w:lvl>
     <w:lvl w:ilvl="3" w:tplc="0C090001" w:tentative="1">
@@ -4327,7 +4583,7 @@
         <w:ind w:left="2520" w:hanging="360"/>
       </w:pPr>
       <w:rPr>
-        <w:rFonts w:ascii="Symbol" w:hAnsi="Symbol" w:hint="default"/>
+        <w:rFonts w:hint="default" w:ascii="Symbol" w:hAnsi="Symbol"/>
       </w:rPr>
     </w:lvl>
     <w:lvl w:ilvl="4" w:tplc="0C090003" w:tentative="1">
@@ -4339,7 +4595,7 @@
         <w:ind w:left="3240" w:hanging="360"/>
       </w:pPr>
       <w:rPr>
-        <w:rFonts w:ascii="Courier New" w:hAnsi="Courier New" w:cs="Courier New" w:hint="default"/>
+        <w:rFonts w:hint="default" w:ascii="Courier New" w:hAnsi="Courier New" w:cs="Courier New"/>
       </w:rPr>
     </w:lvl>
     <w:lvl w:ilvl="5" w:tplc="0C090005" w:tentative="1">
@@ -4351,7 +4607,7 @@
         <w:ind w:left="3960" w:hanging="360"/>
       </w:pPr>
       <w:rPr>
-        <w:rFonts w:ascii="Wingdings" w:hAnsi="Wingdings" w:hint="default"/>
+        <w:rFonts w:hint="default" w:ascii="Wingdings" w:hAnsi="Wingdings"/>
       </w:rPr>
     </w:lvl>
     <w:lvl w:ilvl="6" w:tplc="0C090001" w:tentative="1">
@@ -4363,7 +4619,7 @@
         <w:ind w:left="4680" w:hanging="360"/>
       </w:pPr>
       <w:rPr>
-        <w:rFonts w:ascii="Symbol" w:hAnsi="Symbol" w:hint="default"/>
+        <w:rFonts w:hint="default" w:ascii="Symbol" w:hAnsi="Symbol"/>
       </w:rPr>
     </w:lvl>
     <w:lvl w:ilvl="7" w:tplc="0C090003" w:tentative="1">
@@ -4375,7 +4631,7 @@
         <w:ind w:left="5400" w:hanging="360"/>
       </w:pPr>
       <w:rPr>
-        <w:rFonts w:ascii="Courier New" w:hAnsi="Courier New" w:cs="Courier New" w:hint="default"/>
+        <w:rFonts w:hint="default" w:ascii="Courier New" w:hAnsi="Courier New" w:cs="Courier New"/>
       </w:rPr>
     </w:lvl>
     <w:lvl w:ilvl="8" w:tplc="0C090005" w:tentative="1">
@@ -4387,7 +4643,7 @@
         <w:ind w:left="6120" w:hanging="360"/>
       </w:pPr>
       <w:rPr>
-        <w:rFonts w:ascii="Wingdings" w:hAnsi="Wingdings" w:hint="default"/>
+        <w:rFonts w:hint="default" w:ascii="Wingdings" w:hAnsi="Wingdings"/>
       </w:rPr>
     </w:lvl>
   </w:abstractNum>
@@ -4490,7 +4746,7 @@
         <w:ind w:left="862" w:hanging="360"/>
       </w:pPr>
       <w:rPr>
-        <w:rFonts w:ascii="Symbol" w:hAnsi="Symbol" w:hint="default"/>
+        <w:rFonts w:hint="default" w:ascii="Symbol" w:hAnsi="Symbol"/>
       </w:rPr>
     </w:lvl>
     <w:lvl w:ilvl="1" w:tplc="0C090003" w:tentative="1">
@@ -4502,7 +4758,7 @@
         <w:ind w:left="1582" w:hanging="360"/>
       </w:pPr>
       <w:rPr>
-        <w:rFonts w:ascii="Courier New" w:hAnsi="Courier New" w:cs="Courier New" w:hint="default"/>
+        <w:rFonts w:hint="default" w:ascii="Courier New" w:hAnsi="Courier New" w:cs="Courier New"/>
       </w:rPr>
     </w:lvl>
     <w:lvl w:ilvl="2" w:tplc="0C090005" w:tentative="1">
@@ -4514,7 +4770,7 @@
         <w:ind w:left="2302" w:hanging="360"/>
       </w:pPr>
       <w:rPr>
-        <w:rFonts w:ascii="Wingdings" w:hAnsi="Wingdings" w:hint="default"/>
+        <w:rFonts w:hint="default" w:ascii="Wingdings" w:hAnsi="Wingdings"/>
       </w:rPr>
     </w:lvl>
     <w:lvl w:ilvl="3" w:tplc="0C090001" w:tentative="1">
@@ -4526,7 +4782,7 @@
         <w:ind w:left="3022" w:hanging="360"/>
       </w:pPr>
       <w:rPr>
-        <w:rFonts w:ascii="Symbol" w:hAnsi="Symbol" w:hint="default"/>
+        <w:rFonts w:hint="default" w:ascii="Symbol" w:hAnsi="Symbol"/>
       </w:rPr>
     </w:lvl>
     <w:lvl w:ilvl="4" w:tplc="0C090003" w:tentative="1">
@@ -4538,7 +4794,7 @@
         <w:ind w:left="3742" w:hanging="360"/>
       </w:pPr>
       <w:rPr>
-        <w:rFonts w:ascii="Courier New" w:hAnsi="Courier New" w:cs="Courier New" w:hint="default"/>
+        <w:rFonts w:hint="default" w:ascii="Courier New" w:hAnsi="Courier New" w:cs="Courier New"/>
       </w:rPr>
     </w:lvl>
     <w:lvl w:ilvl="5" w:tplc="0C090005" w:tentative="1">
@@ -4550,7 +4806,7 @@
         <w:ind w:left="4462" w:hanging="360"/>
       </w:pPr>
       <w:rPr>
-        <w:rFonts w:ascii="Wingdings" w:hAnsi="Wingdings" w:hint="default"/>
+        <w:rFonts w:hint="default" w:ascii="Wingdings" w:hAnsi="Wingdings"/>
       </w:rPr>
     </w:lvl>
     <w:lvl w:ilvl="6" w:tplc="0C090001" w:tentative="1">
@@ -4562,7 +4818,7 @@
         <w:ind w:left="5182" w:hanging="360"/>
       </w:pPr>
       <w:rPr>
-        <w:rFonts w:ascii="Symbol" w:hAnsi="Symbol" w:hint="default"/>
+        <w:rFonts w:hint="default" w:ascii="Symbol" w:hAnsi="Symbol"/>
       </w:rPr>
     </w:lvl>
     <w:lvl w:ilvl="7" w:tplc="0C090003" w:tentative="1">
@@ -4574,7 +4830,7 @@
         <w:ind w:left="5902" w:hanging="360"/>
       </w:pPr>
       <w:rPr>
-        <w:rFonts w:ascii="Courier New" w:hAnsi="Courier New" w:cs="Courier New" w:hint="default"/>
+        <w:rFonts w:hint="default" w:ascii="Courier New" w:hAnsi="Courier New" w:cs="Courier New"/>
       </w:rPr>
     </w:lvl>
     <w:lvl w:ilvl="8" w:tplc="0C090005" w:tentative="1">
@@ -4586,7 +4842,7 @@
         <w:ind w:left="6622" w:hanging="360"/>
       </w:pPr>
       <w:rPr>
-        <w:rFonts w:ascii="Wingdings" w:hAnsi="Wingdings" w:hint="default"/>
+        <w:rFonts w:hint="default" w:ascii="Wingdings" w:hAnsi="Wingdings"/>
       </w:rPr>
     </w:lvl>
   </w:abstractNum>
@@ -4603,7 +4859,7 @@
         <w:ind w:left="360" w:hanging="360"/>
       </w:pPr>
       <w:rPr>
-        <w:rFonts w:ascii="Symbol" w:hAnsi="Symbol" w:hint="default"/>
+        <w:rFonts w:hint="default" w:ascii="Symbol" w:hAnsi="Symbol"/>
       </w:rPr>
     </w:lvl>
     <w:lvl w:ilvl="1" w:tplc="0C090003" w:tentative="1">
@@ -4615,7 +4871,7 @@
         <w:ind w:left="1080" w:hanging="360"/>
       </w:pPr>
       <w:rPr>
-        <w:rFonts w:ascii="Courier New" w:hAnsi="Courier New" w:cs="Courier New" w:hint="default"/>
+        <w:rFonts w:hint="default" w:ascii="Courier New" w:hAnsi="Courier New" w:cs="Courier New"/>
       </w:rPr>
     </w:lvl>
     <w:lvl w:ilvl="2" w:tplc="0C090005" w:tentative="1">
@@ -4627,7 +4883,7 @@
         <w:ind w:left="1800" w:hanging="360"/>
       </w:pPr>
       <w:rPr>
-        <w:rFonts w:ascii="Wingdings" w:hAnsi="Wingdings" w:hint="default"/>
+        <w:rFonts w:hint="default" w:ascii="Wingdings" w:hAnsi="Wingdings"/>
       </w:rPr>
     </w:lvl>
     <w:lvl w:ilvl="3" w:tplc="0C090001" w:tentative="1">
@@ -4639,7 +4895,7 @@
         <w:ind w:left="2520" w:hanging="360"/>
       </w:pPr>
       <w:rPr>
-        <w:rFonts w:ascii="Symbol" w:hAnsi="Symbol" w:hint="default"/>
+        <w:rFonts w:hint="default" w:ascii="Symbol" w:hAnsi="Symbol"/>
       </w:rPr>
     </w:lvl>
     <w:lvl w:ilvl="4" w:tplc="0C090003" w:tentative="1">
@@ -4651,7 +4907,7 @@
         <w:ind w:left="3240" w:hanging="360"/>
       </w:pPr>
       <w:rPr>
-        <w:rFonts w:ascii="Courier New" w:hAnsi="Courier New" w:cs="Courier New" w:hint="default"/>
+        <w:rFonts w:hint="default" w:ascii="Courier New" w:hAnsi="Courier New" w:cs="Courier New"/>
       </w:rPr>
     </w:lvl>
     <w:lvl w:ilvl="5" w:tplc="0C090005" w:tentative="1">
@@ -4663,7 +4919,7 @@
         <w:ind w:left="3960" w:hanging="360"/>
       </w:pPr>
       <w:rPr>
-        <w:rFonts w:ascii="Wingdings" w:hAnsi="Wingdings" w:hint="default"/>
+        <w:rFonts w:hint="default" w:ascii="Wingdings" w:hAnsi="Wingdings"/>
       </w:rPr>
     </w:lvl>
     <w:lvl w:ilvl="6" w:tplc="0C090001" w:tentative="1">
@@ -4675,7 +4931,7 @@
         <w:ind w:left="4680" w:hanging="360"/>
       </w:pPr>
       <w:rPr>
-        <w:rFonts w:ascii="Symbol" w:hAnsi="Symbol" w:hint="default"/>
+        <w:rFonts w:hint="default" w:ascii="Symbol" w:hAnsi="Symbol"/>
       </w:rPr>
     </w:lvl>
     <w:lvl w:ilvl="7" w:tplc="0C090003" w:tentative="1">
@@ -4687,7 +4943,7 @@
         <w:ind w:left="5400" w:hanging="360"/>
       </w:pPr>
       <w:rPr>
-        <w:rFonts w:ascii="Courier New" w:hAnsi="Courier New" w:cs="Courier New" w:hint="default"/>
+        <w:rFonts w:hint="default" w:ascii="Courier New" w:hAnsi="Courier New" w:cs="Courier New"/>
       </w:rPr>
     </w:lvl>
     <w:lvl w:ilvl="8" w:tplc="0C090005" w:tentative="1">
@@ -4699,7 +4955,7 @@
         <w:ind w:left="6120" w:hanging="360"/>
       </w:pPr>
       <w:rPr>
-        <w:rFonts w:ascii="Wingdings" w:hAnsi="Wingdings" w:hint="default"/>
+        <w:rFonts w:hint="default" w:ascii="Wingdings" w:hAnsi="Wingdings"/>
       </w:rPr>
     </w:lvl>
   </w:abstractNum>
@@ -4716,7 +4972,7 @@
         <w:ind w:left="720" w:hanging="360"/>
       </w:pPr>
       <w:rPr>
-        <w:rFonts w:ascii="Symbol" w:hAnsi="Symbol" w:hint="default"/>
+        <w:rFonts w:hint="default" w:ascii="Symbol" w:hAnsi="Symbol"/>
       </w:rPr>
     </w:lvl>
     <w:lvl w:ilvl="1" w:tplc="0C090003" w:tentative="1">
@@ -4728,7 +4984,7 @@
         <w:ind w:left="1440" w:hanging="360"/>
       </w:pPr>
       <w:rPr>
-        <w:rFonts w:ascii="Courier New" w:hAnsi="Courier New" w:cs="Courier New" w:hint="default"/>
+        <w:rFonts w:hint="default" w:ascii="Courier New" w:hAnsi="Courier New" w:cs="Courier New"/>
       </w:rPr>
     </w:lvl>
     <w:lvl w:ilvl="2" w:tplc="0C090005" w:tentative="1">
@@ -4740,7 +4996,7 @@
         <w:ind w:left="2160" w:hanging="360"/>
       </w:pPr>
       <w:rPr>
-        <w:rFonts w:ascii="Wingdings" w:hAnsi="Wingdings" w:hint="default"/>
+        <w:rFonts w:hint="default" w:ascii="Wingdings" w:hAnsi="Wingdings"/>
       </w:rPr>
     </w:lvl>
     <w:lvl w:ilvl="3" w:tplc="0C090001" w:tentative="1">
@@ -4752,7 +5008,7 @@
         <w:ind w:left="2880" w:hanging="360"/>
       </w:pPr>
       <w:rPr>
-        <w:rFonts w:ascii="Symbol" w:hAnsi="Symbol" w:hint="default"/>
+        <w:rFonts w:hint="default" w:ascii="Symbol" w:hAnsi="Symbol"/>
       </w:rPr>
     </w:lvl>
     <w:lvl w:ilvl="4" w:tplc="0C090003" w:tentative="1">
@@ -4764,7 +5020,7 @@
         <w:ind w:left="3600" w:hanging="360"/>
       </w:pPr>
       <w:rPr>
-        <w:rFonts w:ascii="Courier New" w:hAnsi="Courier New" w:cs="Courier New" w:hint="default"/>
+        <w:rFonts w:hint="default" w:ascii="Courier New" w:hAnsi="Courier New" w:cs="Courier New"/>
       </w:rPr>
     </w:lvl>
     <w:lvl w:ilvl="5" w:tplc="0C090005" w:tentative="1">
@@ -4776,7 +5032,7 @@
         <w:ind w:left="4320" w:hanging="360"/>
       </w:pPr>
       <w:rPr>
-        <w:rFonts w:ascii="Wingdings" w:hAnsi="Wingdings" w:hint="default"/>
+        <w:rFonts w:hint="default" w:ascii="Wingdings" w:hAnsi="Wingdings"/>
       </w:rPr>
     </w:lvl>
     <w:lvl w:ilvl="6" w:tplc="0C090001" w:tentative="1">
@@ -4788,7 +5044,7 @@
         <w:ind w:left="5040" w:hanging="360"/>
       </w:pPr>
       <w:rPr>
-        <w:rFonts w:ascii="Symbol" w:hAnsi="Symbol" w:hint="default"/>
+        <w:rFonts w:hint="default" w:ascii="Symbol" w:hAnsi="Symbol"/>
       </w:rPr>
     </w:lvl>
     <w:lvl w:ilvl="7" w:tplc="0C090003" w:tentative="1">
@@ -4800,7 +5056,7 @@
         <w:ind w:left="5760" w:hanging="360"/>
       </w:pPr>
       <w:rPr>
-        <w:rFonts w:ascii="Courier New" w:hAnsi="Courier New" w:cs="Courier New" w:hint="default"/>
+        <w:rFonts w:hint="default" w:ascii="Courier New" w:hAnsi="Courier New" w:cs="Courier New"/>
       </w:rPr>
     </w:lvl>
     <w:lvl w:ilvl="8" w:tplc="0C090005" w:tentative="1">
@@ -4812,7 +5068,7 @@
         <w:ind w:left="6480" w:hanging="360"/>
       </w:pPr>
       <w:rPr>
-        <w:rFonts w:ascii="Wingdings" w:hAnsi="Wingdings" w:hint="default"/>
+        <w:rFonts w:hint="default" w:ascii="Wingdings" w:hAnsi="Wingdings"/>
       </w:rPr>
     </w:lvl>
   </w:abstractNum>
@@ -4915,7 +5171,7 @@
         <w:ind w:left="360" w:hanging="360"/>
       </w:pPr>
       <w:rPr>
-        <w:rFonts w:ascii="Symbol" w:hAnsi="Symbol" w:hint="default"/>
+        <w:rFonts w:hint="default" w:ascii="Symbol" w:hAnsi="Symbol"/>
         <w:color w:val="auto"/>
       </w:rPr>
     </w:lvl>
@@ -4928,7 +5184,7 @@
         <w:ind w:left="1080" w:hanging="360"/>
       </w:pPr>
       <w:rPr>
-        <w:rFonts w:ascii="Courier New" w:hAnsi="Courier New" w:cs="Courier New" w:hint="default"/>
+        <w:rFonts w:hint="default" w:ascii="Courier New" w:hAnsi="Courier New" w:cs="Courier New"/>
       </w:rPr>
     </w:lvl>
     <w:lvl w:ilvl="2" w:tplc="0C090005" w:tentative="1">
@@ -4940,7 +5196,7 @@
         <w:ind w:left="1800" w:hanging="360"/>
       </w:pPr>
       <w:rPr>
-        <w:rFonts w:ascii="Wingdings" w:hAnsi="Wingdings" w:hint="default"/>
+        <w:rFonts w:hint="default" w:ascii="Wingdings" w:hAnsi="Wingdings"/>
       </w:rPr>
     </w:lvl>
     <w:lvl w:ilvl="3" w:tplc="0C090001" w:tentative="1">
@@ -4952,7 +5208,7 @@
         <w:ind w:left="2520" w:hanging="360"/>
       </w:pPr>
       <w:rPr>
-        <w:rFonts w:ascii="Symbol" w:hAnsi="Symbol" w:hint="default"/>
+        <w:rFonts w:hint="default" w:ascii="Symbol" w:hAnsi="Symbol"/>
       </w:rPr>
     </w:lvl>
     <w:lvl w:ilvl="4" w:tplc="0C090003" w:tentative="1">
@@ -4964,7 +5220,7 @@
         <w:ind w:left="3240" w:hanging="360"/>
       </w:pPr>
       <w:rPr>
-        <w:rFonts w:ascii="Courier New" w:hAnsi="Courier New" w:cs="Courier New" w:hint="default"/>
+        <w:rFonts w:hint="default" w:ascii="Courier New" w:hAnsi="Courier New" w:cs="Courier New"/>
       </w:rPr>
     </w:lvl>
     <w:lvl w:ilvl="5" w:tplc="0C090005" w:tentative="1">
@@ -4976,7 +5232,7 @@
         <w:ind w:left="3960" w:hanging="360"/>
       </w:pPr>
       <w:rPr>
-        <w:rFonts w:ascii="Wingdings" w:hAnsi="Wingdings" w:hint="default"/>
+        <w:rFonts w:hint="default" w:ascii="Wingdings" w:hAnsi="Wingdings"/>
       </w:rPr>
     </w:lvl>
     <w:lvl w:ilvl="6" w:tplc="0C090001" w:tentative="1">
@@ -4988,7 +5244,7 @@
         <w:ind w:left="4680" w:hanging="360"/>
       </w:pPr>
       <w:rPr>
-        <w:rFonts w:ascii="Symbol" w:hAnsi="Symbol" w:hint="default"/>
+        <w:rFonts w:hint="default" w:ascii="Symbol" w:hAnsi="Symbol"/>
       </w:rPr>
     </w:lvl>
     <w:lvl w:ilvl="7" w:tplc="0C090003" w:tentative="1">
@@ -5000,7 +5256,7 @@
         <w:ind w:left="5400" w:hanging="360"/>
       </w:pPr>
       <w:rPr>
-        <w:rFonts w:ascii="Courier New" w:hAnsi="Courier New" w:cs="Courier New" w:hint="default"/>
+        <w:rFonts w:hint="default" w:ascii="Courier New" w:hAnsi="Courier New" w:cs="Courier New"/>
       </w:rPr>
     </w:lvl>
     <w:lvl w:ilvl="8" w:tplc="0C090005" w:tentative="1">
@@ -5012,7 +5268,7 @@
         <w:ind w:left="6120" w:hanging="360"/>
       </w:pPr>
       <w:rPr>
-        <w:rFonts w:ascii="Wingdings" w:hAnsi="Wingdings" w:hint="default"/>
+        <w:rFonts w:hint="default" w:ascii="Wingdings" w:hAnsi="Wingdings"/>
       </w:rPr>
     </w:lvl>
   </w:abstractNum>
@@ -5029,7 +5285,7 @@
         <w:ind w:left="720" w:hanging="360"/>
       </w:pPr>
       <w:rPr>
-        <w:rFonts w:ascii="Symbol" w:hAnsi="Symbol" w:hint="default"/>
+        <w:rFonts w:hint="default" w:ascii="Symbol" w:hAnsi="Symbol"/>
       </w:rPr>
     </w:lvl>
     <w:lvl w:ilvl="1" w:tplc="0C090003" w:tentative="1">
@@ -5041,7 +5297,7 @@
         <w:ind w:left="1440" w:hanging="360"/>
       </w:pPr>
       <w:rPr>
-        <w:rFonts w:ascii="Courier New" w:hAnsi="Courier New" w:cs="Courier New" w:hint="default"/>
+        <w:rFonts w:hint="default" w:ascii="Courier New" w:hAnsi="Courier New" w:cs="Courier New"/>
       </w:rPr>
     </w:lvl>
     <w:lvl w:ilvl="2" w:tplc="0C090005" w:tentative="1">
@@ -5053,7 +5309,7 @@
         <w:ind w:left="2160" w:hanging="360"/>
       </w:pPr>
       <w:rPr>
-        <w:rFonts w:ascii="Wingdings" w:hAnsi="Wingdings" w:hint="default"/>
+        <w:rFonts w:hint="default" w:ascii="Wingdings" w:hAnsi="Wingdings"/>
       </w:rPr>
     </w:lvl>
     <w:lvl w:ilvl="3" w:tplc="0C090001" w:tentative="1">
@@ -5065,7 +5321,7 @@
         <w:ind w:left="2880" w:hanging="360"/>
       </w:pPr>
       <w:rPr>
-        <w:rFonts w:ascii="Symbol" w:hAnsi="Symbol" w:hint="default"/>
+        <w:rFonts w:hint="default" w:ascii="Symbol" w:hAnsi="Symbol"/>
       </w:rPr>
     </w:lvl>
     <w:lvl w:ilvl="4" w:tplc="0C090003" w:tentative="1">
@@ -5077,7 +5333,7 @@
         <w:ind w:left="3600" w:hanging="360"/>
       </w:pPr>
       <w:rPr>
-        <w:rFonts w:ascii="Courier New" w:hAnsi="Courier New" w:cs="Courier New" w:hint="default"/>
+        <w:rFonts w:hint="default" w:ascii="Courier New" w:hAnsi="Courier New" w:cs="Courier New"/>
       </w:rPr>
     </w:lvl>
     <w:lvl w:ilvl="5" w:tplc="0C090005" w:tentative="1">
@@ -5089,7 +5345,7 @@
         <w:ind w:left="4320" w:hanging="360"/>
       </w:pPr>
       <w:rPr>
-        <w:rFonts w:ascii="Wingdings" w:hAnsi="Wingdings" w:hint="default"/>
+        <w:rFonts w:hint="default" w:ascii="Wingdings" w:hAnsi="Wingdings"/>
       </w:rPr>
     </w:lvl>
     <w:lvl w:ilvl="6" w:tplc="0C090001" w:tentative="1">
@@ -5101,7 +5357,7 @@
         <w:ind w:left="5040" w:hanging="360"/>
       </w:pPr>
       <w:rPr>
-        <w:rFonts w:ascii="Symbol" w:hAnsi="Symbol" w:hint="default"/>
+        <w:rFonts w:hint="default" w:ascii="Symbol" w:hAnsi="Symbol"/>
       </w:rPr>
     </w:lvl>
     <w:lvl w:ilvl="7" w:tplc="0C090003" w:tentative="1">
@@ -5113,7 +5369,7 @@
         <w:ind w:left="5760" w:hanging="360"/>
       </w:pPr>
       <w:rPr>
-        <w:rFonts w:ascii="Courier New" w:hAnsi="Courier New" w:cs="Courier New" w:hint="default"/>
+        <w:rFonts w:hint="default" w:ascii="Courier New" w:hAnsi="Courier New" w:cs="Courier New"/>
       </w:rPr>
     </w:lvl>
     <w:lvl w:ilvl="8" w:tplc="0C090005" w:tentative="1">
@@ -5125,7 +5381,7 @@
         <w:ind w:left="6480" w:hanging="360"/>
       </w:pPr>
       <w:rPr>
-        <w:rFonts w:ascii="Wingdings" w:hAnsi="Wingdings" w:hint="default"/>
+        <w:rFonts w:hint="default" w:ascii="Wingdings" w:hAnsi="Wingdings"/>
       </w:rPr>
     </w:lvl>
   </w:abstractNum>
@@ -5145,7 +5401,7 @@
         <w:ind w:left="720" w:hanging="360"/>
       </w:pPr>
       <w:rPr>
-        <w:rFonts w:ascii="Symbol" w:hAnsi="Symbol" w:hint="default"/>
+        <w:rFonts w:hint="default" w:ascii="Symbol" w:hAnsi="Symbol"/>
         <w:sz w:val="20"/>
       </w:rPr>
     </w:lvl>
@@ -5161,7 +5417,7 @@
         <w:ind w:left="1440" w:hanging="360"/>
       </w:pPr>
       <w:rPr>
-        <w:rFonts w:ascii="Symbol" w:hAnsi="Symbol" w:hint="default"/>
+        <w:rFonts w:hint="default" w:ascii="Symbol" w:hAnsi="Symbol"/>
         <w:sz w:val="20"/>
       </w:rPr>
     </w:lvl>
@@ -5177,7 +5433,7 @@
         <w:ind w:left="2160" w:hanging="360"/>
       </w:pPr>
       <w:rPr>
-        <w:rFonts w:ascii="Symbol" w:hAnsi="Symbol" w:hint="default"/>
+        <w:rFonts w:hint="default" w:ascii="Symbol" w:hAnsi="Symbol"/>
         <w:sz w:val="20"/>
       </w:rPr>
     </w:lvl>
@@ -5193,7 +5449,7 @@
         <w:ind w:left="2880" w:hanging="360"/>
       </w:pPr>
       <w:rPr>
-        <w:rFonts w:ascii="Symbol" w:hAnsi="Symbol" w:hint="default"/>
+        <w:rFonts w:hint="default" w:ascii="Symbol" w:hAnsi="Symbol"/>
         <w:sz w:val="20"/>
       </w:rPr>
     </w:lvl>
@@ -5209,7 +5465,7 @@
         <w:ind w:left="3600" w:hanging="360"/>
       </w:pPr>
       <w:rPr>
-        <w:rFonts w:ascii="Symbol" w:hAnsi="Symbol" w:hint="default"/>
+        <w:rFonts w:hint="default" w:ascii="Symbol" w:hAnsi="Symbol"/>
         <w:sz w:val="20"/>
       </w:rPr>
     </w:lvl>
@@ -5225,7 +5481,7 @@
         <w:ind w:left="4320" w:hanging="360"/>
       </w:pPr>
       <w:rPr>
-        <w:rFonts w:ascii="Symbol" w:hAnsi="Symbol" w:hint="default"/>
+        <w:rFonts w:hint="default" w:ascii="Symbol" w:hAnsi="Symbol"/>
         <w:sz w:val="20"/>
       </w:rPr>
     </w:lvl>
@@ -5241,7 +5497,7 @@
         <w:ind w:left="5040" w:hanging="360"/>
       </w:pPr>
       <w:rPr>
-        <w:rFonts w:ascii="Symbol" w:hAnsi="Symbol" w:hint="default"/>
+        <w:rFonts w:hint="default" w:ascii="Symbol" w:hAnsi="Symbol"/>
         <w:sz w:val="20"/>
       </w:rPr>
     </w:lvl>
@@ -5257,7 +5513,7 @@
         <w:ind w:left="5760" w:hanging="360"/>
       </w:pPr>
       <w:rPr>
-        <w:rFonts w:ascii="Symbol" w:hAnsi="Symbol" w:hint="default"/>
+        <w:rFonts w:hint="default" w:ascii="Symbol" w:hAnsi="Symbol"/>
         <w:sz w:val="20"/>
       </w:rPr>
     </w:lvl>
@@ -5273,7 +5529,7 @@
         <w:ind w:left="6480" w:hanging="360"/>
       </w:pPr>
       <w:rPr>
-        <w:rFonts w:ascii="Symbol" w:hAnsi="Symbol" w:hint="default"/>
+        <w:rFonts w:hint="default" w:ascii="Symbol" w:hAnsi="Symbol"/>
         <w:sz w:val="20"/>
       </w:rPr>
     </w:lvl>
@@ -5291,7 +5547,7 @@
         <w:ind w:left="720" w:hanging="360"/>
       </w:pPr>
       <w:rPr>
-        <w:rFonts w:ascii="Symbol" w:hAnsi="Symbol" w:hint="default"/>
+        <w:rFonts w:hint="default" w:ascii="Symbol" w:hAnsi="Symbol"/>
       </w:rPr>
     </w:lvl>
     <w:lvl w:ilvl="1" w:tplc="0C090003" w:tentative="1">
@@ -5303,7 +5559,7 @@
         <w:ind w:left="1440" w:hanging="360"/>
       </w:pPr>
       <w:rPr>
-        <w:rFonts w:ascii="Courier New" w:hAnsi="Courier New" w:cs="Courier New" w:hint="default"/>
+        <w:rFonts w:hint="default" w:ascii="Courier New" w:hAnsi="Courier New" w:cs="Courier New"/>
       </w:rPr>
     </w:lvl>
     <w:lvl w:ilvl="2" w:tplc="0C090005" w:tentative="1">
@@ -5315,7 +5571,7 @@
         <w:ind w:left="2160" w:hanging="360"/>
       </w:pPr>
       <w:rPr>
-        <w:rFonts w:ascii="Wingdings" w:hAnsi="Wingdings" w:hint="default"/>
+        <w:rFonts w:hint="default" w:ascii="Wingdings" w:hAnsi="Wingdings"/>
       </w:rPr>
     </w:lvl>
     <w:lvl w:ilvl="3" w:tplc="0C090001" w:tentative="1">
@@ -5327,7 +5583,7 @@
         <w:ind w:left="2880" w:hanging="360"/>
       </w:pPr>
       <w:rPr>
-        <w:rFonts w:ascii="Symbol" w:hAnsi="Symbol" w:hint="default"/>
+        <w:rFonts w:hint="default" w:ascii="Symbol" w:hAnsi="Symbol"/>
       </w:rPr>
     </w:lvl>
     <w:lvl w:ilvl="4" w:tplc="0C090003" w:tentative="1">
@@ -5339,7 +5595,7 @@
         <w:ind w:left="3600" w:hanging="360"/>
       </w:pPr>
       <w:rPr>
-        <w:rFonts w:ascii="Courier New" w:hAnsi="Courier New" w:cs="Courier New" w:hint="default"/>
+        <w:rFonts w:hint="default" w:ascii="Courier New" w:hAnsi="Courier New" w:cs="Courier New"/>
       </w:rPr>
     </w:lvl>
     <w:lvl w:ilvl="5" w:tplc="0C090005" w:tentative="1">
@@ -5351,7 +5607,7 @@
         <w:ind w:left="4320" w:hanging="360"/>
       </w:pPr>
       <w:rPr>
-        <w:rFonts w:ascii="Wingdings" w:hAnsi="Wingdings" w:hint="default"/>
+        <w:rFonts w:hint="default" w:ascii="Wingdings" w:hAnsi="Wingdings"/>
       </w:rPr>
     </w:lvl>
     <w:lvl w:ilvl="6" w:tplc="0C090001" w:tentative="1">
@@ -5363,7 +5619,7 @@
         <w:ind w:left="5040" w:hanging="360"/>
       </w:pPr>
       <w:rPr>
-        <w:rFonts w:ascii="Symbol" w:hAnsi="Symbol" w:hint="default"/>
+        <w:rFonts w:hint="default" w:ascii="Symbol" w:hAnsi="Symbol"/>
       </w:rPr>
     </w:lvl>
     <w:lvl w:ilvl="7" w:tplc="0C090003" w:tentative="1">
@@ -5375,7 +5631,7 @@
         <w:ind w:left="5760" w:hanging="360"/>
       </w:pPr>
       <w:rPr>
-        <w:rFonts w:ascii="Courier New" w:hAnsi="Courier New" w:cs="Courier New" w:hint="default"/>
+        <w:rFonts w:hint="default" w:ascii="Courier New" w:hAnsi="Courier New" w:cs="Courier New"/>
       </w:rPr>
     </w:lvl>
     <w:lvl w:ilvl="8" w:tplc="0C090005" w:tentative="1">
@@ -5387,7 +5643,7 @@
         <w:ind w:left="6480" w:hanging="360"/>
       </w:pPr>
       <w:rPr>
-        <w:rFonts w:ascii="Wingdings" w:hAnsi="Wingdings" w:hint="default"/>
+        <w:rFonts w:hint="default" w:ascii="Wingdings" w:hAnsi="Wingdings"/>
       </w:rPr>
     </w:lvl>
   </w:abstractNum>
@@ -5404,7 +5660,7 @@
         <w:ind w:left="720" w:hanging="360"/>
       </w:pPr>
       <w:rPr>
-        <w:rFonts w:ascii="Symbol" w:hAnsi="Symbol" w:hint="default"/>
+        <w:rFonts w:hint="default" w:ascii="Symbol" w:hAnsi="Symbol"/>
       </w:rPr>
     </w:lvl>
     <w:lvl w:ilvl="1" w:tplc="36886338">
@@ -5416,7 +5672,7 @@
         <w:ind w:left="1440" w:hanging="360"/>
       </w:pPr>
       <w:rPr>
-        <w:rFonts w:ascii="Courier New" w:hAnsi="Courier New" w:hint="default"/>
+        <w:rFonts w:hint="default" w:ascii="Courier New" w:hAnsi="Courier New"/>
       </w:rPr>
     </w:lvl>
     <w:lvl w:ilvl="2" w:tplc="F58CA9D0">
@@ -5428,7 +5684,7 @@
         <w:ind w:left="2160" w:hanging="360"/>
       </w:pPr>
       <w:rPr>
-        <w:rFonts w:ascii="Wingdings" w:hAnsi="Wingdings" w:hint="default"/>
+        <w:rFonts w:hint="default" w:ascii="Wingdings" w:hAnsi="Wingdings"/>
       </w:rPr>
     </w:lvl>
     <w:lvl w:ilvl="3" w:tplc="2F483ACE">
@@ -5440,7 +5696,7 @@
         <w:ind w:left="2880" w:hanging="360"/>
       </w:pPr>
       <w:rPr>
-        <w:rFonts w:ascii="Symbol" w:hAnsi="Symbol" w:hint="default"/>
+        <w:rFonts w:hint="default" w:ascii="Symbol" w:hAnsi="Symbol"/>
       </w:rPr>
     </w:lvl>
     <w:lvl w:ilvl="4" w:tplc="80AE3AE8">
@@ -5452,7 +5708,7 @@
         <w:ind w:left="3600" w:hanging="360"/>
       </w:pPr>
       <w:rPr>
-        <w:rFonts w:ascii="Courier New" w:hAnsi="Courier New" w:hint="default"/>
+        <w:rFonts w:hint="default" w:ascii="Courier New" w:hAnsi="Courier New"/>
       </w:rPr>
     </w:lvl>
     <w:lvl w:ilvl="5" w:tplc="3686012C">
@@ -5464,7 +5720,7 @@
         <w:ind w:left="4320" w:hanging="360"/>
       </w:pPr>
       <w:rPr>
-        <w:rFonts w:ascii="Wingdings" w:hAnsi="Wingdings" w:hint="default"/>
+        <w:rFonts w:hint="default" w:ascii="Wingdings" w:hAnsi="Wingdings"/>
       </w:rPr>
     </w:lvl>
     <w:lvl w:ilvl="6" w:tplc="681A34B4">
@@ -5476,7 +5732,7 @@
         <w:ind w:left="5040" w:hanging="360"/>
       </w:pPr>
       <w:rPr>
-        <w:rFonts w:ascii="Symbol" w:hAnsi="Symbol" w:hint="default"/>
+        <w:rFonts w:hint="default" w:ascii="Symbol" w:hAnsi="Symbol"/>
       </w:rPr>
     </w:lvl>
     <w:lvl w:ilvl="7" w:tplc="27BA7578">
@@ -5488,7 +5744,7 @@
         <w:ind w:left="5760" w:hanging="360"/>
       </w:pPr>
       <w:rPr>
-        <w:rFonts w:ascii="Courier New" w:hAnsi="Courier New" w:hint="default"/>
+        <w:rFonts w:hint="default" w:ascii="Courier New" w:hAnsi="Courier New"/>
       </w:rPr>
     </w:lvl>
     <w:lvl w:ilvl="8" w:tplc="E54E6E8C">
@@ -5500,7 +5756,7 @@
         <w:ind w:left="6480" w:hanging="360"/>
       </w:pPr>
       <w:rPr>
-        <w:rFonts w:ascii="Wingdings" w:hAnsi="Wingdings" w:hint="default"/>
+        <w:rFonts w:hint="default" w:ascii="Wingdings" w:hAnsi="Wingdings"/>
       </w:rPr>
     </w:lvl>
   </w:abstractNum>
@@ -5517,7 +5773,7 @@
         <w:ind w:left="720" w:hanging="360"/>
       </w:pPr>
       <w:rPr>
-        <w:rFonts w:ascii="Symbol" w:hAnsi="Symbol" w:hint="default"/>
+        <w:rFonts w:hint="default" w:ascii="Symbol" w:hAnsi="Symbol"/>
       </w:rPr>
     </w:lvl>
     <w:lvl w:ilvl="1" w:tplc="0C090003" w:tentative="1">
@@ -5529,7 +5785,7 @@
         <w:ind w:left="1440" w:hanging="360"/>
       </w:pPr>
       <w:rPr>
-        <w:rFonts w:ascii="Courier New" w:hAnsi="Courier New" w:cs="Courier New" w:hint="default"/>
+        <w:rFonts w:hint="default" w:ascii="Courier New" w:hAnsi="Courier New" w:cs="Courier New"/>
       </w:rPr>
     </w:lvl>
     <w:lvl w:ilvl="2" w:tplc="0C090005" w:tentative="1">
@@ -5541,7 +5797,7 @@
         <w:ind w:left="2160" w:hanging="360"/>
       </w:pPr>
       <w:rPr>
-        <w:rFonts w:ascii="Wingdings" w:hAnsi="Wingdings" w:hint="default"/>
+        <w:rFonts w:hint="default" w:ascii="Wingdings" w:hAnsi="Wingdings"/>
       </w:rPr>
     </w:lvl>
     <w:lvl w:ilvl="3" w:tplc="0C090001" w:tentative="1">
@@ -5553,7 +5809,7 @@
         <w:ind w:left="2880" w:hanging="360"/>
       </w:pPr>
       <w:rPr>
-        <w:rFonts w:ascii="Symbol" w:hAnsi="Symbol" w:hint="default"/>
+        <w:rFonts w:hint="default" w:ascii="Symbol" w:hAnsi="Symbol"/>
       </w:rPr>
     </w:lvl>
     <w:lvl w:ilvl="4" w:tplc="0C090003" w:tentative="1">
@@ -5565,7 +5821,7 @@
         <w:ind w:left="3600" w:hanging="360"/>
       </w:pPr>
       <w:rPr>
-        <w:rFonts w:ascii="Courier New" w:hAnsi="Courier New" w:cs="Courier New" w:hint="default"/>
+        <w:rFonts w:hint="default" w:ascii="Courier New" w:hAnsi="Courier New" w:cs="Courier New"/>
       </w:rPr>
     </w:lvl>
     <w:lvl w:ilvl="5" w:tplc="0C090005" w:tentative="1">
@@ -5577,7 +5833,7 @@
         <w:ind w:left="4320" w:hanging="360"/>
       </w:pPr>
       <w:rPr>
-        <w:rFonts w:ascii="Wingdings" w:hAnsi="Wingdings" w:hint="default"/>
+        <w:rFonts w:hint="default" w:ascii="Wingdings" w:hAnsi="Wingdings"/>
       </w:rPr>
     </w:lvl>
     <w:lvl w:ilvl="6" w:tplc="0C090001" w:tentative="1">
@@ -5589,7 +5845,7 @@
         <w:ind w:left="5040" w:hanging="360"/>
       </w:pPr>
       <w:rPr>
-        <w:rFonts w:ascii="Symbol" w:hAnsi="Symbol" w:hint="default"/>
+        <w:rFonts w:hint="default" w:ascii="Symbol" w:hAnsi="Symbol"/>
       </w:rPr>
     </w:lvl>
     <w:lvl w:ilvl="7" w:tplc="0C090003" w:tentative="1">
@@ -5601,7 +5857,7 @@
         <w:ind w:left="5760" w:hanging="360"/>
       </w:pPr>
       <w:rPr>
-        <w:rFonts w:ascii="Courier New" w:hAnsi="Courier New" w:cs="Courier New" w:hint="default"/>
+        <w:rFonts w:hint="default" w:ascii="Courier New" w:hAnsi="Courier New" w:cs="Courier New"/>
       </w:rPr>
     </w:lvl>
     <w:lvl w:ilvl="8" w:tplc="0C090005" w:tentative="1">
@@ -5613,7 +5869,7 @@
         <w:ind w:left="6480" w:hanging="360"/>
       </w:pPr>
       <w:rPr>
-        <w:rFonts w:ascii="Wingdings" w:hAnsi="Wingdings" w:hint="default"/>
+        <w:rFonts w:hint="default" w:ascii="Wingdings" w:hAnsi="Wingdings"/>
       </w:rPr>
     </w:lvl>
   </w:abstractNum>
@@ -5630,7 +5886,7 @@
         <w:ind w:left="360" w:hanging="360"/>
       </w:pPr>
       <w:rPr>
-        <w:rFonts w:ascii="Symbol" w:hAnsi="Symbol" w:hint="default"/>
+        <w:rFonts w:hint="default" w:ascii="Symbol" w:hAnsi="Symbol"/>
       </w:rPr>
     </w:lvl>
     <w:lvl w:ilvl="1" w:tplc="0C090003" w:tentative="1">
@@ -5642,7 +5898,7 @@
         <w:ind w:left="1080" w:hanging="360"/>
       </w:pPr>
       <w:rPr>
-        <w:rFonts w:ascii="Courier New" w:hAnsi="Courier New" w:cs="Courier New" w:hint="default"/>
+        <w:rFonts w:hint="default" w:ascii="Courier New" w:hAnsi="Courier New" w:cs="Courier New"/>
       </w:rPr>
     </w:lvl>
     <w:lvl w:ilvl="2" w:tplc="0C090005" w:tentative="1">
@@ -5654,7 +5910,7 @@
         <w:ind w:left="1800" w:hanging="360"/>
       </w:pPr>
       <w:rPr>
-        <w:rFonts w:ascii="Wingdings" w:hAnsi="Wingdings" w:hint="default"/>
+        <w:rFonts w:hint="default" w:ascii="Wingdings" w:hAnsi="Wingdings"/>
       </w:rPr>
     </w:lvl>
     <w:lvl w:ilvl="3" w:tplc="0C090001" w:tentative="1">
@@ -5666,7 +5922,7 @@
         <w:ind w:left="2520" w:hanging="360"/>
       </w:pPr>
       <w:rPr>
-        <w:rFonts w:ascii="Symbol" w:hAnsi="Symbol" w:hint="default"/>
+        <w:rFonts w:hint="default" w:ascii="Symbol" w:hAnsi="Symbol"/>
       </w:rPr>
     </w:lvl>
     <w:lvl w:ilvl="4" w:tplc="0C090003" w:tentative="1">
@@ -5678,7 +5934,7 @@
         <w:ind w:left="3240" w:hanging="360"/>
       </w:pPr>
       <w:rPr>
-        <w:rFonts w:ascii="Courier New" w:hAnsi="Courier New" w:cs="Courier New" w:hint="default"/>
+        <w:rFonts w:hint="default" w:ascii="Courier New" w:hAnsi="Courier New" w:cs="Courier New"/>
       </w:rPr>
     </w:lvl>
     <w:lvl w:ilvl="5" w:tplc="0C090005" w:tentative="1">
@@ -5690,7 +5946,7 @@
         <w:ind w:left="3960" w:hanging="360"/>
       </w:pPr>
       <w:rPr>
-        <w:rFonts w:ascii="Wingdings" w:hAnsi="Wingdings" w:hint="default"/>
+        <w:rFonts w:hint="default" w:ascii="Wingdings" w:hAnsi="Wingdings"/>
       </w:rPr>
     </w:lvl>
     <w:lvl w:ilvl="6" w:tplc="0C090001" w:tentative="1">
@@ -5702,7 +5958,7 @@
         <w:ind w:left="4680" w:hanging="360"/>
       </w:pPr>
       <w:rPr>
-        <w:rFonts w:ascii="Symbol" w:hAnsi="Symbol" w:hint="default"/>
+        <w:rFonts w:hint="default" w:ascii="Symbol" w:hAnsi="Symbol"/>
       </w:rPr>
     </w:lvl>
     <w:lvl w:ilvl="7" w:tplc="0C090003" w:tentative="1">
@@ -5714,7 +5970,7 @@
         <w:ind w:left="5400" w:hanging="360"/>
       </w:pPr>
       <w:rPr>
-        <w:rFonts w:ascii="Courier New" w:hAnsi="Courier New" w:cs="Courier New" w:hint="default"/>
+        <w:rFonts w:hint="default" w:ascii="Courier New" w:hAnsi="Courier New" w:cs="Courier New"/>
       </w:rPr>
     </w:lvl>
     <w:lvl w:ilvl="8" w:tplc="0C090005" w:tentative="1">
@@ -5726,7 +5982,7 @@
         <w:ind w:left="6120" w:hanging="360"/>
       </w:pPr>
       <w:rPr>
-        <w:rFonts w:ascii="Wingdings" w:hAnsi="Wingdings" w:hint="default"/>
+        <w:rFonts w:hint="default" w:ascii="Wingdings" w:hAnsi="Wingdings"/>
       </w:rPr>
     </w:lvl>
   </w:abstractNum>
@@ -5746,7 +6002,7 @@
         <w:ind w:left="720" w:hanging="360"/>
       </w:pPr>
       <w:rPr>
-        <w:rFonts w:ascii="Symbol" w:hAnsi="Symbol" w:hint="default"/>
+        <w:rFonts w:hint="default" w:ascii="Symbol" w:hAnsi="Symbol"/>
         <w:sz w:val="20"/>
       </w:rPr>
     </w:lvl>
@@ -5762,7 +6018,7 @@
         <w:ind w:left="1440" w:hanging="360"/>
       </w:pPr>
       <w:rPr>
-        <w:rFonts w:ascii="Courier New" w:hAnsi="Courier New" w:hint="default"/>
+        <w:rFonts w:hint="default" w:ascii="Courier New" w:hAnsi="Courier New"/>
         <w:sz w:val="20"/>
       </w:rPr>
     </w:lvl>
@@ -5778,7 +6034,7 @@
         <w:ind w:left="2160" w:hanging="360"/>
       </w:pPr>
       <w:rPr>
-        <w:rFonts w:ascii="Wingdings" w:hAnsi="Wingdings" w:hint="default"/>
+        <w:rFonts w:hint="default" w:ascii="Wingdings" w:hAnsi="Wingdings"/>
         <w:sz w:val="20"/>
       </w:rPr>
     </w:lvl>
@@ -5794,7 +6050,7 @@
         <w:ind w:left="2880" w:hanging="360"/>
       </w:pPr>
       <w:rPr>
-        <w:rFonts w:ascii="Wingdings" w:hAnsi="Wingdings" w:hint="default"/>
+        <w:rFonts w:hint="default" w:ascii="Wingdings" w:hAnsi="Wingdings"/>
         <w:sz w:val="20"/>
       </w:rPr>
     </w:lvl>
@@ -5810,7 +6066,7 @@
         <w:ind w:left="3600" w:hanging="360"/>
       </w:pPr>
       <w:rPr>
-        <w:rFonts w:ascii="Wingdings" w:hAnsi="Wingdings" w:hint="default"/>
+        <w:rFonts w:hint="default" w:ascii="Wingdings" w:hAnsi="Wingdings"/>
         <w:sz w:val="20"/>
       </w:rPr>
     </w:lvl>
@@ -5826,7 +6082,7 @@
         <w:ind w:left="4320" w:hanging="360"/>
       </w:pPr>
       <w:rPr>
-        <w:rFonts w:ascii="Wingdings" w:hAnsi="Wingdings" w:hint="default"/>
+        <w:rFonts w:hint="default" w:ascii="Wingdings" w:hAnsi="Wingdings"/>
         <w:sz w:val="20"/>
       </w:rPr>
     </w:lvl>
@@ -5842,7 +6098,7 @@
         <w:ind w:left="5040" w:hanging="360"/>
       </w:pPr>
       <w:rPr>
-        <w:rFonts w:ascii="Wingdings" w:hAnsi="Wingdings" w:hint="default"/>
+        <w:rFonts w:hint="default" w:ascii="Wingdings" w:hAnsi="Wingdings"/>
         <w:sz w:val="20"/>
       </w:rPr>
     </w:lvl>
@@ -5858,7 +6114,7 @@
         <w:ind w:left="5760" w:hanging="360"/>
       </w:pPr>
       <w:rPr>
-        <w:rFonts w:ascii="Wingdings" w:hAnsi="Wingdings" w:hint="default"/>
+        <w:rFonts w:hint="default" w:ascii="Wingdings" w:hAnsi="Wingdings"/>
         <w:sz w:val="20"/>
       </w:rPr>
     </w:lvl>
@@ -5874,7 +6130,7 @@
         <w:ind w:left="6480" w:hanging="360"/>
       </w:pPr>
       <w:rPr>
-        <w:rFonts w:ascii="Wingdings" w:hAnsi="Wingdings" w:hint="default"/>
+        <w:rFonts w:hint="default" w:ascii="Wingdings" w:hAnsi="Wingdings"/>
         <w:sz w:val="20"/>
       </w:rPr>
     </w:lvl>
@@ -5892,7 +6148,7 @@
         <w:ind w:left="720" w:hanging="360"/>
       </w:pPr>
       <w:rPr>
-        <w:rFonts w:ascii="Symbol" w:hAnsi="Symbol" w:hint="default"/>
+        <w:rFonts w:hint="default" w:ascii="Symbol" w:hAnsi="Symbol"/>
       </w:rPr>
     </w:lvl>
     <w:lvl w:ilvl="1" w:tplc="0C090003" w:tentative="1">
@@ -5904,7 +6160,7 @@
         <w:ind w:left="1440" w:hanging="360"/>
       </w:pPr>
       <w:rPr>
-        <w:rFonts w:ascii="Courier New" w:hAnsi="Courier New" w:cs="Courier New" w:hint="default"/>
+        <w:rFonts w:hint="default" w:ascii="Courier New" w:hAnsi="Courier New" w:cs="Courier New"/>
       </w:rPr>
     </w:lvl>
     <w:lvl w:ilvl="2" w:tplc="0C090005" w:tentative="1">
@@ -5916,7 +6172,7 @@
         <w:ind w:left="2160" w:hanging="360"/>
       </w:pPr>
       <w:rPr>
-        <w:rFonts w:ascii="Wingdings" w:hAnsi="Wingdings" w:hint="default"/>
+        <w:rFonts w:hint="default" w:ascii="Wingdings" w:hAnsi="Wingdings"/>
       </w:rPr>
     </w:lvl>
     <w:lvl w:ilvl="3" w:tplc="0C090001" w:tentative="1">
@@ -5928,7 +6184,7 @@
         <w:ind w:left="2880" w:hanging="360"/>
       </w:pPr>
       <w:rPr>
-        <w:rFonts w:ascii="Symbol" w:hAnsi="Symbol" w:hint="default"/>
+        <w:rFonts w:hint="default" w:ascii="Symbol" w:hAnsi="Symbol"/>
       </w:rPr>
     </w:lvl>
     <w:lvl w:ilvl="4" w:tplc="0C090003" w:tentative="1">
@@ -5940,7 +6196,7 @@
         <w:ind w:left="3600" w:hanging="360"/>
       </w:pPr>
       <w:rPr>
-        <w:rFonts w:ascii="Courier New" w:hAnsi="Courier New" w:cs="Courier New" w:hint="default"/>
+        <w:rFonts w:hint="default" w:ascii="Courier New" w:hAnsi="Courier New" w:cs="Courier New"/>
       </w:rPr>
     </w:lvl>
     <w:lvl w:ilvl="5" w:tplc="0C090005" w:tentative="1">
@@ -5952,7 +6208,7 @@
         <w:ind w:left="4320" w:hanging="360"/>
       </w:pPr>
       <w:rPr>
-        <w:rFonts w:ascii="Wingdings" w:hAnsi="Wingdings" w:hint="default"/>
+        <w:rFonts w:hint="default" w:ascii="Wingdings" w:hAnsi="Wingdings"/>
       </w:rPr>
     </w:lvl>
     <w:lvl w:ilvl="6" w:tplc="0C090001" w:tentative="1">
@@ -5964,7 +6220,7 @@
         <w:ind w:left="5040" w:hanging="360"/>
       </w:pPr>
       <w:rPr>
-        <w:rFonts w:ascii="Symbol" w:hAnsi="Symbol" w:hint="default"/>
+        <w:rFonts w:hint="default" w:ascii="Symbol" w:hAnsi="Symbol"/>
       </w:rPr>
     </w:lvl>
     <w:lvl w:ilvl="7" w:tplc="0C090003" w:tentative="1">
@@ -5976,7 +6232,7 @@
         <w:ind w:left="5760" w:hanging="360"/>
       </w:pPr>
       <w:rPr>
-        <w:rFonts w:ascii="Courier New" w:hAnsi="Courier New" w:cs="Courier New" w:hint="default"/>
+        <w:rFonts w:hint="default" w:ascii="Courier New" w:hAnsi="Courier New" w:cs="Courier New"/>
       </w:rPr>
     </w:lvl>
     <w:lvl w:ilvl="8" w:tplc="0C090005" w:tentative="1">
@@ -5988,7 +6244,7 @@
         <w:ind w:left="6480" w:hanging="360"/>
       </w:pPr>
       <w:rPr>
-        <w:rFonts w:ascii="Wingdings" w:hAnsi="Wingdings" w:hint="default"/>
+        <w:rFonts w:hint="default" w:ascii="Wingdings" w:hAnsi="Wingdings"/>
       </w:rPr>
     </w:lvl>
   </w:abstractNum>
@@ -6115,7 +6371,7 @@
         <w:ind w:left="862" w:hanging="360"/>
       </w:pPr>
       <w:rPr>
-        <w:rFonts w:ascii="Symbol" w:hAnsi="Symbol" w:hint="default"/>
+        <w:rFonts w:hint="default" w:ascii="Symbol" w:hAnsi="Symbol"/>
       </w:rPr>
     </w:lvl>
     <w:lvl w:ilvl="1" w:tplc="0C090003" w:tentative="1">
@@ -6127,7 +6383,7 @@
         <w:ind w:left="1582" w:hanging="360"/>
       </w:pPr>
       <w:rPr>
-        <w:rFonts w:ascii="Courier New" w:hAnsi="Courier New" w:cs="Courier New" w:hint="default"/>
+        <w:rFonts w:hint="default" w:ascii="Courier New" w:hAnsi="Courier New" w:cs="Courier New"/>
       </w:rPr>
     </w:lvl>
     <w:lvl w:ilvl="2" w:tplc="0C090005" w:tentative="1">
@@ -6139,7 +6395,7 @@
         <w:ind w:left="2302" w:hanging="360"/>
       </w:pPr>
       <w:rPr>
-        <w:rFonts w:ascii="Wingdings" w:hAnsi="Wingdings" w:hint="default"/>
+        <w:rFonts w:hint="default" w:ascii="Wingdings" w:hAnsi="Wingdings"/>
       </w:rPr>
     </w:lvl>
     <w:lvl w:ilvl="3" w:tplc="0C090001" w:tentative="1">
@@ -6151,7 +6407,7 @@
         <w:ind w:left="3022" w:hanging="360"/>
       </w:pPr>
       <w:rPr>
-        <w:rFonts w:ascii="Symbol" w:hAnsi="Symbol" w:hint="default"/>
+        <w:rFonts w:hint="default" w:ascii="Symbol" w:hAnsi="Symbol"/>
       </w:rPr>
     </w:lvl>
     <w:lvl w:ilvl="4" w:tplc="0C090003" w:tentative="1">
@@ -6163,7 +6419,7 @@
         <w:ind w:left="3742" w:hanging="360"/>
       </w:pPr>
       <w:rPr>
-        <w:rFonts w:ascii="Courier New" w:hAnsi="Courier New" w:cs="Courier New" w:hint="default"/>
+        <w:rFonts w:hint="default" w:ascii="Courier New" w:hAnsi="Courier New" w:cs="Courier New"/>
       </w:rPr>
     </w:lvl>
     <w:lvl w:ilvl="5" w:tplc="0C090005" w:tentative="1">
@@ -6175,7 +6431,7 @@
         <w:ind w:left="4462" w:hanging="360"/>
       </w:pPr>
       <w:rPr>
-        <w:rFonts w:ascii="Wingdings" w:hAnsi="Wingdings" w:hint="default"/>
+        <w:rFonts w:hint="default" w:ascii="Wingdings" w:hAnsi="Wingdings"/>
       </w:rPr>
     </w:lvl>
     <w:lvl w:ilvl="6" w:tplc="0C090001" w:tentative="1">
@@ -6187,7 +6443,7 @@
         <w:ind w:left="5182" w:hanging="360"/>
       </w:pPr>
       <w:rPr>
-        <w:rFonts w:ascii="Symbol" w:hAnsi="Symbol" w:hint="default"/>
+        <w:rFonts w:hint="default" w:ascii="Symbol" w:hAnsi="Symbol"/>
       </w:rPr>
     </w:lvl>
     <w:lvl w:ilvl="7" w:tplc="0C090003" w:tentative="1">
@@ -6199,7 +6455,7 @@
         <w:ind w:left="5902" w:hanging="360"/>
       </w:pPr>
       <w:rPr>
-        <w:rFonts w:ascii="Courier New" w:hAnsi="Courier New" w:cs="Courier New" w:hint="default"/>
+        <w:rFonts w:hint="default" w:ascii="Courier New" w:hAnsi="Courier New" w:cs="Courier New"/>
       </w:rPr>
     </w:lvl>
     <w:lvl w:ilvl="8" w:tplc="0C090005" w:tentative="1">
@@ -6211,7 +6467,7 @@
         <w:ind w:left="6622" w:hanging="360"/>
       </w:pPr>
       <w:rPr>
-        <w:rFonts w:ascii="Wingdings" w:hAnsi="Wingdings" w:hint="default"/>
+        <w:rFonts w:hint="default" w:ascii="Wingdings" w:hAnsi="Wingdings"/>
       </w:rPr>
     </w:lvl>
   </w:abstractNum>
@@ -6228,7 +6484,7 @@
         <w:ind w:left="720" w:hanging="360"/>
       </w:pPr>
       <w:rPr>
-        <w:rFonts w:ascii="Symbol" w:hAnsi="Symbol" w:hint="default"/>
+        <w:rFonts w:hint="default" w:ascii="Symbol" w:hAnsi="Symbol"/>
       </w:rPr>
     </w:lvl>
     <w:lvl w:ilvl="1" w:tplc="0C090003" w:tentative="1">
@@ -6240,7 +6496,7 @@
         <w:ind w:left="1440" w:hanging="360"/>
       </w:pPr>
       <w:rPr>
-        <w:rFonts w:ascii="Courier New" w:hAnsi="Courier New" w:cs="Courier New" w:hint="default"/>
+        <w:rFonts w:hint="default" w:ascii="Courier New" w:hAnsi="Courier New" w:cs="Courier New"/>
       </w:rPr>
     </w:lvl>
     <w:lvl w:ilvl="2" w:tplc="0C090005" w:tentative="1">
@@ -6252,7 +6508,7 @@
         <w:ind w:left="2160" w:hanging="360"/>
       </w:pPr>
       <w:rPr>
-        <w:rFonts w:ascii="Wingdings" w:hAnsi="Wingdings" w:hint="default"/>
+        <w:rFonts w:hint="default" w:ascii="Wingdings" w:hAnsi="Wingdings"/>
       </w:rPr>
     </w:lvl>
     <w:lvl w:ilvl="3" w:tplc="0C090001" w:tentative="1">
@@ -6264,7 +6520,7 @@
         <w:ind w:left="2880" w:hanging="360"/>
       </w:pPr>
       <w:rPr>
-        <w:rFonts w:ascii="Symbol" w:hAnsi="Symbol" w:hint="default"/>
+        <w:rFonts w:hint="default" w:ascii="Symbol" w:hAnsi="Symbol"/>
       </w:rPr>
     </w:lvl>
     <w:lvl w:ilvl="4" w:tplc="0C090003" w:tentative="1">
@@ -6276,7 +6532,7 @@
         <w:ind w:left="3600" w:hanging="360"/>
       </w:pPr>
       <w:rPr>
-        <w:rFonts w:ascii="Courier New" w:hAnsi="Courier New" w:cs="Courier New" w:hint="default"/>
+        <w:rFonts w:hint="default" w:ascii="Courier New" w:hAnsi="Courier New" w:cs="Courier New"/>
       </w:rPr>
     </w:lvl>
     <w:lvl w:ilvl="5" w:tplc="0C090005" w:tentative="1">
@@ -6288,7 +6544,7 @@
         <w:ind w:left="4320" w:hanging="360"/>
       </w:pPr>
       <w:rPr>
-        <w:rFonts w:ascii="Wingdings" w:hAnsi="Wingdings" w:hint="default"/>
+        <w:rFonts w:hint="default" w:ascii="Wingdings" w:hAnsi="Wingdings"/>
       </w:rPr>
     </w:lvl>
     <w:lvl w:ilvl="6" w:tplc="0C090001" w:tentative="1">
@@ -6300,7 +6556,7 @@
         <w:ind w:left="5040" w:hanging="360"/>
       </w:pPr>
       <w:rPr>
-        <w:rFonts w:ascii="Symbol" w:hAnsi="Symbol" w:hint="default"/>
+        <w:rFonts w:hint="default" w:ascii="Symbol" w:hAnsi="Symbol"/>
       </w:rPr>
     </w:lvl>
     <w:lvl w:ilvl="7" w:tplc="0C090003" w:tentative="1">
@@ -6312,7 +6568,7 @@
         <w:ind w:left="5760" w:hanging="360"/>
       </w:pPr>
       <w:rPr>
-        <w:rFonts w:ascii="Courier New" w:hAnsi="Courier New" w:cs="Courier New" w:hint="default"/>
+        <w:rFonts w:hint="default" w:ascii="Courier New" w:hAnsi="Courier New" w:cs="Courier New"/>
       </w:rPr>
     </w:lvl>
     <w:lvl w:ilvl="8" w:tplc="0C090005" w:tentative="1">
@@ -6324,7 +6580,7 @@
         <w:ind w:left="6480" w:hanging="360"/>
       </w:pPr>
       <w:rPr>
-        <w:rFonts w:ascii="Wingdings" w:hAnsi="Wingdings" w:hint="default"/>
+        <w:rFonts w:hint="default" w:ascii="Wingdings" w:hAnsi="Wingdings"/>
       </w:rPr>
     </w:lvl>
   </w:abstractNum>
@@ -6427,7 +6683,7 @@
         <w:ind w:left="720" w:hanging="360"/>
       </w:pPr>
       <w:rPr>
-        <w:rFonts w:ascii="Symbol" w:hAnsi="Symbol" w:hint="default"/>
+        <w:rFonts w:hint="default" w:ascii="Symbol" w:hAnsi="Symbol"/>
       </w:rPr>
     </w:lvl>
     <w:lvl w:ilvl="1" w:tplc="0C090003" w:tentative="1">
@@ -6439,7 +6695,7 @@
         <w:ind w:left="1440" w:hanging="360"/>
       </w:pPr>
       <w:rPr>
-        <w:rFonts w:ascii="Courier New" w:hAnsi="Courier New" w:cs="Courier New" w:hint="default"/>
+        <w:rFonts w:hint="default" w:ascii="Courier New" w:hAnsi="Courier New" w:cs="Courier New"/>
       </w:rPr>
     </w:lvl>
     <w:lvl w:ilvl="2" w:tplc="0C090005" w:tentative="1">
@@ -6451,7 +6707,7 @@
         <w:ind w:left="2160" w:hanging="360"/>
       </w:pPr>
       <w:rPr>
-        <w:rFonts w:ascii="Wingdings" w:hAnsi="Wingdings" w:hint="default"/>
+        <w:rFonts w:hint="default" w:ascii="Wingdings" w:hAnsi="Wingdings"/>
       </w:rPr>
     </w:lvl>
     <w:lvl w:ilvl="3" w:tplc="0C090001" w:tentative="1">
@@ -6463,7 +6719,7 @@
         <w:ind w:left="2880" w:hanging="360"/>
       </w:pPr>
       <w:rPr>
-        <w:rFonts w:ascii="Symbol" w:hAnsi="Symbol" w:hint="default"/>
+        <w:rFonts w:hint="default" w:ascii="Symbol" w:hAnsi="Symbol"/>
       </w:rPr>
     </w:lvl>
     <w:lvl w:ilvl="4" w:tplc="0C090003" w:tentative="1">
@@ -6475,7 +6731,7 @@
         <w:ind w:left="3600" w:hanging="360"/>
       </w:pPr>
       <w:rPr>
-        <w:rFonts w:ascii="Courier New" w:hAnsi="Courier New" w:cs="Courier New" w:hint="default"/>
+        <w:rFonts w:hint="default" w:ascii="Courier New" w:hAnsi="Courier New" w:cs="Courier New"/>
       </w:rPr>
     </w:lvl>
     <w:lvl w:ilvl="5" w:tplc="0C090005" w:tentative="1">
@@ -6487,7 +6743,7 @@
         <w:ind w:left="4320" w:hanging="360"/>
       </w:pPr>
       <w:rPr>
-        <w:rFonts w:ascii="Wingdings" w:hAnsi="Wingdings" w:hint="default"/>
+        <w:rFonts w:hint="default" w:ascii="Wingdings" w:hAnsi="Wingdings"/>
       </w:rPr>
     </w:lvl>
     <w:lvl w:ilvl="6" w:tplc="0C090001" w:tentative="1">
@@ -6499,7 +6755,7 @@
         <w:ind w:left="5040" w:hanging="360"/>
       </w:pPr>
       <w:rPr>
-        <w:rFonts w:ascii="Symbol" w:hAnsi="Symbol" w:hint="default"/>
+        <w:rFonts w:hint="default" w:ascii="Symbol" w:hAnsi="Symbol"/>
       </w:rPr>
     </w:lvl>
     <w:lvl w:ilvl="7" w:tplc="0C090003" w:tentative="1">
@@ -6511,7 +6767,7 @@
         <w:ind w:left="5760" w:hanging="360"/>
       </w:pPr>
       <w:rPr>
-        <w:rFonts w:ascii="Courier New" w:hAnsi="Courier New" w:cs="Courier New" w:hint="default"/>
+        <w:rFonts w:hint="default" w:ascii="Courier New" w:hAnsi="Courier New" w:cs="Courier New"/>
       </w:rPr>
     </w:lvl>
     <w:lvl w:ilvl="8" w:tplc="0C090005" w:tentative="1">
@@ -6523,7 +6779,7 @@
         <w:ind w:left="6480" w:hanging="360"/>
       </w:pPr>
       <w:rPr>
-        <w:rFonts w:ascii="Wingdings" w:hAnsi="Wingdings" w:hint="default"/>
+        <w:rFonts w:hint="default" w:ascii="Wingdings" w:hAnsi="Wingdings"/>
       </w:rPr>
     </w:lvl>
   </w:abstractNum>
@@ -6540,7 +6796,7 @@
         <w:ind w:left="862" w:hanging="360"/>
       </w:pPr>
       <w:rPr>
-        <w:rFonts w:ascii="Symbol" w:hAnsi="Symbol" w:hint="default"/>
+        <w:rFonts w:hint="default" w:ascii="Symbol" w:hAnsi="Symbol"/>
       </w:rPr>
     </w:lvl>
     <w:lvl w:ilvl="1" w:tplc="0C090003" w:tentative="1">
@@ -6552,7 +6808,7 @@
         <w:ind w:left="1582" w:hanging="360"/>
       </w:pPr>
       <w:rPr>
-        <w:rFonts w:ascii="Courier New" w:hAnsi="Courier New" w:cs="Courier New" w:hint="default"/>
+        <w:rFonts w:hint="default" w:ascii="Courier New" w:hAnsi="Courier New" w:cs="Courier New"/>
       </w:rPr>
     </w:lvl>
     <w:lvl w:ilvl="2" w:tplc="0C090005" w:tentative="1">
@@ -6564,7 +6820,7 @@
         <w:ind w:left="2302" w:hanging="360"/>
       </w:pPr>
       <w:rPr>
-        <w:rFonts w:ascii="Wingdings" w:hAnsi="Wingdings" w:hint="default"/>
+        <w:rFonts w:hint="default" w:ascii="Wingdings" w:hAnsi="Wingdings"/>
       </w:rPr>
     </w:lvl>
     <w:lvl w:ilvl="3" w:tplc="0C090001" w:tentative="1">
@@ -6576,7 +6832,7 @@
         <w:ind w:left="3022" w:hanging="360"/>
       </w:pPr>
       <w:rPr>
-        <w:rFonts w:ascii="Symbol" w:hAnsi="Symbol" w:hint="default"/>
+        <w:rFonts w:hint="default" w:ascii="Symbol" w:hAnsi="Symbol"/>
       </w:rPr>
     </w:lvl>
     <w:lvl w:ilvl="4" w:tplc="0C090003" w:tentative="1">
@@ -6588,7 +6844,7 @@
         <w:ind w:left="3742" w:hanging="360"/>
       </w:pPr>
       <w:rPr>
-        <w:rFonts w:ascii="Courier New" w:hAnsi="Courier New" w:cs="Courier New" w:hint="default"/>
+        <w:rFonts w:hint="default" w:ascii="Courier New" w:hAnsi="Courier New" w:cs="Courier New"/>
       </w:rPr>
     </w:lvl>
     <w:lvl w:ilvl="5" w:tplc="0C090005" w:tentative="1">
@@ -6600,7 +6856,7 @@
         <w:ind w:left="4462" w:hanging="360"/>
       </w:pPr>
       <w:rPr>
-        <w:rFonts w:ascii="Wingdings" w:hAnsi="Wingdings" w:hint="default"/>
+        <w:rFonts w:hint="default" w:ascii="Wingdings" w:hAnsi="Wingdings"/>
       </w:rPr>
     </w:lvl>
     <w:lvl w:ilvl="6" w:tplc="0C090001" w:tentative="1">
@@ -6612,7 +6868,7 @@
         <w:ind w:left="5182" w:hanging="360"/>
       </w:pPr>
       <w:rPr>
-        <w:rFonts w:ascii="Symbol" w:hAnsi="Symbol" w:hint="default"/>
+        <w:rFonts w:hint="default" w:ascii="Symbol" w:hAnsi="Symbol"/>
       </w:rPr>
     </w:lvl>
     <w:lvl w:ilvl="7" w:tplc="0C090003" w:tentative="1">
@@ -6624,7 +6880,7 @@
         <w:ind w:left="5902" w:hanging="360"/>
       </w:pPr>
       <w:rPr>
-        <w:rFonts w:ascii="Courier New" w:hAnsi="Courier New" w:cs="Courier New" w:hint="default"/>
+        <w:rFonts w:hint="default" w:ascii="Courier New" w:hAnsi="Courier New" w:cs="Courier New"/>
       </w:rPr>
     </w:lvl>
     <w:lvl w:ilvl="8" w:tplc="0C090005" w:tentative="1">
@@ -6636,7 +6892,7 @@
         <w:ind w:left="6622" w:hanging="360"/>
       </w:pPr>
       <w:rPr>
-        <w:rFonts w:ascii="Wingdings" w:hAnsi="Wingdings" w:hint="default"/>
+        <w:rFonts w:hint="default" w:ascii="Wingdings" w:hAnsi="Wingdings"/>
       </w:rPr>
     </w:lvl>
   </w:abstractNum>
@@ -6914,7 +7170,7 @@
         <w:ind w:left="720" w:hanging="360"/>
       </w:pPr>
       <w:rPr>
-        <w:rFonts w:ascii="Symbol" w:hAnsi="Symbol" w:hint="default"/>
+        <w:rFonts w:hint="default" w:ascii="Symbol" w:hAnsi="Symbol"/>
       </w:rPr>
     </w:lvl>
     <w:lvl w:ilvl="1" w:tplc="0C090003" w:tentative="1">
@@ -6926,7 +7182,7 @@
         <w:ind w:left="1440" w:hanging="360"/>
       </w:pPr>
       <w:rPr>
-        <w:rFonts w:ascii="Courier New" w:hAnsi="Courier New" w:cs="Courier New" w:hint="default"/>
+        <w:rFonts w:hint="default" w:ascii="Courier New" w:hAnsi="Courier New" w:cs="Courier New"/>
       </w:rPr>
     </w:lvl>
     <w:lvl w:ilvl="2" w:tplc="0C090005" w:tentative="1">
@@ -6938,7 +7194,7 @@
         <w:ind w:left="2160" w:hanging="360"/>
       </w:pPr>
       <w:rPr>
-        <w:rFonts w:ascii="Wingdings" w:hAnsi="Wingdings" w:hint="default"/>
+        <w:rFonts w:hint="default" w:ascii="Wingdings" w:hAnsi="Wingdings"/>
       </w:rPr>
     </w:lvl>
     <w:lvl w:ilvl="3" w:tplc="0C090001" w:tentative="1">
@@ -6950,7 +7206,7 @@
         <w:ind w:left="2880" w:hanging="360"/>
       </w:pPr>
       <w:rPr>
-        <w:rFonts w:ascii="Symbol" w:hAnsi="Symbol" w:hint="default"/>
+        <w:rFonts w:hint="default" w:ascii="Symbol" w:hAnsi="Symbol"/>
       </w:rPr>
     </w:lvl>
     <w:lvl w:ilvl="4" w:tplc="0C090003" w:tentative="1">
@@ -6962,7 +7218,7 @@
         <w:ind w:left="3600" w:hanging="360"/>
       </w:pPr>
       <w:rPr>
-        <w:rFonts w:ascii="Courier New" w:hAnsi="Courier New" w:cs="Courier New" w:hint="default"/>
+        <w:rFonts w:hint="default" w:ascii="Courier New" w:hAnsi="Courier New" w:cs="Courier New"/>
       </w:rPr>
     </w:lvl>
     <w:lvl w:ilvl="5" w:tplc="0C090005" w:tentative="1">
@@ -6974,7 +7230,7 @@
         <w:ind w:left="4320" w:hanging="360"/>
       </w:pPr>
       <w:rPr>
-        <w:rFonts w:ascii="Wingdings" w:hAnsi="Wingdings" w:hint="default"/>
+        <w:rFonts w:hint="default" w:ascii="Wingdings" w:hAnsi="Wingdings"/>
       </w:rPr>
     </w:lvl>
     <w:lvl w:ilvl="6" w:tplc="0C090001" w:tentative="1">
@@ -6986,7 +7242,7 @@
         <w:ind w:left="5040" w:hanging="360"/>
       </w:pPr>
       <w:rPr>
-        <w:rFonts w:ascii="Symbol" w:hAnsi="Symbol" w:hint="default"/>
+        <w:rFonts w:hint="default" w:ascii="Symbol" w:hAnsi="Symbol"/>
       </w:rPr>
     </w:lvl>
     <w:lvl w:ilvl="7" w:tplc="0C090003" w:tentative="1">
@@ -6998,7 +7254,7 @@
         <w:ind w:left="5760" w:hanging="360"/>
       </w:pPr>
       <w:rPr>
-        <w:rFonts w:ascii="Courier New" w:hAnsi="Courier New" w:cs="Courier New" w:hint="default"/>
+        <w:rFonts w:hint="default" w:ascii="Courier New" w:hAnsi="Courier New" w:cs="Courier New"/>
       </w:rPr>
     </w:lvl>
     <w:lvl w:ilvl="8" w:tplc="0C090005" w:tentative="1">
@@ -7010,7 +7266,7 @@
         <w:ind w:left="6480" w:hanging="360"/>
       </w:pPr>
       <w:rPr>
-        <w:rFonts w:ascii="Wingdings" w:hAnsi="Wingdings" w:hint="default"/>
+        <w:rFonts w:hint="default" w:ascii="Wingdings" w:hAnsi="Wingdings"/>
       </w:rPr>
     </w:lvl>
   </w:abstractNum>
@@ -7027,7 +7283,7 @@
         <w:ind w:left="720" w:hanging="360"/>
       </w:pPr>
       <w:rPr>
-        <w:rFonts w:ascii="Courier New" w:hAnsi="Courier New" w:cs="Courier New" w:hint="default"/>
+        <w:rFonts w:hint="default" w:ascii="Courier New" w:hAnsi="Courier New" w:cs="Courier New"/>
       </w:rPr>
     </w:lvl>
     <w:lvl w:ilvl="1" w:tplc="0C090003">
@@ -7039,7 +7295,7 @@
         <w:ind w:left="1440" w:hanging="360"/>
       </w:pPr>
       <w:rPr>
-        <w:rFonts w:ascii="Courier New" w:hAnsi="Courier New" w:cs="Courier New" w:hint="default"/>
+        <w:rFonts w:hint="default" w:ascii="Courier New" w:hAnsi="Courier New" w:cs="Courier New"/>
       </w:rPr>
     </w:lvl>
     <w:lvl w:ilvl="2" w:tplc="0C090005" w:tentative="1">
@@ -7051,7 +7307,7 @@
         <w:ind w:left="2160" w:hanging="360"/>
       </w:pPr>
       <w:rPr>
-        <w:rFonts w:ascii="Wingdings" w:hAnsi="Wingdings" w:hint="default"/>
+        <w:rFonts w:hint="default" w:ascii="Wingdings" w:hAnsi="Wingdings"/>
       </w:rPr>
     </w:lvl>
     <w:lvl w:ilvl="3" w:tplc="0C090001" w:tentative="1">
@@ -7063,7 +7319,7 @@
         <w:ind w:left="2880" w:hanging="360"/>
       </w:pPr>
       <w:rPr>
-        <w:rFonts w:ascii="Symbol" w:hAnsi="Symbol" w:hint="default"/>
+        <w:rFonts w:hint="default" w:ascii="Symbol" w:hAnsi="Symbol"/>
       </w:rPr>
     </w:lvl>
     <w:lvl w:ilvl="4" w:tplc="0C090003" w:tentative="1">
@@ -7075,7 +7331,7 @@
         <w:ind w:left="3600" w:hanging="360"/>
       </w:pPr>
       <w:rPr>
-        <w:rFonts w:ascii="Courier New" w:hAnsi="Courier New" w:cs="Courier New" w:hint="default"/>
+        <w:rFonts w:hint="default" w:ascii="Courier New" w:hAnsi="Courier New" w:cs="Courier New"/>
       </w:rPr>
     </w:lvl>
     <w:lvl w:ilvl="5" w:tplc="0C090005" w:tentative="1">
@@ -7087,7 +7343,7 @@
         <w:ind w:left="4320" w:hanging="360"/>
       </w:pPr>
       <w:rPr>
-        <w:rFonts w:ascii="Wingdings" w:hAnsi="Wingdings" w:hint="default"/>
+        <w:rFonts w:hint="default" w:ascii="Wingdings" w:hAnsi="Wingdings"/>
       </w:rPr>
     </w:lvl>
     <w:lvl w:ilvl="6" w:tplc="0C090001" w:tentative="1">
@@ -7099,7 +7355,7 @@
         <w:ind w:left="5040" w:hanging="360"/>
       </w:pPr>
       <w:rPr>
-        <w:rFonts w:ascii="Symbol" w:hAnsi="Symbol" w:hint="default"/>
+        <w:rFonts w:hint="default" w:ascii="Symbol" w:hAnsi="Symbol"/>
       </w:rPr>
     </w:lvl>
     <w:lvl w:ilvl="7" w:tplc="0C090003" w:tentative="1">
@@ -7111,7 +7367,7 @@
         <w:ind w:left="5760" w:hanging="360"/>
       </w:pPr>
       <w:rPr>
-        <w:rFonts w:ascii="Courier New" w:hAnsi="Courier New" w:cs="Courier New" w:hint="default"/>
+        <w:rFonts w:hint="default" w:ascii="Courier New" w:hAnsi="Courier New" w:cs="Courier New"/>
       </w:rPr>
     </w:lvl>
     <w:lvl w:ilvl="8" w:tplc="0C090005" w:tentative="1">
@@ -7123,7 +7379,7 @@
         <w:ind w:left="6480" w:hanging="360"/>
       </w:pPr>
       <w:rPr>
-        <w:rFonts w:ascii="Wingdings" w:hAnsi="Wingdings" w:hint="default"/>
+        <w:rFonts w:hint="default" w:ascii="Wingdings" w:hAnsi="Wingdings"/>
       </w:rPr>
     </w:lvl>
   </w:abstractNum>
@@ -7140,7 +7396,7 @@
         <w:ind w:left="862" w:hanging="360"/>
       </w:pPr>
       <w:rPr>
-        <w:rFonts w:ascii="Symbol" w:hAnsi="Symbol" w:hint="default"/>
+        <w:rFonts w:hint="default" w:ascii="Symbol" w:hAnsi="Symbol"/>
       </w:rPr>
     </w:lvl>
     <w:lvl w:ilvl="1" w:tplc="0C090003" w:tentative="1">
@@ -7152,7 +7408,7 @@
         <w:ind w:left="1582" w:hanging="360"/>
       </w:pPr>
       <w:rPr>
-        <w:rFonts w:ascii="Courier New" w:hAnsi="Courier New" w:cs="Courier New" w:hint="default"/>
+        <w:rFonts w:hint="default" w:ascii="Courier New" w:hAnsi="Courier New" w:cs="Courier New"/>
       </w:rPr>
     </w:lvl>
     <w:lvl w:ilvl="2" w:tplc="0C090005" w:tentative="1">
@@ -7164,7 +7420,7 @@
         <w:ind w:left="2302" w:hanging="360"/>
       </w:pPr>
       <w:rPr>
-        <w:rFonts w:ascii="Wingdings" w:hAnsi="Wingdings" w:hint="default"/>
+        <w:rFonts w:hint="default" w:ascii="Wingdings" w:hAnsi="Wingdings"/>
       </w:rPr>
     </w:lvl>
     <w:lvl w:ilvl="3" w:tplc="0C090001" w:tentative="1">
@@ -7176,7 +7432,7 @@
         <w:ind w:left="3022" w:hanging="360"/>
       </w:pPr>
       <w:rPr>
-        <w:rFonts w:ascii="Symbol" w:hAnsi="Symbol" w:hint="default"/>
+        <w:rFonts w:hint="default" w:ascii="Symbol" w:hAnsi="Symbol"/>
       </w:rPr>
     </w:lvl>
     <w:lvl w:ilvl="4" w:tplc="0C090003" w:tentative="1">
@@ -7188,7 +7444,7 @@
         <w:ind w:left="3742" w:hanging="360"/>
       </w:pPr>
       <w:rPr>
-        <w:rFonts w:ascii="Courier New" w:hAnsi="Courier New" w:cs="Courier New" w:hint="default"/>
+        <w:rFonts w:hint="default" w:ascii="Courier New" w:hAnsi="Courier New" w:cs="Courier New"/>
       </w:rPr>
     </w:lvl>
     <w:lvl w:ilvl="5" w:tplc="0C090005" w:tentative="1">
@@ -7200,7 +7456,7 @@
         <w:ind w:left="4462" w:hanging="360"/>
       </w:pPr>
       <w:rPr>
-        <w:rFonts w:ascii="Wingdings" w:hAnsi="Wingdings" w:hint="default"/>
+        <w:rFonts w:hint="default" w:ascii="Wingdings" w:hAnsi="Wingdings"/>
       </w:rPr>
     </w:lvl>
     <w:lvl w:ilvl="6" w:tplc="0C090001" w:tentative="1">
@@ -7212,7 +7468,7 @@
         <w:ind w:left="5182" w:hanging="360"/>
       </w:pPr>
       <w:rPr>
-        <w:rFonts w:ascii="Symbol" w:hAnsi="Symbol" w:hint="default"/>
+        <w:rFonts w:hint="default" w:ascii="Symbol" w:hAnsi="Symbol"/>
       </w:rPr>
     </w:lvl>
     <w:lvl w:ilvl="7" w:tplc="0C090003" w:tentative="1">
@@ -7224,7 +7480,7 @@
         <w:ind w:left="5902" w:hanging="360"/>
       </w:pPr>
       <w:rPr>
-        <w:rFonts w:ascii="Courier New" w:hAnsi="Courier New" w:cs="Courier New" w:hint="default"/>
+        <w:rFonts w:hint="default" w:ascii="Courier New" w:hAnsi="Courier New" w:cs="Courier New"/>
       </w:rPr>
     </w:lvl>
     <w:lvl w:ilvl="8" w:tplc="0C090005" w:tentative="1">
@@ -7236,7 +7492,7 @@
         <w:ind w:left="6622" w:hanging="360"/>
       </w:pPr>
       <w:rPr>
-        <w:rFonts w:ascii="Wingdings" w:hAnsi="Wingdings" w:hint="default"/>
+        <w:rFonts w:hint="default" w:ascii="Wingdings" w:hAnsi="Wingdings"/>
       </w:rPr>
     </w:lvl>
   </w:abstractNum>
@@ -7253,7 +7509,7 @@
         <w:ind w:left="360" w:hanging="360"/>
       </w:pPr>
       <w:rPr>
-        <w:rFonts w:ascii="Symbol" w:hAnsi="Symbol" w:hint="default"/>
+        <w:rFonts w:hint="default" w:ascii="Symbol" w:hAnsi="Symbol"/>
       </w:rPr>
     </w:lvl>
     <w:lvl w:ilvl="1" w:tplc="0C090003" w:tentative="1">
@@ -7265,7 +7521,7 @@
         <w:ind w:left="1080" w:hanging="360"/>
       </w:pPr>
       <w:rPr>
-        <w:rFonts w:ascii="Courier New" w:hAnsi="Courier New" w:cs="Courier New" w:hint="default"/>
+        <w:rFonts w:hint="default" w:ascii="Courier New" w:hAnsi="Courier New" w:cs="Courier New"/>
       </w:rPr>
     </w:lvl>
     <w:lvl w:ilvl="2" w:tplc="0C090005" w:tentative="1">
@@ -7277,7 +7533,7 @@
         <w:ind w:left="1800" w:hanging="360"/>
       </w:pPr>
       <w:rPr>
-        <w:rFonts w:ascii="Wingdings" w:hAnsi="Wingdings" w:hint="default"/>
+        <w:rFonts w:hint="default" w:ascii="Wingdings" w:hAnsi="Wingdings"/>
       </w:rPr>
     </w:lvl>
     <w:lvl w:ilvl="3" w:tplc="0C090001" w:tentative="1">
@@ -7289,7 +7545,7 @@
         <w:ind w:left="2520" w:hanging="360"/>
       </w:pPr>
       <w:rPr>
-        <w:rFonts w:ascii="Symbol" w:hAnsi="Symbol" w:hint="default"/>
+        <w:rFonts w:hint="default" w:ascii="Symbol" w:hAnsi="Symbol"/>
       </w:rPr>
     </w:lvl>
     <w:lvl w:ilvl="4" w:tplc="0C090003" w:tentative="1">
@@ -7301,7 +7557,7 @@
         <w:ind w:left="3240" w:hanging="360"/>
       </w:pPr>
       <w:rPr>
-        <w:rFonts w:ascii="Courier New" w:hAnsi="Courier New" w:cs="Courier New" w:hint="default"/>
+        <w:rFonts w:hint="default" w:ascii="Courier New" w:hAnsi="Courier New" w:cs="Courier New"/>
       </w:rPr>
     </w:lvl>
     <w:lvl w:ilvl="5" w:tplc="0C090005" w:tentative="1">
@@ -7313,7 +7569,7 @@
         <w:ind w:left="3960" w:hanging="360"/>
       </w:pPr>
       <w:rPr>
-        <w:rFonts w:ascii="Wingdings" w:hAnsi="Wingdings" w:hint="default"/>
+        <w:rFonts w:hint="default" w:ascii="Wingdings" w:hAnsi="Wingdings"/>
       </w:rPr>
     </w:lvl>
     <w:lvl w:ilvl="6" w:tplc="0C090001" w:tentative="1">
@@ -7325,7 +7581,7 @@
         <w:ind w:left="4680" w:hanging="360"/>
       </w:pPr>
       <w:rPr>
-        <w:rFonts w:ascii="Symbol" w:hAnsi="Symbol" w:hint="default"/>
+        <w:rFonts w:hint="default" w:ascii="Symbol" w:hAnsi="Symbol"/>
       </w:rPr>
     </w:lvl>
     <w:lvl w:ilvl="7" w:tplc="0C090003" w:tentative="1">
@@ -7337,7 +7593,7 @@
         <w:ind w:left="5400" w:hanging="360"/>
       </w:pPr>
       <w:rPr>
-        <w:rFonts w:ascii="Courier New" w:hAnsi="Courier New" w:cs="Courier New" w:hint="default"/>
+        <w:rFonts w:hint="default" w:ascii="Courier New" w:hAnsi="Courier New" w:cs="Courier New"/>
       </w:rPr>
     </w:lvl>
     <w:lvl w:ilvl="8" w:tplc="0C090005" w:tentative="1">
@@ -7349,7 +7605,7 @@
         <w:ind w:left="6120" w:hanging="360"/>
       </w:pPr>
       <w:rPr>
-        <w:rFonts w:ascii="Wingdings" w:hAnsi="Wingdings" w:hint="default"/>
+        <w:rFonts w:hint="default" w:ascii="Wingdings" w:hAnsi="Wingdings"/>
       </w:rPr>
     </w:lvl>
   </w:abstractNum>
@@ -7369,7 +7625,7 @@
         <w:ind w:left="360" w:hanging="360"/>
       </w:pPr>
       <w:rPr>
-        <w:rFonts w:ascii="Symbol" w:hAnsi="Symbol" w:hint="default"/>
+        <w:rFonts w:hint="default" w:ascii="Symbol" w:hAnsi="Symbol"/>
       </w:rPr>
     </w:lvl>
     <w:lvl w:ilvl="1">
@@ -7384,7 +7640,7 @@
         <w:ind w:left="1080" w:hanging="360"/>
       </w:pPr>
       <w:rPr>
-        <w:rFonts w:ascii="Symbol" w:hAnsi="Symbol" w:hint="default"/>
+        <w:rFonts w:hint="default" w:ascii="Symbol" w:hAnsi="Symbol"/>
         <w:sz w:val="20"/>
       </w:rPr>
     </w:lvl>
@@ -7486,7 +7742,7 @@
         <w:ind w:left="720" w:hanging="360"/>
       </w:pPr>
       <w:rPr>
-        <w:rFonts w:ascii="Symbol" w:hAnsi="Symbol" w:hint="default"/>
+        <w:rFonts w:hint="default" w:ascii="Symbol" w:hAnsi="Symbol"/>
       </w:rPr>
     </w:lvl>
     <w:lvl w:ilvl="1" w:tplc="1E3AE5E0">
@@ -7498,7 +7754,7 @@
         <w:ind w:left="1440" w:hanging="360"/>
       </w:pPr>
       <w:rPr>
-        <w:rFonts w:ascii="Courier New" w:hAnsi="Courier New" w:hint="default"/>
+        <w:rFonts w:hint="default" w:ascii="Courier New" w:hAnsi="Courier New"/>
       </w:rPr>
     </w:lvl>
     <w:lvl w:ilvl="2" w:tplc="7D049B10">
@@ -7510,7 +7766,7 @@
         <w:ind w:left="2160" w:hanging="360"/>
       </w:pPr>
       <w:rPr>
-        <w:rFonts w:ascii="Wingdings" w:hAnsi="Wingdings" w:hint="default"/>
+        <w:rFonts w:hint="default" w:ascii="Wingdings" w:hAnsi="Wingdings"/>
       </w:rPr>
     </w:lvl>
     <w:lvl w:ilvl="3" w:tplc="25520214">
@@ -7522,7 +7778,7 @@
         <w:ind w:left="2880" w:hanging="360"/>
       </w:pPr>
       <w:rPr>
-        <w:rFonts w:ascii="Symbol" w:hAnsi="Symbol" w:hint="default"/>
+        <w:rFonts w:hint="default" w:ascii="Symbol" w:hAnsi="Symbol"/>
       </w:rPr>
     </w:lvl>
     <w:lvl w:ilvl="4" w:tplc="072A3D4A">
@@ -7534,7 +7790,7 @@
         <w:ind w:left="3600" w:hanging="360"/>
       </w:pPr>
       <w:rPr>
-        <w:rFonts w:ascii="Courier New" w:hAnsi="Courier New" w:hint="default"/>
+        <w:rFonts w:hint="default" w:ascii="Courier New" w:hAnsi="Courier New"/>
       </w:rPr>
     </w:lvl>
     <w:lvl w:ilvl="5" w:tplc="9CC0117E">
@@ -7546,7 +7802,7 @@
         <w:ind w:left="4320" w:hanging="360"/>
       </w:pPr>
       <w:rPr>
-        <w:rFonts w:ascii="Wingdings" w:hAnsi="Wingdings" w:hint="default"/>
+        <w:rFonts w:hint="default" w:ascii="Wingdings" w:hAnsi="Wingdings"/>
       </w:rPr>
     </w:lvl>
     <w:lvl w:ilvl="6" w:tplc="4CF6DC56">
@@ -7558,7 +7814,7 @@
         <w:ind w:left="5040" w:hanging="360"/>
       </w:pPr>
       <w:rPr>
-        <w:rFonts w:ascii="Symbol" w:hAnsi="Symbol" w:hint="default"/>
+        <w:rFonts w:hint="default" w:ascii="Symbol" w:hAnsi="Symbol"/>
       </w:rPr>
     </w:lvl>
     <w:lvl w:ilvl="7" w:tplc="57B04D60">
@@ -7570,7 +7826,7 @@
         <w:ind w:left="5760" w:hanging="360"/>
       </w:pPr>
       <w:rPr>
-        <w:rFonts w:ascii="Courier New" w:hAnsi="Courier New" w:hint="default"/>
+        <w:rFonts w:hint="default" w:ascii="Courier New" w:hAnsi="Courier New"/>
       </w:rPr>
     </w:lvl>
     <w:lvl w:ilvl="8" w:tplc="C0CCCB4C">
@@ -7582,7 +7838,7 @@
         <w:ind w:left="6480" w:hanging="360"/>
       </w:pPr>
       <w:rPr>
-        <w:rFonts w:ascii="Wingdings" w:hAnsi="Wingdings" w:hint="default"/>
+        <w:rFonts w:hint="default" w:ascii="Wingdings" w:hAnsi="Wingdings"/>
       </w:rPr>
     </w:lvl>
   </w:abstractNum>
@@ -7599,7 +7855,7 @@
         <w:ind w:left="360" w:hanging="360"/>
       </w:pPr>
       <w:rPr>
-        <w:rFonts w:ascii="Symbol" w:hAnsi="Symbol" w:hint="default"/>
+        <w:rFonts w:hint="default" w:ascii="Symbol" w:hAnsi="Symbol"/>
       </w:rPr>
     </w:lvl>
     <w:lvl w:ilvl="1" w:tplc="5F2EC4F0">
@@ -7611,7 +7867,7 @@
         <w:ind w:left="1080" w:hanging="360"/>
       </w:pPr>
       <w:rPr>
-        <w:rFonts w:ascii="Courier New" w:hAnsi="Courier New" w:hint="default"/>
+        <w:rFonts w:hint="default" w:ascii="Courier New" w:hAnsi="Courier New"/>
       </w:rPr>
     </w:lvl>
     <w:lvl w:ilvl="2" w:tplc="CD749908">
@@ -7623,7 +7879,7 @@
         <w:ind w:left="1800" w:hanging="360"/>
       </w:pPr>
       <w:rPr>
-        <w:rFonts w:ascii="Wingdings" w:hAnsi="Wingdings" w:hint="default"/>
+        <w:rFonts w:hint="default" w:ascii="Wingdings" w:hAnsi="Wingdings"/>
       </w:rPr>
     </w:lvl>
     <w:lvl w:ilvl="3" w:tplc="301ADEE2">
@@ -7635,7 +7891,7 @@
         <w:ind w:left="2520" w:hanging="360"/>
       </w:pPr>
       <w:rPr>
-        <w:rFonts w:ascii="Symbol" w:hAnsi="Symbol" w:hint="default"/>
+        <w:rFonts w:hint="default" w:ascii="Symbol" w:hAnsi="Symbol"/>
       </w:rPr>
     </w:lvl>
     <w:lvl w:ilvl="4" w:tplc="FFB6A418">
@@ -7647,7 +7903,7 @@
         <w:ind w:left="3240" w:hanging="360"/>
       </w:pPr>
       <w:rPr>
-        <w:rFonts w:ascii="Courier New" w:hAnsi="Courier New" w:hint="default"/>
+        <w:rFonts w:hint="default" w:ascii="Courier New" w:hAnsi="Courier New"/>
       </w:rPr>
     </w:lvl>
     <w:lvl w:ilvl="5" w:tplc="D19248AE">
@@ -7659,7 +7915,7 @@
         <w:ind w:left="3960" w:hanging="360"/>
       </w:pPr>
       <w:rPr>
-        <w:rFonts w:ascii="Wingdings" w:hAnsi="Wingdings" w:hint="default"/>
+        <w:rFonts w:hint="default" w:ascii="Wingdings" w:hAnsi="Wingdings"/>
       </w:rPr>
     </w:lvl>
     <w:lvl w:ilvl="6" w:tplc="8D0811CE">
@@ -7671,7 +7927,7 @@
         <w:ind w:left="4680" w:hanging="360"/>
       </w:pPr>
       <w:rPr>
-        <w:rFonts w:ascii="Symbol" w:hAnsi="Symbol" w:hint="default"/>
+        <w:rFonts w:hint="default" w:ascii="Symbol" w:hAnsi="Symbol"/>
       </w:rPr>
     </w:lvl>
     <w:lvl w:ilvl="7" w:tplc="8FEA994A">
@@ -7683,7 +7939,7 @@
         <w:ind w:left="5400" w:hanging="360"/>
       </w:pPr>
       <w:rPr>
-        <w:rFonts w:ascii="Courier New" w:hAnsi="Courier New" w:hint="default"/>
+        <w:rFonts w:hint="default" w:ascii="Courier New" w:hAnsi="Courier New"/>
       </w:rPr>
     </w:lvl>
     <w:lvl w:ilvl="8" w:tplc="2050FC2E">
@@ -7695,7 +7951,7 @@
         <w:ind w:left="6120" w:hanging="360"/>
       </w:pPr>
       <w:rPr>
-        <w:rFonts w:ascii="Wingdings" w:hAnsi="Wingdings" w:hint="default"/>
+        <w:rFonts w:hint="default" w:ascii="Wingdings" w:hAnsi="Wingdings"/>
       </w:rPr>
     </w:lvl>
   </w:abstractNum>
@@ -7835,11 +8091,11 @@
 </file>
 
 <file path=word/styles.xml><?xml version="1.0" encoding="utf-8"?>
-<w:styles xmlns:mc="http://schemas.openxmlformats.org/markup-compatibility/2006" xmlns:r="http://schemas.openxmlformats.org/officeDocument/2006/relationships" xmlns:w="http://schemas.openxmlformats.org/wordprocessingml/2006/main" xmlns:w14="http://schemas.microsoft.com/office/word/2010/wordml" xmlns:w15="http://schemas.microsoft.com/office/word/2012/wordml" xmlns:w16cex="http://schemas.microsoft.com/office/word/2018/wordml/cex" xmlns:w16cid="http://schemas.microsoft.com/office/word/2016/wordml/cid" xmlns:w16="http://schemas.microsoft.com/office/word/2018/wordml" xmlns:w16du="http://schemas.microsoft.com/office/word/2023/wordml/word16du" xmlns:w16sdtdh="http://schemas.microsoft.com/office/word/2020/wordml/sdtdatahash" xmlns:w16sdtfl="http://schemas.microsoft.com/office/word/2024/wordml/sdtformatlock" xmlns:w16se="http://schemas.microsoft.com/office/word/2015/wordml/symex" mc:Ignorable="w14 w15 w16se w16cid w16 w16cex w16sdtdh w16sdtfl w16du">
+<w:styles xmlns:wp14="http://schemas.microsoft.com/office/word/2010/wordprocessingDrawing" xmlns:mc="http://schemas.openxmlformats.org/markup-compatibility/2006" xmlns:r="http://schemas.openxmlformats.org/officeDocument/2006/relationships" xmlns:w="http://schemas.openxmlformats.org/wordprocessingml/2006/main" xmlns:w14="http://schemas.microsoft.com/office/word/2010/wordml" xmlns:w15="http://schemas.microsoft.com/office/word/2012/wordml" xmlns:w16cex="http://schemas.microsoft.com/office/word/2018/wordml/cex" xmlns:w16cid="http://schemas.microsoft.com/office/word/2016/wordml/cid" xmlns:w16="http://schemas.microsoft.com/office/word/2018/wordml" xmlns:w16du="http://schemas.microsoft.com/office/word/2023/wordml/word16du" xmlns:w16sdtdh="http://schemas.microsoft.com/office/word/2020/wordml/sdtdatahash" xmlns:w16sdtfl="http://schemas.microsoft.com/office/word/2024/wordml/sdtformatlock" xmlns:w16se="http://schemas.microsoft.com/office/word/2015/wordml/symex" mc:Ignorable="w14 w15 w16se w16cid w16 w16cex w16sdtdh w16sdtfl w16du wp14">
   <w:docDefaults>
     <w:rPrDefault>
       <w:rPr>
-        <w:rFonts w:asciiTheme="minorHAnsi" w:eastAsiaTheme="minorHAnsi" w:hAnsiTheme="minorHAnsi" w:cstheme="minorBidi"/>
+        <w:rFonts w:asciiTheme="minorHAnsi" w:hAnsiTheme="minorHAnsi" w:eastAsiaTheme="minorHAnsi" w:cstheme="minorBidi"/>
         <w:kern w:val="2"/>
         <w:sz w:val="24"/>
         <w:szCs w:val="24"/>
@@ -7856,14 +8112,14 @@
   <w:latentStyles w:defLockedState="0" w:defUIPriority="99" w:defSemiHidden="0" w:defUnhideWhenUsed="0" w:defQFormat="0" w:count="376">
     <w:lsdException w:name="Normal" w:uiPriority="0" w:qFormat="1"/>
     <w:lsdException w:name="heading 1" w:uiPriority="0" w:qFormat="1"/>
-    <w:lsdException w:name="heading 2" w:semiHidden="1" w:uiPriority="9" w:unhideWhenUsed="1" w:qFormat="1"/>
-    <w:lsdException w:name="heading 3" w:semiHidden="1" w:uiPriority="9" w:unhideWhenUsed="1" w:qFormat="1"/>
-    <w:lsdException w:name="heading 4" w:semiHidden="1" w:uiPriority="9" w:unhideWhenUsed="1" w:qFormat="1"/>
-    <w:lsdException w:name="heading 5" w:semiHidden="1" w:uiPriority="9" w:unhideWhenUsed="1" w:qFormat="1"/>
-    <w:lsdException w:name="heading 6" w:semiHidden="1" w:uiPriority="9" w:unhideWhenUsed="1" w:qFormat="1"/>
-    <w:lsdException w:name="heading 7" w:semiHidden="1" w:uiPriority="9" w:unhideWhenUsed="1" w:qFormat="1"/>
-    <w:lsdException w:name="heading 8" w:semiHidden="1" w:uiPriority="9" w:unhideWhenUsed="1" w:qFormat="1"/>
-    <w:lsdException w:name="heading 9" w:semiHidden="1" w:uiPriority="9" w:unhideWhenUsed="1" w:qFormat="1"/>
+    <w:lsdException w:name="heading 2" w:uiPriority="9" w:semiHidden="1" w:unhideWhenUsed="1" w:qFormat="1"/>
+    <w:lsdException w:name="heading 3" w:uiPriority="9" w:semiHidden="1" w:unhideWhenUsed="1" w:qFormat="1"/>
+    <w:lsdException w:name="heading 4" w:uiPriority="9" w:semiHidden="1" w:unhideWhenUsed="1" w:qFormat="1"/>
+    <w:lsdException w:name="heading 5" w:uiPriority="9" w:semiHidden="1" w:unhideWhenUsed="1" w:qFormat="1"/>
+    <w:lsdException w:name="heading 6" w:uiPriority="9" w:semiHidden="1" w:unhideWhenUsed="1" w:qFormat="1"/>
+    <w:lsdException w:name="heading 7" w:uiPriority="9" w:semiHidden="1" w:unhideWhenUsed="1" w:qFormat="1"/>
+    <w:lsdException w:name="heading 8" w:uiPriority="9" w:semiHidden="1" w:unhideWhenUsed="1" w:qFormat="1"/>
+    <w:lsdException w:name="heading 9" w:uiPriority="9" w:semiHidden="1" w:unhideWhenUsed="1" w:qFormat="1"/>
     <w:lsdException w:name="index 1" w:semiHidden="1" w:unhideWhenUsed="1"/>
     <w:lsdException w:name="index 2" w:semiHidden="1" w:unhideWhenUsed="1"/>
     <w:lsdException w:name="index 3" w:semiHidden="1" w:unhideWhenUsed="1"/>
@@ -7873,22 +8129,22 @@
     <w:lsdException w:name="index 7" w:semiHidden="1" w:unhideWhenUsed="1"/>
     <w:lsdException w:name="index 8" w:semiHidden="1" w:unhideWhenUsed="1"/>
     <w:lsdException w:name="index 9" w:semiHidden="1" w:unhideWhenUsed="1"/>
-    <w:lsdException w:name="toc 1" w:semiHidden="1" w:uiPriority="39" w:unhideWhenUsed="1"/>
-    <w:lsdException w:name="toc 2" w:semiHidden="1" w:uiPriority="39" w:unhideWhenUsed="1"/>
-    <w:lsdException w:name="toc 3" w:semiHidden="1" w:uiPriority="39" w:unhideWhenUsed="1"/>
-    <w:lsdException w:name="toc 4" w:semiHidden="1" w:uiPriority="39" w:unhideWhenUsed="1"/>
-    <w:lsdException w:name="toc 5" w:semiHidden="1" w:uiPriority="39" w:unhideWhenUsed="1"/>
-    <w:lsdException w:name="toc 6" w:semiHidden="1" w:uiPriority="39" w:unhideWhenUsed="1"/>
-    <w:lsdException w:name="toc 7" w:semiHidden="1" w:uiPriority="39" w:unhideWhenUsed="1"/>
-    <w:lsdException w:name="toc 8" w:semiHidden="1" w:uiPriority="39" w:unhideWhenUsed="1"/>
-    <w:lsdException w:name="toc 9" w:semiHidden="1" w:uiPriority="39" w:unhideWhenUsed="1"/>
+    <w:lsdException w:name="toc 1" w:uiPriority="39" w:semiHidden="1" w:unhideWhenUsed="1"/>
+    <w:lsdException w:name="toc 2" w:uiPriority="39" w:semiHidden="1" w:unhideWhenUsed="1"/>
+    <w:lsdException w:name="toc 3" w:uiPriority="39" w:semiHidden="1" w:unhideWhenUsed="1"/>
+    <w:lsdException w:name="toc 4" w:uiPriority="39" w:semiHidden="1" w:unhideWhenUsed="1"/>
+    <w:lsdException w:name="toc 5" w:uiPriority="39" w:semiHidden="1" w:unhideWhenUsed="1"/>
+    <w:lsdException w:name="toc 6" w:uiPriority="39" w:semiHidden="1" w:unhideWhenUsed="1"/>
+    <w:lsdException w:name="toc 7" w:uiPriority="39" w:semiHidden="1" w:unhideWhenUsed="1"/>
+    <w:lsdException w:name="toc 8" w:uiPriority="39" w:semiHidden="1" w:unhideWhenUsed="1"/>
+    <w:lsdException w:name="toc 9" w:uiPriority="39" w:semiHidden="1" w:unhideWhenUsed="1"/>
     <w:lsdException w:name="Normal Indent" w:semiHidden="1" w:unhideWhenUsed="1"/>
     <w:lsdException w:name="footnote text" w:semiHidden="1" w:unhideWhenUsed="1"/>
     <w:lsdException w:name="annotation text" w:semiHidden="1" w:unhideWhenUsed="1"/>
     <w:lsdException w:name="header" w:semiHidden="1" w:unhideWhenUsed="1"/>
     <w:lsdException w:name="footer" w:semiHidden="1" w:unhideWhenUsed="1"/>
     <w:lsdException w:name="index heading" w:semiHidden="1" w:unhideWhenUsed="1"/>
-    <w:lsdException w:name="caption" w:semiHidden="1" w:uiPriority="35" w:unhideWhenUsed="1" w:qFormat="1"/>
+    <w:lsdException w:name="caption" w:uiPriority="35" w:semiHidden="1" w:unhideWhenUsed="1" w:qFormat="1"/>
     <w:lsdException w:name="table of figures" w:semiHidden="1" w:unhideWhenUsed="1"/>
     <w:lsdException w:name="envelope address" w:semiHidden="1" w:unhideWhenUsed="1"/>
     <w:lsdException w:name="envelope return" w:semiHidden="1" w:unhideWhenUsed="1"/>
@@ -7919,7 +8175,7 @@
     <w:lsdException w:name="Title" w:uiPriority="10" w:qFormat="1"/>
     <w:lsdException w:name="Closing" w:semiHidden="1" w:unhideWhenUsed="1"/>
     <w:lsdException w:name="Signature" w:semiHidden="1" w:unhideWhenUsed="1"/>
-    <w:lsdException w:name="Default Paragraph Font" w:semiHidden="1" w:uiPriority="1" w:unhideWhenUsed="1"/>
+    <w:lsdException w:name="Default Paragraph Font" w:uiPriority="1" w:semiHidden="1" w:unhideWhenUsed="1"/>
     <w:lsdException w:name="Body Text" w:semiHidden="1" w:unhideWhenUsed="1"/>
     <w:lsdException w:name="Body Text Indent" w:semiHidden="1" w:unhideWhenUsed="1"/>
     <w:lsdException w:name="List Continue" w:semiHidden="1" w:unhideWhenUsed="1"/>
@@ -8119,8 +8375,8 @@
     <w:lsdException w:name="Subtle Reference" w:uiPriority="31" w:qFormat="1"/>
     <w:lsdException w:name="Intense Reference" w:uiPriority="32" w:qFormat="1"/>
     <w:lsdException w:name="Book Title" w:uiPriority="33" w:qFormat="1"/>
-    <w:lsdException w:name="Bibliography" w:semiHidden="1" w:uiPriority="37" w:unhideWhenUsed="1"/>
-    <w:lsdException w:name="TOC Heading" w:semiHidden="1" w:uiPriority="39" w:unhideWhenUsed="1" w:qFormat="1"/>
+    <w:lsdException w:name="Bibliography" w:uiPriority="37" w:semiHidden="1" w:unhideWhenUsed="1"/>
+    <w:lsdException w:name="TOC Heading" w:uiPriority="39" w:semiHidden="1" w:unhideWhenUsed="1" w:qFormat="1"/>
     <w:lsdException w:name="Plain Table 1" w:uiPriority="41"/>
     <w:lsdException w:name="Plain Table 2" w:uiPriority="42"/>
     <w:lsdException w:name="Plain Table 3" w:uiPriority="43"/>
@@ -8231,7 +8487,7 @@
     <w:lsdException w:name="Unresolved Mention" w:semiHidden="1" w:unhideWhenUsed="1"/>
     <w:lsdException w:name="Smart Link" w:semiHidden="1" w:unhideWhenUsed="1"/>
   </w:latentStyles>
-  <w:style w:type="paragraph" w:default="1" w:styleId="Normal">
+  <w:style w:type="paragraph" w:styleId="Normal" w:default="1">
     <w:name w:val="Normal"/>
     <w:qFormat/>
   </w:style>
@@ -8247,7 +8503,7 @@
       <w:outlineLvl w:val="0"/>
     </w:pPr>
     <w:rPr>
-      <w:rFonts w:ascii="Aptos" w:eastAsia="SimSun" w:hAnsi="Aptos" w:cs="Arial"/>
+      <w:rFonts w:ascii="Aptos" w:hAnsi="Aptos" w:eastAsia="SimSun" w:cs="Arial"/>
       <w:b/>
       <w:color w:val="D9272E"/>
     </w:rPr>
@@ -8428,13 +8684,12 @@
       <w:color w:val="272727" w:themeColor="text1" w:themeTint="D8"/>
     </w:rPr>
   </w:style>
-  <w:style w:type="character" w:default="1" w:styleId="DefaultParagraphFont">
+  <w:style w:type="character" w:styleId="DefaultParagraphFont" w:default="1">
     <w:name w:val="Default Paragraph Font"/>
     <w:uiPriority w:val="1"/>
-    <w:semiHidden/>
     <w:unhideWhenUsed/>
   </w:style>
-  <w:style w:type="table" w:default="1" w:styleId="TableNormal">
+  <w:style w:type="table" w:styleId="TableNormal" w:default="1">
     <w:name w:val="Normal Table"/>
     <w:uiPriority w:val="99"/>
     <w:semiHidden/>
@@ -8449,23 +8704,23 @@
       </w:tblCellMar>
     </w:tblPr>
   </w:style>
-  <w:style w:type="numbering" w:default="1" w:styleId="NoList">
+  <w:style w:type="numbering" w:styleId="NoList" w:default="1">
     <w:name w:val="No List"/>
     <w:uiPriority w:val="99"/>
     <w:semiHidden/>
     <w:unhideWhenUsed/>
   </w:style>
-  <w:style w:type="character" w:customStyle="1" w:styleId="Heading1Char">
+  <w:style w:type="character" w:styleId="Heading1Char" w:customStyle="1">
     <w:name w:val="Heading 1 Char"/>
     <w:link w:val="Heading1"/>
     <w:rsid w:val="006F05F5"/>
     <w:rPr>
-      <w:rFonts w:ascii="Aptos" w:eastAsia="SimSun" w:hAnsi="Aptos" w:cs="Arial"/>
+      <w:rFonts w:ascii="Aptos" w:hAnsi="Aptos" w:eastAsia="SimSun" w:cs="Arial"/>
       <w:b/>
       <w:color w:val="D9272E"/>
     </w:rPr>
   </w:style>
-  <w:style w:type="character" w:customStyle="1" w:styleId="Heading2Char">
+  <w:style w:type="character" w:styleId="Heading2Char" w:customStyle="1">
     <w:name w:val="Heading 2 Char"/>
     <w:basedOn w:val="DefaultParagraphFont"/>
     <w:link w:val="Heading2"/>
@@ -8479,7 +8734,7 @@
       <w:szCs w:val="22"/>
     </w:rPr>
   </w:style>
-  <w:style w:type="character" w:customStyle="1" w:styleId="Heading3Char">
+  <w:style w:type="character" w:styleId="Heading3Char" w:customStyle="1">
     <w:name w:val="Heading 3 Char"/>
     <w:basedOn w:val="DefaultParagraphFont"/>
     <w:link w:val="Heading3"/>
@@ -8493,7 +8748,7 @@
       <w:szCs w:val="28"/>
     </w:rPr>
   </w:style>
-  <w:style w:type="character" w:customStyle="1" w:styleId="Heading4Char">
+  <w:style w:type="character" w:styleId="Heading4Char" w:customStyle="1">
     <w:name w:val="Heading 4 Char"/>
     <w:basedOn w:val="DefaultParagraphFont"/>
     <w:link w:val="Heading4"/>
@@ -8507,7 +8762,7 @@
       <w:color w:val="0F4761" w:themeColor="accent1" w:themeShade="BF"/>
     </w:rPr>
   </w:style>
-  <w:style w:type="character" w:customStyle="1" w:styleId="Heading5Char">
+  <w:style w:type="character" w:styleId="Heading5Char" w:customStyle="1">
     <w:name w:val="Heading 5 Char"/>
     <w:basedOn w:val="DefaultParagraphFont"/>
     <w:link w:val="Heading5"/>
@@ -8519,7 +8774,7 @@
       <w:color w:val="0F4761" w:themeColor="accent1" w:themeShade="BF"/>
     </w:rPr>
   </w:style>
-  <w:style w:type="character" w:customStyle="1" w:styleId="Heading6Char">
+  <w:style w:type="character" w:styleId="Heading6Char" w:customStyle="1">
     <w:name w:val="Heading 6 Char"/>
     <w:basedOn w:val="DefaultParagraphFont"/>
     <w:link w:val="Heading6"/>
@@ -8533,7 +8788,7 @@
       <w:color w:val="595959" w:themeColor="text1" w:themeTint="A6"/>
     </w:rPr>
   </w:style>
-  <w:style w:type="character" w:customStyle="1" w:styleId="Heading7Char">
+  <w:style w:type="character" w:styleId="Heading7Char" w:customStyle="1">
     <w:name w:val="Heading 7 Char"/>
     <w:basedOn w:val="DefaultParagraphFont"/>
     <w:link w:val="Heading7"/>
@@ -8545,7 +8800,7 @@
       <w:color w:val="595959" w:themeColor="text1" w:themeTint="A6"/>
     </w:rPr>
   </w:style>
-  <w:style w:type="character" w:customStyle="1" w:styleId="Heading8Char">
+  <w:style w:type="character" w:styleId="Heading8Char" w:customStyle="1">
     <w:name w:val="Heading 8 Char"/>
     <w:basedOn w:val="DefaultParagraphFont"/>
     <w:link w:val="Heading8"/>
@@ -8559,7 +8814,7 @@
       <w:color w:val="272727" w:themeColor="text1" w:themeTint="D8"/>
     </w:rPr>
   </w:style>
-  <w:style w:type="character" w:customStyle="1" w:styleId="Heading9Char">
+  <w:style w:type="character" w:styleId="Heading9Char" w:customStyle="1">
     <w:name w:val="Heading 9 Char"/>
     <w:basedOn w:val="DefaultParagraphFont"/>
     <w:link w:val="Heading9"/>
@@ -8584,21 +8839,21 @@
       <w:contextualSpacing/>
     </w:pPr>
     <w:rPr>
-      <w:rFonts w:asciiTheme="majorHAnsi" w:eastAsiaTheme="majorEastAsia" w:hAnsiTheme="majorHAnsi" w:cstheme="majorBidi"/>
+      <w:rFonts w:asciiTheme="majorHAnsi" w:hAnsiTheme="majorHAnsi" w:eastAsiaTheme="majorEastAsia" w:cstheme="majorBidi"/>
       <w:spacing w:val="-10"/>
       <w:kern w:val="28"/>
       <w:sz w:val="56"/>
       <w:szCs w:val="56"/>
     </w:rPr>
   </w:style>
-  <w:style w:type="character" w:customStyle="1" w:styleId="TitleChar">
+  <w:style w:type="character" w:styleId="TitleChar" w:customStyle="1">
     <w:name w:val="Title Char"/>
     <w:basedOn w:val="DefaultParagraphFont"/>
     <w:link w:val="Title"/>
     <w:uiPriority w:val="10"/>
     <w:rsid w:val="0053419A"/>
     <w:rPr>
-      <w:rFonts w:asciiTheme="majorHAnsi" w:eastAsiaTheme="majorEastAsia" w:hAnsiTheme="majorHAnsi" w:cstheme="majorBidi"/>
+      <w:rFonts w:asciiTheme="majorHAnsi" w:hAnsiTheme="majorHAnsi" w:eastAsiaTheme="majorEastAsia" w:cstheme="majorBidi"/>
       <w:spacing w:val="-10"/>
       <w:kern w:val="28"/>
       <w:sz w:val="56"/>
@@ -8626,7 +8881,7 @@
       <w:szCs w:val="28"/>
     </w:rPr>
   </w:style>
-  <w:style w:type="character" w:customStyle="1" w:styleId="SubtitleChar">
+  <w:style w:type="character" w:styleId="SubtitleChar" w:customStyle="1">
     <w:name w:val="Subtitle Char"/>
     <w:basedOn w:val="DefaultParagraphFont"/>
     <w:link w:val="Subtitle"/>
@@ -8658,7 +8913,7 @@
       <w:color w:val="404040" w:themeColor="text1" w:themeTint="BF"/>
     </w:rPr>
   </w:style>
-  <w:style w:type="character" w:customStyle="1" w:styleId="QuoteChar">
+  <w:style w:type="character" w:styleId="QuoteChar" w:customStyle="1">
     <w:name w:val="Quote Char"/>
     <w:basedOn w:val="DefaultParagraphFont"/>
     <w:link w:val="Quote"/>
@@ -8704,8 +8959,8 @@
     <w:rsid w:val="0053419A"/>
     <w:pPr>
       <w:pBdr>
-        <w:top w:val="single" w:sz="4" w:space="10" w:color="0F4761" w:themeColor="accent1" w:themeShade="BF"/>
-        <w:bottom w:val="single" w:sz="4" w:space="10" w:color="0F4761" w:themeColor="accent1" w:themeShade="BF"/>
+        <w:top w:val="single" w:color="0F4761" w:themeColor="accent1" w:themeShade="BF" w:sz="4" w:space="10"/>
+        <w:bottom w:val="single" w:color="0F4761" w:themeColor="accent1" w:themeShade="BF" w:sz="4" w:space="10"/>
       </w:pBdr>
       <w:spacing w:before="360" w:after="360"/>
       <w:ind w:left="864" w:right="864"/>
@@ -8717,7 +8972,7 @@
       <w:color w:val="0F4761" w:themeColor="accent1" w:themeShade="BF"/>
     </w:rPr>
   </w:style>
-  <w:style w:type="character" w:customStyle="1" w:styleId="IntenseQuoteChar">
+  <w:style w:type="character" w:styleId="IntenseQuoteChar" w:customStyle="1">
     <w:name w:val="Intense Quote Char"/>
     <w:basedOn w:val="DefaultParagraphFont"/>
     <w:link w:val="IntenseQuote"/>
@@ -8758,7 +9013,7 @@
       <w:spacing w:after="0" w:line="240" w:lineRule="auto"/>
     </w:pPr>
   </w:style>
-  <w:style w:type="character" w:customStyle="1" w:styleId="HeaderChar">
+  <w:style w:type="character" w:styleId="HeaderChar" w:customStyle="1">
     <w:name w:val="Header Char"/>
     <w:basedOn w:val="DefaultParagraphFont"/>
     <w:link w:val="Header"/>
@@ -8780,7 +9035,7 @@
       <w:spacing w:after="0" w:line="240" w:lineRule="auto"/>
     </w:pPr>
   </w:style>
-  <w:style w:type="character" w:customStyle="1" w:styleId="FooterChar">
+  <w:style w:type="character" w:styleId="FooterChar" w:customStyle="1">
     <w:name w:val="Footer Char"/>
     <w:basedOn w:val="DefaultParagraphFont"/>
     <w:link w:val="Footer"/>
@@ -8797,7 +9052,7 @@
     </w:pPr>
     <w:tblPr/>
   </w:style>
-  <w:style w:type="table" w:customStyle="1" w:styleId="TableGrid3">
+  <w:style w:type="table" w:styleId="TableGrid3" w:customStyle="1">
     <w:name w:val="Table Grid3"/>
     <w:basedOn w:val="TableNormal"/>
     <w:next w:val="TableGrid"/>
@@ -8808,7 +9063,7 @@
       <w:jc w:val="both"/>
     </w:pPr>
     <w:rPr>
-      <w:rFonts w:ascii="Calibri" w:eastAsia="SimSun" w:hAnsi="Calibri" w:cs="Times New Roman"/>
+      <w:rFonts w:ascii="Calibri" w:hAnsi="Calibri" w:eastAsia="SimSun" w:cs="Times New Roman"/>
       <w:kern w:val="0"/>
       <w:sz w:val="22"/>
       <w:szCs w:val="22"/>
@@ -8839,7 +9094,7 @@
       <w:szCs w:val="18"/>
     </w:rPr>
   </w:style>
-  <w:style w:type="table" w:customStyle="1" w:styleId="TableGrid4">
+  <w:style w:type="table" w:styleId="TableGrid4" w:customStyle="1">
     <w:name w:val="Table Grid4"/>
     <w:basedOn w:val="TableNormal"/>
     <w:next w:val="TableGrid"/>
@@ -8850,7 +9105,7 @@
       <w:jc w:val="both"/>
     </w:pPr>
     <w:rPr>
-      <w:rFonts w:ascii="Calibri" w:eastAsia="SimSun" w:hAnsi="Calibri" w:cs="Times New Roman"/>
+      <w:rFonts w:ascii="Calibri" w:hAnsi="Calibri" w:eastAsia="SimSun" w:cs="Times New Roman"/>
       <w:kern w:val="0"/>
       <w:sz w:val="22"/>
       <w:szCs w:val="22"/>
@@ -8860,7 +9115,7 @@
     <w:tblPr/>
   </w:style>
   <w:style w:type="character" w:styleId="CommentReference">
-    <w:name w:val="annotation reference"/>
+    <w:name w:val="Comment Reference"/>
     <w:basedOn w:val="DefaultParagraphFont"/>
     <w:uiPriority w:val="99"/>
     <w:semiHidden/>
@@ -8872,7 +9127,7 @@
     </w:rPr>
   </w:style>
   <w:style w:type="paragraph" w:styleId="CommentText">
-    <w:name w:val="annotation text"/>
+    <w:name w:val="Comment Text"/>
     <w:basedOn w:val="Normal"/>
     <w:link w:val="CommentTextChar"/>
     <w:uiPriority w:val="99"/>
@@ -8886,7 +9141,7 @@
       <w:szCs w:val="20"/>
     </w:rPr>
   </w:style>
-  <w:style w:type="character" w:customStyle="1" w:styleId="CommentTextChar">
+  <w:style w:type="character" w:styleId="CommentTextChar" w:customStyle="1">
     <w:name w:val="Comment Text Char"/>
     <w:basedOn w:val="DefaultParagraphFont"/>
     <w:link w:val="CommentText"/>
@@ -8898,7 +9153,7 @@
     </w:rPr>
   </w:style>
   <w:style w:type="paragraph" w:styleId="CommentSubject">
-    <w:name w:val="annotation subject"/>
+    <w:name w:val="Comment Subject"/>
     <w:basedOn w:val="CommentText"/>
     <w:next w:val="CommentText"/>
     <w:link w:val="CommentSubjectChar"/>
@@ -8911,7 +9166,7 @@
       <w:bCs/>
     </w:rPr>
   </w:style>
-  <w:style w:type="character" w:customStyle="1" w:styleId="CommentSubjectChar">
+  <w:style w:type="character" w:styleId="CommentSubjectChar" w:customStyle="1">
     <w:name w:val="Comment Subject Char"/>
     <w:basedOn w:val="CommentTextChar"/>
     <w:link w:val="CommentSubject"/>
@@ -8936,13 +9191,13 @@
       <w:shd w:val="clear" w:color="auto" w:fill="E1DFDD"/>
     </w:rPr>
   </w:style>
-  <w:style w:type="character" w:customStyle="1" w:styleId="ListParagraphChar">
+  <w:style w:type="character" w:styleId="ListParagraphChar" w:customStyle="1">
     <w:name w:val="List Paragraph Char"/>
     <w:link w:val="ListParagraph"/>
     <w:uiPriority w:val="34"/>
     <w:rsid w:val="004F4367"/>
   </w:style>
-  <w:style w:type="paragraph" w:customStyle="1" w:styleId="Default">
+  <w:style w:type="paragraph" w:styleId="Default" w:customStyle="1">
     <w:name w:val="Default"/>
     <w:rsid w:val="00903872"/>
     <w:pPr>
@@ -8957,39 +9212,39 @@
       <w:kern w:val="0"/>
     </w:rPr>
   </w:style>
-  <w:style w:type="character" w:customStyle="1" w:styleId="cf01">
+  <w:style w:type="character" w:styleId="cf01" w:customStyle="1">
     <w:name w:val="cf01"/>
     <w:basedOn w:val="DefaultParagraphFont"/>
     <w:rsid w:val="002D0ADF"/>
     <w:rPr>
-      <w:rFonts w:ascii="Segoe UI" w:hAnsi="Segoe UI" w:cs="Segoe UI" w:hint="default"/>
+      <w:rFonts w:hint="default" w:ascii="Segoe UI" w:hAnsi="Segoe UI" w:cs="Segoe UI"/>
       <w:sz w:val="18"/>
       <w:szCs w:val="18"/>
     </w:rPr>
   </w:style>
-  <w:style w:type="character" w:customStyle="1" w:styleId="cf11">
+  <w:style w:type="character" w:styleId="cf11" w:customStyle="1">
     <w:name w:val="cf11"/>
     <w:basedOn w:val="DefaultParagraphFont"/>
     <w:rsid w:val="002D0ADF"/>
     <w:rPr>
-      <w:rFonts w:ascii="Segoe UI" w:hAnsi="Segoe UI" w:cs="Segoe UI" w:hint="default"/>
+      <w:rFonts w:hint="default" w:ascii="Segoe UI" w:hAnsi="Segoe UI" w:cs="Segoe UI"/>
       <w:color w:val="333333"/>
       <w:sz w:val="18"/>
       <w:szCs w:val="18"/>
     </w:rPr>
   </w:style>
-  <w:style w:type="character" w:customStyle="1" w:styleId="cf21">
+  <w:style w:type="character" w:styleId="cf21" w:customStyle="1">
     <w:name w:val="cf21"/>
     <w:basedOn w:val="DefaultParagraphFont"/>
     <w:rsid w:val="002D0ADF"/>
     <w:rPr>
-      <w:rFonts w:ascii="Segoe UI" w:hAnsi="Segoe UI" w:cs="Segoe UI" w:hint="default"/>
+      <w:rFonts w:hint="default" w:ascii="Segoe UI" w:hAnsi="Segoe UI" w:cs="Segoe UI"/>
       <w:color w:val="0000FF"/>
       <w:sz w:val="18"/>
       <w:szCs w:val="18"/>
     </w:rPr>
   </w:style>
-  <w:style w:type="paragraph" w:customStyle="1" w:styleId="paragraph">
+  <w:style w:type="paragraph" w:styleId="paragraph" w:customStyle="1">
     <w:name w:val="paragraph"/>
     <w:basedOn w:val="Normal"/>
     <w:rsid w:val="001D634C"/>
@@ -8997,23 +9252,23 @@
       <w:spacing w:before="100" w:beforeAutospacing="1" w:after="100" w:afterAutospacing="1" w:line="240" w:lineRule="auto"/>
     </w:pPr>
     <w:rPr>
-      <w:rFonts w:ascii="Times New Roman" w:eastAsia="Times New Roman" w:hAnsi="Times New Roman" w:cs="Times New Roman"/>
+      <w:rFonts w:ascii="Times New Roman" w:hAnsi="Times New Roman" w:eastAsia="Times New Roman" w:cs="Times New Roman"/>
       <w:kern w:val="0"/>
       <w:lang w:eastAsia="en-AU"/>
       <w14:ligatures w14:val="none"/>
     </w:rPr>
   </w:style>
-  <w:style w:type="character" w:customStyle="1" w:styleId="normaltextrun">
+  <w:style w:type="character" w:styleId="normaltextrun" w:customStyle="1">
     <w:name w:val="normaltextrun"/>
     <w:basedOn w:val="DefaultParagraphFont"/>
     <w:rsid w:val="001D634C"/>
   </w:style>
-  <w:style w:type="character" w:customStyle="1" w:styleId="eop">
+  <w:style w:type="character" w:styleId="eop" w:customStyle="1">
     <w:name w:val="eop"/>
     <w:basedOn w:val="DefaultParagraphFont"/>
     <w:rsid w:val="001D634C"/>
   </w:style>
-  <w:style w:type="character" w:customStyle="1" w:styleId="Style1">
+  <w:style w:type="character" w:styleId="Style1" w:customStyle="1">
     <w:name w:val="Style1"/>
     <w:basedOn w:val="DefaultParagraphFont"/>
     <w:uiPriority w:val="1"/>
@@ -9052,7 +9307,7 @@
         <w:guid w:val="{1D6D713F-95CD-42CB-A66C-E6E1464AD0EA}"/>
       </w:docPartPr>
       <w:docPartBody>
-        <w:p>
+        <w:p xmlns:wp14="http://schemas.microsoft.com/office/word/2010/wordml" wp14:textId="77777777">
           <w:pPr>
             <w:pStyle w:val="C750E04891E345B3998F28770F83F5EB"/>
           </w:pPr>
@@ -9081,7 +9336,7 @@
         <w:guid w:val="{DA7379F2-CAB5-4169-8218-320E606A6335}"/>
       </w:docPartPr>
       <w:docPartBody>
-        <w:p>
+        <w:p xmlns:wp14="http://schemas.microsoft.com/office/word/2010/wordml" wp14:textId="77777777">
           <w:pPr>
             <w:pStyle w:val="3E59F2BE572B4A1B97796526B780F812"/>
           </w:pPr>
@@ -9217,6 +9472,7 @@
     <w:rsid w:val="001E1590"/>
     <w:rsid w:val="0024507B"/>
     <w:rsid w:val="002465B7"/>
+    <w:rsid w:val="0025042B"/>
     <w:rsid w:val="00270B79"/>
     <w:rsid w:val="00283F85"/>
     <w:rsid w:val="00290FC0"/>
@@ -9248,6 +9504,7 @@
     <w:rsid w:val="009B4486"/>
     <w:rsid w:val="00A13088"/>
     <w:rsid w:val="00A22FBC"/>
+    <w:rsid w:val="00A2579F"/>
     <w:rsid w:val="00A82B86"/>
     <w:rsid w:val="00B92DCC"/>
     <w:rsid w:val="00BA6B44"/>
@@ -9749,7 +10006,7 @@
 </file>
 
 <file path=word/theme/theme1.xml><?xml version="1.0" encoding="utf-8"?>
-<a:theme xmlns:a="http://schemas.openxmlformats.org/drawingml/2006/main" name="Office Theme">
+<a:theme xmlns:a="http://schemas.openxmlformats.org/drawingml/2006/main" xmlns:thm15="http://schemas.microsoft.com/office/thememl/2012/main" name="Office Theme">
   <a:themeElements>
     <a:clrScheme name="Office">
       <a:dk1>
@@ -10044,6 +10301,58 @@
 </file>
 
 <file path=customXml/item1.xml><?xml version="1.0" encoding="utf-8"?>
+<p:properties xmlns:p="http://schemas.microsoft.com/office/2006/metadata/properties" xmlns:xsi="http://www.w3.org/2001/XMLSchema-instance" xmlns:pc="http://schemas.microsoft.com/office/infopath/2007/PartnerControls">
+  <documentManagement>
+    <Entity xmlns="f76bb202-e0ee-44b5-81bd-1165e74daad9">NM TAFE</Entity>
+    <Library xmlns="f76bb202-e0ee-44b5-81bd-1165e74daad9">Published</Library>
+    <Document_x0020_Set_x0020_Status xmlns="f76bb202-e0ee-44b5-81bd-1165e74daad9">Active</Document_x0020_Set_x0020_Status>
+    <Site xmlns="f76bb202-e0ee-44b5-81bd-1165e74daad9">Quality Assurance (Teams)</Site>
+    <_dlc_DocId xmlns="54903c2b-d745-4d4d-852a-5f37568ebb60">NMTCDMS-474321762-739</_dlc_DocId>
+    <_dlc_DocIdUrl xmlns="54903c2b-d745-4d4d-852a-5f37568ebb60">
+      <Url>https://tafewa.sharepoint.com/sites/NMT_Controlled_Documents/Controlled_Documents/_layouts/15/DocIdRedir.aspx?ID=NMTCDMS-474321762-739</Url>
+      <Description>NMTCDMS-474321762-739</Description>
+    </_dlc_DocIdUrl>
+    <related_policy_previous xmlns="c0e62afa-2a47-46b3-9456-da846e41d927" xsi:nil="true"/>
+    <_dlc_DocIdPersistId xmlns="54903c2b-d745-4d4d-852a-5f37568ebb60" xsi:nil="true"/>
+    <Obsolete xmlns="5ae04d3c-143d-44b1-9de7-bd4bbc3b5a14">false</Obsolete>
+    <Next_Review_Due xmlns="5ae04d3c-143d-44b1-9de7-bd4bbc3b5a14">2027-09-30T16:00:00+00:00</Next_Review_Due>
+    <approval_status_previous xmlns="5ae04d3c-143d-44b1-9de7-bd4bbc3b5a14">Approved</approval_status_previous>
+    <bul_approve_control xmlns="54903c2b-d745-4d4d-852a-5f37568ebb60" xsi:nil="true"/>
+    <file_mapping_id xmlns="5ae04d3c-143d-44b1-9de7-bd4bbc3b5a14">450</file_mapping_id>
+    <Published_Version xmlns="5ae04d3c-143d-44b1-9de7-bd4bbc3b5a14">10</Published_Version>
+    <name_previous xmlns="5ae04d3c-143d-44b1-9de7-bd4bbc3b5a14">Assessment Task (F122A12).docx</name_previous>
+    <Document_Owner xmlns="54903c2b-d745-4d4d-852a-5f37568ebb60">
+      <UserInfo>
+        <DisplayName>Linley Atkinson</DisplayName>
+        <AccountId>823</AccountId>
+        <AccountType/>
+      </UserInfo>
+    </Document_Owner>
+    <Latest_Comment xmlns="5ae04d3c-143d-44b1-9de7-bd4bbc3b5a14">No action required.  Minor amendment to remove and correct a word as requested by A/Manager VET Curriculum and QA</Latest_Comment>
+    <Document_Type xmlns="5ae04d3c-143d-44b1-9de7-bd4bbc3b5a14">Form</Document_Type>
+    <obsolete_previous xmlns="5ae04d3c-143d-44b1-9de7-bd4bbc3b5a14">False</obsolete_previous>
+    <Approval_Status xmlns="5ae04d3c-143d-44b1-9de7-bd4bbc3b5a14">Approved</Approval_Status>
+    <Document_Approver xmlns="54903c2b-d745-4d4d-852a-5f37568ebb60">
+      <UserInfo>
+        <DisplayName>El Hour Bokhari</DisplayName>
+        <AccountId>13</AccountId>
+        <AccountType/>
+      </UserInfo>
+    </Document_Approver>
+    <Related_Policy xmlns="c0e62afa-2a47-46b3-9456-da846e41d927">50</Related_Policy>
+    <Business_Area xmlns="5ae04d3c-143d-44b1-9de7-bd4bbc3b5a14">Academic Quality</Business_Area>
+    <Document_Publisher xmlns="54903c2b-d745-4d4d-852a-5f37568ebb60">
+      <UserInfo>
+        <DisplayName>El Hour Bokhari</DisplayName>
+        <AccountId>13</AccountId>
+        <AccountType/>
+      </UserInfo>
+    </Document_Publisher>
+  </documentManagement>
+</p:properties>
+</file>
+
+<file path=customXml/item2.xml><?xml version="1.0" encoding="utf-8"?>
 <ct:contentTypeSchema xmlns:ct="http://schemas.microsoft.com/office/2006/metadata/contentType" xmlns:ma="http://schemas.microsoft.com/office/2006/metadata/properties/metaAttributes" ct:_="" ma:_="" ma:contentTypeName="Controlled Document" ma:contentTypeID="0x0101000E64A23F1383D74E9A471A69050FD18B0046577A75227F17439BBA8F713A650313" ma:contentTypeVersion="46" ma:contentTypeDescription="" ma:contentTypeScope="" ma:versionID="1f04c511dffc07a981006bf2377618a6">
   <xsd:schema xmlns:xsd="http://www.w3.org/2001/XMLSchema" xmlns:xs="http://www.w3.org/2001/XMLSchema" xmlns:p="http://schemas.microsoft.com/office/2006/metadata/properties" xmlns:ns2="5ae04d3c-143d-44b1-9de7-bd4bbc3b5a14" xmlns:ns3="54903c2b-d745-4d4d-852a-5f37568ebb60" xmlns:ns4="f76bb202-e0ee-44b5-81bd-1165e74daad9" xmlns:ns5="c0e62afa-2a47-46b3-9456-da846e41d927" xmlns:ns6="38f4ab31-c154-439c-a7aa-8c80659b9f34" targetNamespace="http://schemas.microsoft.com/office/2006/metadata/properties" ma:root="true" ma:fieldsID="ad538bbdbe8997e2459c3970568cceb8" ns2:_="" ns3:_="" ns4:_="" ns5:_="" ns6:_="">
     <xsd:import namespace="5ae04d3c-143d-44b1-9de7-bd4bbc3b5a14"/>
@@ -10496,64 +10805,20 @@
 </ct:contentTypeSchema>
 </file>
 
-<file path=customXml/item2.xml><?xml version="1.0" encoding="utf-8"?>
-<p:properties xmlns:p="http://schemas.microsoft.com/office/2006/metadata/properties" xmlns:xsi="http://www.w3.org/2001/XMLSchema-instance" xmlns:pc="http://schemas.microsoft.com/office/infopath/2007/PartnerControls">
-  <documentManagement>
-    <Entity xmlns="f76bb202-e0ee-44b5-81bd-1165e74daad9">NM TAFE</Entity>
-    <Library xmlns="f76bb202-e0ee-44b5-81bd-1165e74daad9">Published</Library>
-    <Document_x0020_Set_x0020_Status xmlns="f76bb202-e0ee-44b5-81bd-1165e74daad9">Active</Document_x0020_Set_x0020_Status>
-    <Site xmlns="f76bb202-e0ee-44b5-81bd-1165e74daad9">Quality Assurance (Teams)</Site>
-    <_dlc_DocId xmlns="54903c2b-d745-4d4d-852a-5f37568ebb60">NMTCDMS-474321762-739</_dlc_DocId>
-    <_dlc_DocIdUrl xmlns="54903c2b-d745-4d4d-852a-5f37568ebb60">
-      <Url>https://tafewa.sharepoint.com/sites/NMT_Controlled_Documents/Controlled_Documents/_layouts/15/DocIdRedir.aspx?ID=NMTCDMS-474321762-739</Url>
-      <Description>NMTCDMS-474321762-739</Description>
-    </_dlc_DocIdUrl>
-    <related_policy_previous xmlns="c0e62afa-2a47-46b3-9456-da846e41d927" xsi:nil="true"/>
-    <_dlc_DocIdPersistId xmlns="54903c2b-d745-4d4d-852a-5f37568ebb60" xsi:nil="true"/>
-    <Obsolete xmlns="5ae04d3c-143d-44b1-9de7-bd4bbc3b5a14">false</Obsolete>
-    <Next_Review_Due xmlns="5ae04d3c-143d-44b1-9de7-bd4bbc3b5a14">2027-09-30T16:00:00+00:00</Next_Review_Due>
-    <approval_status_previous xmlns="5ae04d3c-143d-44b1-9de7-bd4bbc3b5a14">Approved</approval_status_previous>
-    <bul_approve_control xmlns="54903c2b-d745-4d4d-852a-5f37568ebb60" xsi:nil="true"/>
-    <file_mapping_id xmlns="5ae04d3c-143d-44b1-9de7-bd4bbc3b5a14">450</file_mapping_id>
-    <Published_Version xmlns="5ae04d3c-143d-44b1-9de7-bd4bbc3b5a14">10</Published_Version>
-    <name_previous xmlns="5ae04d3c-143d-44b1-9de7-bd4bbc3b5a14">Assessment Task (F122A12).docx</name_previous>
-    <Document_Owner xmlns="54903c2b-d745-4d4d-852a-5f37568ebb60">
-      <UserInfo>
-        <DisplayName>Linley Atkinson</DisplayName>
-        <AccountId>823</AccountId>
-        <AccountType/>
-      </UserInfo>
-    </Document_Owner>
-    <Latest_Comment xmlns="5ae04d3c-143d-44b1-9de7-bd4bbc3b5a14">No action required.  Minor amendment to remove and correct a word as requested by A/Manager VET Curriculum and QA</Latest_Comment>
-    <Document_Type xmlns="5ae04d3c-143d-44b1-9de7-bd4bbc3b5a14">Form</Document_Type>
-    <obsolete_previous xmlns="5ae04d3c-143d-44b1-9de7-bd4bbc3b5a14">False</obsolete_previous>
-    <Approval_Status xmlns="5ae04d3c-143d-44b1-9de7-bd4bbc3b5a14">Approved</Approval_Status>
-    <Document_Approver xmlns="54903c2b-d745-4d4d-852a-5f37568ebb60">
-      <UserInfo>
-        <DisplayName>El Hour Bokhari</DisplayName>
-        <AccountId>13</AccountId>
-        <AccountType/>
-      </UserInfo>
-    </Document_Approver>
-    <Related_Policy xmlns="c0e62afa-2a47-46b3-9456-da846e41d927">50</Related_Policy>
-    <Business_Area xmlns="5ae04d3c-143d-44b1-9de7-bd4bbc3b5a14">Academic Quality</Business_Area>
-    <Document_Publisher xmlns="54903c2b-d745-4d4d-852a-5f37568ebb60">
-      <UserInfo>
-        <DisplayName>El Hour Bokhari</DisplayName>
-        <AccountId>13</AccountId>
-        <AccountType/>
-      </UserInfo>
-    </Document_Publisher>
-  </documentManagement>
-</p:properties>
-</file>
-
 <file path=customXml/item3.xml><?xml version="1.0" encoding="utf-8"?>
 <?mso-contentType ?>
-<SharedContentType xmlns="Microsoft.SharePoint.Taxonomy.ContentTypeSync" SourceId="598972e7-4f0e-48c0-bb56-a9f22e25d3ec" ContentTypeId="0x0101000E64A23F1383D74E9A471A69050FD18B" PreviousValue="false" LastSyncTimeStamp="2021-09-09T00:35:20.36Z"/>
+<FormTemplates xmlns="http://schemas.microsoft.com/sharepoint/v3/contenttype/forms">
+  <Display>DocumentLibraryForm</Display>
+  <Edit>DocumentLibraryForm</Edit>
+  <New>DocumentLibraryForm</New>
+</FormTemplates>
 </file>
 
 <file path=customXml/item4.xml><?xml version="1.0" encoding="utf-8"?>
+<b:Sources xmlns:b="http://schemas.openxmlformats.org/officeDocument/2006/bibliography" xmlns="http://schemas.openxmlformats.org/officeDocument/2006/bibliography" SelectedStyle="\APASixthEditionOfficeOnline.xsl" StyleName="APA" Version="6"/>
+</file>
+
+<file path=customXml/item5.xml><?xml version="1.0" encoding="utf-8"?>
 <?mso-contentType ?>
 <spe:Receivers xmlns:spe="http://schemas.microsoft.com/sharepoint/events">
   <Receiver>
@@ -10603,20 +10868,25 @@
 </spe:Receivers>
 </file>
 
-<file path=customXml/item5.xml><?xml version="1.0" encoding="utf-8"?>
-<b:Sources xmlns:b="http://schemas.openxmlformats.org/officeDocument/2006/bibliography" xmlns="http://schemas.openxmlformats.org/officeDocument/2006/bibliography" SelectedStyle="\APASixthEditionOfficeOnline.xsl" StyleName="APA" Version="6"/>
-</file>
-
 <file path=customXml/item6.xml><?xml version="1.0" encoding="utf-8"?>
 <?mso-contentType ?>
-<FormTemplates xmlns="http://schemas.microsoft.com/sharepoint/v3/contenttype/forms">
-  <Display>DocumentLibraryForm</Display>
-  <Edit>DocumentLibraryForm</Edit>
-  <New>DocumentLibraryForm</New>
-</FormTemplates>
+<SharedContentType xmlns="Microsoft.SharePoint.Taxonomy.ContentTypeSync" SourceId="598972e7-4f0e-48c0-bb56-a9f22e25d3ec" ContentTypeId="0x0101000E64A23F1383D74E9A471A69050FD18B" PreviousValue="false" LastSyncTimeStamp="2021-09-09T00:35:20.36Z"/>
 </file>
 
 <file path=customXml/itemProps1.xml><?xml version="1.0" encoding="utf-8"?>
+<ds:datastoreItem xmlns:ds="http://schemas.openxmlformats.org/officeDocument/2006/customXml" ds:itemID="{F54B35AC-986F-4675-B1D0-9BF03E0724D3}">
+  <ds:schemaRefs>
+    <ds:schemaRef ds:uri="http://schemas.microsoft.com/office/2006/metadata/properties"/>
+    <ds:schemaRef ds:uri="http://schemas.microsoft.com/office/infopath/2007/PartnerControls"/>
+    <ds:schemaRef ds:uri="f76bb202-e0ee-44b5-81bd-1165e74daad9"/>
+    <ds:schemaRef ds:uri="54903c2b-d745-4d4d-852a-5f37568ebb60"/>
+    <ds:schemaRef ds:uri="c0e62afa-2a47-46b3-9456-da846e41d927"/>
+    <ds:schemaRef ds:uri="5ae04d3c-143d-44b1-9de7-bd4bbc3b5a14"/>
+  </ds:schemaRefs>
+</ds:datastoreItem>
+</file>
+
+<file path=customXml/itemProps2.xml><?xml version="1.0" encoding="utf-8"?>
 <ds:datastoreItem xmlns:ds="http://schemas.openxmlformats.org/officeDocument/2006/customXml" ds:itemID="{E735BB2F-3CCB-48F3-A776-16499B38869D}">
   <ds:schemaRefs>
     <ds:schemaRef ds:uri="http://schemas.microsoft.com/office/2006/metadata/contentType"/>
@@ -10638,28 +10908,23 @@
 </ds:datastoreItem>
 </file>
 
-<file path=customXml/itemProps2.xml><?xml version="1.0" encoding="utf-8"?>
-<ds:datastoreItem xmlns:ds="http://schemas.openxmlformats.org/officeDocument/2006/customXml" ds:itemID="{F54B35AC-986F-4675-B1D0-9BF03E0724D3}">
+<file path=customXml/itemProps3.xml><?xml version="1.0" encoding="utf-8"?>
+<ds:datastoreItem xmlns:ds="http://schemas.openxmlformats.org/officeDocument/2006/customXml" ds:itemID="{0CF1B02A-AE70-46BE-AFF9-C0ED85F2E0E0}">
   <ds:schemaRefs>
-    <ds:schemaRef ds:uri="http://schemas.microsoft.com/office/2006/metadata/properties"/>
-    <ds:schemaRef ds:uri="http://schemas.microsoft.com/office/infopath/2007/PartnerControls"/>
-    <ds:schemaRef ds:uri="f76bb202-e0ee-44b5-81bd-1165e74daad9"/>
-    <ds:schemaRef ds:uri="54903c2b-d745-4d4d-852a-5f37568ebb60"/>
-    <ds:schemaRef ds:uri="c0e62afa-2a47-46b3-9456-da846e41d927"/>
-    <ds:schemaRef ds:uri="5ae04d3c-143d-44b1-9de7-bd4bbc3b5a14"/>
-  </ds:schemaRefs>
-</ds:datastoreItem>
-</file>
-
-<file path=customXml/itemProps3.xml><?xml version="1.0" encoding="utf-8"?>
-<ds:datastoreItem xmlns:ds="http://schemas.openxmlformats.org/officeDocument/2006/customXml" ds:itemID="{FA63A305-3DF8-41F5-B81F-628BF4BD968A}">
-  <ds:schemaRefs>
-    <ds:schemaRef ds:uri="Microsoft.SharePoint.Taxonomy.ContentTypeSync"/>
+    <ds:schemaRef ds:uri="http://schemas.microsoft.com/sharepoint/v3/contenttype/forms"/>
   </ds:schemaRefs>
 </ds:datastoreItem>
 </file>
 
 <file path=customXml/itemProps4.xml><?xml version="1.0" encoding="utf-8"?>
+<ds:datastoreItem xmlns:ds="http://schemas.openxmlformats.org/officeDocument/2006/customXml" ds:itemID="{4B799844-21BF-4EC0-9FC3-DE0BDABC8C8B}">
+  <ds:schemaRefs>
+    <ds:schemaRef ds:uri="http://schemas.openxmlformats.org/officeDocument/2006/bibliography"/>
+  </ds:schemaRefs>
+</ds:datastoreItem>
+</file>
+
+<file path=customXml/itemProps5.xml><?xml version="1.0" encoding="utf-8"?>
 <ds:datastoreItem xmlns:ds="http://schemas.openxmlformats.org/officeDocument/2006/customXml" ds:itemID="{E1DA1C38-B72B-41D9-91E3-EFDB25078FAE}">
   <ds:schemaRefs>
     <ds:schemaRef ds:uri="http://schemas.microsoft.com/sharepoint/events"/>
@@ -10667,18 +10932,10 @@
 </ds:datastoreItem>
 </file>
 
-<file path=customXml/itemProps5.xml><?xml version="1.0" encoding="utf-8"?>
-<ds:datastoreItem xmlns:ds="http://schemas.openxmlformats.org/officeDocument/2006/customXml" ds:itemID="{4B799844-21BF-4EC0-9FC3-DE0BDABC8C8B}">
+<file path=customXml/itemProps6.xml><?xml version="1.0" encoding="utf-8"?>
+<ds:datastoreItem xmlns:ds="http://schemas.openxmlformats.org/officeDocument/2006/customXml" ds:itemID="{FA63A305-3DF8-41F5-B81F-628BF4BD968A}">
   <ds:schemaRefs>
-    <ds:schemaRef ds:uri="http://schemas.openxmlformats.org/officeDocument/2006/bibliography"/>
-  </ds:schemaRefs>
-</ds:datastoreItem>
-</file>
-
-<file path=customXml/itemProps6.xml><?xml version="1.0" encoding="utf-8"?>
-<ds:datastoreItem xmlns:ds="http://schemas.openxmlformats.org/officeDocument/2006/customXml" ds:itemID="{0CF1B02A-AE70-46BE-AFF9-C0ED85F2E0E0}">
-  <ds:schemaRefs>
-    <ds:schemaRef ds:uri="http://schemas.microsoft.com/sharepoint/v3/contenttype/forms"/>
+    <ds:schemaRef ds:uri="Microsoft.SharePoint.Taxonomy.ContentTypeSync"/>
   </ds:schemaRefs>
 </ds:datastoreItem>
 </file>
</xml_diff>